<commit_message>
Update Survey Paper to correct formatting and enhance clarity on DevSecOps implementation
</commit_message>
<xml_diff>
--- a/Documentation/Survey Paper/Survey-paper1.docx
+++ b/Documentation/Survey Paper/Survey-paper1.docx
@@ -581,6 +581,13 @@
         <w:t>Abstract</w:t>
       </w:r>
       <w:r>
+        <w:rPr>
+          <w:i/>
+          <w:iCs/>
+        </w:rPr>
+        <w:t xml:space="preserve"> </w:t>
+      </w:r>
+      <w:r>
         <w:t>—</w:t>
       </w:r>
       <w:r>
@@ -676,7 +683,29 @@
           <w:szCs w:val="18"/>
           <w:lang w:val="en-IN" w:eastAsia="en-IN"/>
         </w:rPr>
-        <w:t>Keywords—</w:t>
+        <w:t>Keywords</w:t>
+      </w:r>
+      <w:r>
+        <w:rPr>
+          <w:rFonts w:eastAsia="Times New Roman"/>
+          <w:b/>
+          <w:bCs/>
+          <w:sz w:val="18"/>
+          <w:szCs w:val="18"/>
+          <w:lang w:val="en-IN" w:eastAsia="en-IN"/>
+        </w:rPr>
+        <w:t xml:space="preserve"> </w:t>
+      </w:r>
+      <w:r>
+        <w:rPr>
+          <w:rFonts w:eastAsia="Times New Roman"/>
+          <w:b/>
+          <w:bCs/>
+          <w:sz w:val="18"/>
+          <w:szCs w:val="18"/>
+          <w:lang w:val="en-IN" w:eastAsia="en-IN"/>
+        </w:rPr>
+        <w:t>—</w:t>
       </w:r>
       <w:r>
         <w:rPr>

</xml_diff>

<commit_message>
Revise Survey Paper to enhance clarity and update title for improved focus on DevSecOps integration
</commit_message>
<xml_diff>
--- a/Documentation/Survey Paper/Survey-paper1.docx
+++ b/Documentation/Survey Paper/Survey-paper1.docx
@@ -220,19 +220,7 @@
         <w:rPr>
           <w:kern w:val="48"/>
         </w:rPr>
-        <w:t>Implementation of a Secure DevOps CI/CD Pipeline Using DevSecOps Too</w:t>
-      </w:r>
-      <w:r>
-        <w:rPr>
-          <w:kern w:val="48"/>
-        </w:rPr>
-        <w:t>l</w:t>
-      </w:r>
-      <w:r>
-        <w:rPr>
-          <w:kern w:val="48"/>
-        </w:rPr>
-        <w:t>s</w:t>
+        <w:t>Enhancing CI/CD Pipeline Security Through DevSecOps Integration</w:t>
       </w:r>
     </w:p>
     <w:p>
@@ -602,25 +590,7 @@
         <w:t xml:space="preserve"> </w:t>
       </w:r>
       <w:r>
-        <w:t xml:space="preserve">DevOps is followed in many projects mainly to make the work faster by keeping development and operations more </w:t>
-      </w:r>
-      <w:proofErr w:type="spellStart"/>
-      <w:proofErr w:type="gramStart"/>
-      <w:r>
-        <w:t>connected.With</w:t>
-      </w:r>
-      <w:proofErr w:type="spellEnd"/>
-      <w:proofErr w:type="gramEnd"/>
-      <w:r>
-        <w:t xml:space="preserve"> increasing security needs, </w:t>
-      </w:r>
-      <w:proofErr w:type="spellStart"/>
-      <w:r>
-        <w:t>DevSecOps</w:t>
-      </w:r>
-      <w:proofErr w:type="spellEnd"/>
-      <w:r>
-        <w:t xml:space="preserve"> has come into use, where security is considered from the early stages instead of adding it later.</w:t>
+        <w:t>DevOps is used in many projects to make development faster by bringing development and operations work closer. As the need for secure applications has increased, DevSecOps is also being followed, where security is considered from the early stages instead of adding it later.</w:t>
       </w:r>
     </w:p>
     <w:p>
@@ -628,7 +598,7 @@
         <w:pStyle w:val="Abstract"/>
       </w:pPr>
       <w:r>
-        <w:t>In practice, some challenges still exist, such as difficulty in automating security checks, poor coordination between tools, limited security knowledge among developers, and incorrect alerts from scanning tools.</w:t>
+        <w:t>In real use, some problems are still seen. It is not always easy to automate security checks, tools may not work together properly, and sometimes developers do not have enough security knowledge. Also, scanning tools may give incorrect alerts in some cases.</w:t>
       </w:r>
     </w:p>
     <w:p>
@@ -636,31 +606,21 @@
         <w:pStyle w:val="Abstract"/>
       </w:pPr>
       <w:r>
-        <w:t xml:space="preserve">In this work, a framework is presented to improve security checking in the </w:t>
-      </w:r>
-      <w:proofErr w:type="spellStart"/>
-      <w:r>
-        <w:t>DevSecOps</w:t>
-      </w:r>
-      <w:proofErr w:type="spellEnd"/>
-      <w:r>
-        <w:t xml:space="preserve"> pipeline. In our setup, tools like Git, Jenkins, Docker, Kubernetes and SonarQube are used. For security checking, OWASP ZAP and </w:t>
-      </w:r>
-      <w:proofErr w:type="spellStart"/>
-      <w:r>
-        <w:t>Trivy</w:t>
-      </w:r>
-      <w:proofErr w:type="spellEnd"/>
-      <w:r>
-        <w:t xml:space="preserve"> are included, and for monitoring we used Prometheus with Grafana.</w:t>
+        <w:t>In this work, a framework is proposed to improve security checking in a DevSecOps pipeline. In our setup, tools such as Git, Jenkins, Docker, Kubernetes, and SonarQube are used. For security-related checks, OWASP ZAP and Trivy are included, and for monitoring, Prometheus with Grafana is used.</w:t>
       </w:r>
     </w:p>
     <w:p>
       <w:pPr>
         <w:pStyle w:val="Abstract"/>
-      </w:pPr>
-      <w:r>
-        <w:t>The framework is kept in between CI and CD. Because of this, checking happens while the code is still moving in the pipeline. If something goes wrong, it can be noticed earlier itself, so later fixing work will be less. A simple design and one case example are also shown.</w:t>
+        <w:rPr>
+          <w:lang w:val="en-IN"/>
+        </w:rPr>
+      </w:pPr>
+      <w:r>
+        <w:rPr>
+          <w:lang w:val="en-IN"/>
+        </w:rPr>
+        <w:t>The framework is placed between the CI and CD stages so that checking happens while the code is still moving through the pipeline. If any issue comes up, it can be noticed earlier, which reduces the work needed later. A simple design and a case example are also included.</w:t>
       </w:r>
     </w:p>
     <w:p>
@@ -723,27 +683,7 @@
           <w:szCs w:val="18"/>
           <w:lang w:eastAsia="en-IN"/>
         </w:rPr>
-        <w:t xml:space="preserve">DevOps, </w:t>
-      </w:r>
-      <w:proofErr w:type="spellStart"/>
-      <w:r>
-        <w:rPr>
-          <w:rFonts w:eastAsia="Times New Roman"/>
-          <w:sz w:val="18"/>
-          <w:szCs w:val="18"/>
-          <w:lang w:eastAsia="en-IN"/>
-        </w:rPr>
-        <w:t>DevSecOps</w:t>
-      </w:r>
-      <w:proofErr w:type="spellEnd"/>
-      <w:r>
-        <w:rPr>
-          <w:rFonts w:eastAsia="Times New Roman"/>
-          <w:sz w:val="18"/>
-          <w:szCs w:val="18"/>
-          <w:lang w:eastAsia="en-IN"/>
-        </w:rPr>
-        <w:t>, CI/CD pipeline, security testing, vulnerability scanning, containerization, monitoring tools, automated security, software security</w:t>
+        <w:t>DevOps, DevSecOps, CI/CD pipeline, security testing, vulnerability scanning, containerization, monitoring tools, automated security, software security</w:t>
       </w:r>
     </w:p>
     <w:p>
@@ -773,109 +713,69 @@
         <w:rPr>
           <w:lang w:val="en-US"/>
         </w:rPr>
-        <w:t xml:space="preserve">As many organizations move towards DevOps and agile practices, CI/CD pipelines have become a regular part of software </w:t>
-      </w:r>
-      <w:proofErr w:type="spellStart"/>
-      <w:proofErr w:type="gramStart"/>
-      <w:r>
+        <w:t>As many organizations move towards DevOps and agile practices, CI/CD pipelines have become a regular part of software development. In our setup, a container-based workflow is used to keep the application behaviour same across different environments.</w:t>
+      </w:r>
+    </w:p>
+    <w:p>
+      <w:pPr>
+        <w:pStyle w:val="BodyText"/>
         <w:rPr>
           <w:lang w:val="en-US"/>
         </w:rPr>
-        <w:t>development.In</w:t>
-      </w:r>
-      <w:proofErr w:type="spellEnd"/>
-      <w:proofErr w:type="gramEnd"/>
+      </w:pPr>
       <w:r>
         <w:rPr>
           <w:lang w:val="en-US"/>
         </w:rPr>
-        <w:t xml:space="preserve"> our setup, a container-based workflow is used to keep the application </w:t>
-      </w:r>
-      <w:proofErr w:type="spellStart"/>
-      <w:r>
+        <w:t>It also helps in making deployment a bit easier to manage. At the same time, security is becoming more important, so DevSecOps is followed where security is taken care of from the beginning stages itself instead of adding it later.</w:t>
+      </w:r>
+    </w:p>
+    <w:p>
+      <w:pPr>
+        <w:pStyle w:val="BodyText"/>
         <w:rPr>
           <w:lang w:val="en-US"/>
         </w:rPr>
-        <w:t>behaviour</w:t>
-      </w:r>
-      <w:proofErr w:type="spellEnd"/>
+      </w:pPr>
       <w:r>
         <w:rPr>
           <w:lang w:val="en-US"/>
         </w:rPr>
-        <w:t xml:space="preserve"> same across different environments. It also helps in making deployment a bit easier to </w:t>
-      </w:r>
-      <w:proofErr w:type="spellStart"/>
-      <w:proofErr w:type="gramStart"/>
+        <w:t>Security checking plays a key role in this process, especially to detect issues before deployment. Earlier, these checks required more manual effort and often caused delays</w:t>
+      </w:r>
       <w:r>
         <w:rPr>
           <w:lang w:val="en-US"/>
         </w:rPr>
-        <w:t>manage.At</w:t>
-      </w:r>
-      <w:proofErr w:type="spellEnd"/>
-      <w:proofErr w:type="gramEnd"/>
-      <w:r>
+        <w:t>.</w:t>
+      </w:r>
+    </w:p>
+    <w:p>
+      <w:pPr>
+        <w:pStyle w:val="BodyText"/>
         <w:rPr>
           <w:lang w:val="en-US"/>
         </w:rPr>
-        <w:t xml:space="preserve"> the same time, security is becoming more important, so </w:t>
-      </w:r>
-      <w:proofErr w:type="spellStart"/>
+      </w:pPr>
       <w:r>
         <w:rPr>
           <w:lang w:val="en-US"/>
         </w:rPr>
-        <w:t>DevSecOps</w:t>
-      </w:r>
-      <w:proofErr w:type="spellEnd"/>
-      <w:r>
-        <w:rPr>
-          <w:lang w:val="en-US"/>
-        </w:rPr>
-        <w:t xml:space="preserve"> is followed where security is taken care of from the beginning stages itself instead of adding it later.</w:t>
+        <w:t>Here, the approach is to make security-related checks automatic so that issues can be identified faster during development, without waiting until the end.</w:t>
       </w:r>
     </w:p>
     <w:p>
       <w:pPr>
         <w:pStyle w:val="BodyText"/>
         <w:rPr>
-          <w:lang w:val="en-US"/>
-        </w:rPr>
-      </w:pPr>
-      <w:r>
-        <w:rPr>
-          <w:lang w:val="en-US"/>
-        </w:rPr>
-        <w:t>Security checking is an important part of this process, especially to detect issues before deployment. Earlier, these checks required more manual effort and often caused delays. Here, the idea is to automate security-related checks so that issues can be found faster during development, without waiting until the end.</w:t>
-      </w:r>
-    </w:p>
-    <w:p>
-      <w:pPr>
-        <w:pStyle w:val="BodyText"/>
-        <w:rPr>
-          <w:lang w:val="en-US"/>
-        </w:rPr>
-      </w:pPr>
-      <w:r>
-        <w:rPr>
-          <w:lang w:val="en-US"/>
-        </w:rPr>
-        <w:t xml:space="preserve">For this, both code-level and runtime checking are used. For checking the code, SonarQube is used. At the same time, OWASP ZAP and </w:t>
-      </w:r>
-      <w:proofErr w:type="spellStart"/>
-      <w:r>
-        <w:rPr>
-          <w:lang w:val="en-US"/>
-        </w:rPr>
-        <w:t>Trivy</w:t>
-      </w:r>
-      <w:proofErr w:type="spellEnd"/>
-      <w:r>
-        <w:rPr>
-          <w:lang w:val="en-US"/>
-        </w:rPr>
-        <w:t xml:space="preserve"> are used to look for issues when the application is running or inside the container. Jenkins is used to handle the pipeline, and Docker along with Kubernetes is used for managing the containers.</w:t>
+          <w:lang w:val="en-IN"/>
+        </w:rPr>
+      </w:pPr>
+      <w:r>
+        <w:rPr>
+          <w:lang w:val="en-IN"/>
+        </w:rPr>
+        <w:t>For this, both code-level and runtime checking are used. For checking the code, SonarQube is used. At the same time, OWASP ZAP and Trivy are used to look for issues when the application is running or inside the container.</w:t>
       </w:r>
     </w:p>
     <w:p>
@@ -950,18 +850,8 @@
           <w:szCs w:val="16"/>
           <w:lang w:val="en-US"/>
         </w:rPr>
-        <w:t xml:space="preserve">Fig. 1. </w:t>
-      </w:r>
-      <w:proofErr w:type="spellStart"/>
-      <w:r>
-        <w:rPr>
-          <w:sz w:val="16"/>
-          <w:szCs w:val="16"/>
-          <w:lang w:val="en-US"/>
-        </w:rPr>
-        <w:t>DevSecOps</w:t>
-      </w:r>
-      <w:proofErr w:type="spellEnd"/>
+        <w:t>Fig. 1. DevSecOps</w:t>
+      </w:r>
     </w:p>
     <w:p>
       <w:pPr>
@@ -1019,35 +909,37 @@
         <w:rPr>
           <w:rFonts w:eastAsia="Times New Roman"/>
         </w:rPr>
-        <w:t xml:space="preserve">Early work in </w:t>
-      </w:r>
-      <w:proofErr w:type="spellStart"/>
-      <w:r>
-        <w:rPr>
-          <w:rFonts w:eastAsia="Times New Roman"/>
-        </w:rPr>
-        <w:t>DevSecOps</w:t>
-      </w:r>
-      <w:proofErr w:type="spellEnd"/>
-      <w:r>
-        <w:rPr>
-          <w:rFonts w:eastAsia="Times New Roman"/>
-        </w:rPr>
-        <w:t xml:space="preserve"> mainly tried to understand why security was often missed in DevOps pipelines. For example, Nikolov and Aleksieva-Petrova (2023) worked on a Jenkins-based pipeline where tools like </w:t>
-      </w:r>
-      <w:proofErr w:type="spellStart"/>
-      <w:r>
-        <w:rPr>
-          <w:rFonts w:eastAsia="Times New Roman"/>
-        </w:rPr>
-        <w:t>Snyk</w:t>
-      </w:r>
-      <w:proofErr w:type="spellEnd"/>
-      <w:r>
-        <w:rPr>
-          <w:rFonts w:eastAsia="Times New Roman"/>
-        </w:rPr>
-        <w:t xml:space="preserve"> and OWASP ZAP were used for security checking. In their case, the system was able to find vulnerabilities before deployment, but they did not include container-level security or any monitoring part.</w:t>
+        <w:t xml:space="preserve">Early work in DevSecOps mainly tried to understand why security was often missed in DevOps pipelines. For example, Nikolov and Aleksieva-Petrova (2023) worked on a Jenkins-based pipeline where tools like Snyk and </w:t>
+      </w:r>
+      <w:r>
+        <w:rPr>
+          <w:rFonts w:eastAsia="Times New Roman"/>
+        </w:rPr>
+        <w:t>OWASP ZAP was applied to</w:t>
+      </w:r>
+      <w:r>
+        <w:rPr>
+          <w:rFonts w:eastAsia="Times New Roman"/>
+        </w:rPr>
+        <w:t xml:space="preserve"> security checking. In their case, the system was able to find vulnerabilities before deployment, </w:t>
+      </w:r>
+      <w:r>
+        <w:rPr>
+          <w:rFonts w:eastAsia="Times New Roman"/>
+        </w:rPr>
+        <w:t>however, they did not cover</w:t>
+      </w:r>
+      <w:r>
+        <w:rPr>
+          <w:rFonts w:eastAsia="Times New Roman"/>
+        </w:rPr>
+        <w:t xml:space="preserve"> </w:t>
+      </w:r>
+      <w:r>
+        <w:rPr>
+          <w:rFonts w:eastAsia="Times New Roman"/>
+        </w:rPr>
+        <w:t>container-level security or any monitoring part.</w:t>
       </w:r>
       <w:r>
         <w:rPr>
@@ -1074,35 +966,7 @@
         <w:rPr>
           <w:rFonts w:eastAsia="Times New Roman"/>
         </w:rPr>
-        <w:t xml:space="preserve">In another work, Marandi et al. In one work from 2023, </w:t>
-      </w:r>
-      <w:proofErr w:type="spellStart"/>
-      <w:r>
-        <w:rPr>
-          <w:rFonts w:eastAsia="Times New Roman"/>
-        </w:rPr>
-        <w:t>Snyk</w:t>
-      </w:r>
-      <w:proofErr w:type="spellEnd"/>
-      <w:r>
-        <w:rPr>
-          <w:rFonts w:eastAsia="Times New Roman"/>
-        </w:rPr>
-        <w:t xml:space="preserve"> was used along with </w:t>
-      </w:r>
-      <w:proofErr w:type="spellStart"/>
-      <w:r>
-        <w:rPr>
-          <w:rFonts w:eastAsia="Times New Roman"/>
-        </w:rPr>
-        <w:t>StackHawk</w:t>
-      </w:r>
-      <w:proofErr w:type="spellEnd"/>
-      <w:r>
-        <w:rPr>
-          <w:rFonts w:eastAsia="Times New Roman"/>
-        </w:rPr>
-        <w:t xml:space="preserve"> in a GitHub Actions pipeline with Docker. They also added dashboards and some level of automation for fixing issues, so manual work was </w:t>
+        <w:t xml:space="preserve">In another work, Marandi et al. In one work from 2023, Snyk was used along with StackHawk in a GitHub Actions pipeline with Docker. They also added dashboards and some level of automation for fixing issues, so manual work was </w:t>
       </w:r>
       <w:r>
         <w:rPr>
@@ -1130,21 +994,31 @@
         <w:rPr>
           <w:rFonts w:eastAsia="Times New Roman"/>
         </w:rPr>
-        <w:t xml:space="preserve">Later, more attention was given to the problems faced while actually applying </w:t>
-      </w:r>
-      <w:proofErr w:type="spellStart"/>
-      <w:r>
-        <w:rPr>
-          <w:rFonts w:eastAsia="Times New Roman"/>
-        </w:rPr>
-        <w:t>DevSecOps.Nayanajith</w:t>
-      </w:r>
-      <w:proofErr w:type="spellEnd"/>
-      <w:r>
-        <w:rPr>
-          <w:rFonts w:eastAsia="Times New Roman"/>
-        </w:rPr>
-        <w:t xml:space="preserve"> and Wickramarachchi (2024) mentioned that issues like lack of skills, resistance from teams, and communication gaps were quite common. These were not mainly technical problems, but more about how teams coordinate and work together in practice.</w:t>
+        <w:t>After that, more focus shifted towards</w:t>
+      </w:r>
+      <w:r>
+        <w:rPr>
+          <w:rFonts w:eastAsia="Times New Roman"/>
+        </w:rPr>
+        <w:t xml:space="preserve"> </w:t>
+      </w:r>
+      <w:r>
+        <w:rPr>
+          <w:rFonts w:eastAsia="Times New Roman"/>
+        </w:rPr>
+        <w:t>the problems faced while actually applying DevSecOps.</w:t>
+      </w:r>
+      <w:r>
+        <w:rPr>
+          <w:rFonts w:eastAsia="Times New Roman"/>
+        </w:rPr>
+        <w:t xml:space="preserve"> </w:t>
+      </w:r>
+      <w:r>
+        <w:rPr>
+          <w:rFonts w:eastAsia="Times New Roman"/>
+        </w:rPr>
+        <w:t>Nayanajith and Wickramarachchi (2024) mentioned that issues like lack of skills, resistance from teams, and communication gaps were quite common. These were not mainly technical problems, but more about how teams coordinate and work together in practice.</w:t>
       </w:r>
     </w:p>
     <w:p>
@@ -1165,7 +1039,43 @@
         <w:rPr>
           <w:rFonts w:eastAsia="Times New Roman"/>
         </w:rPr>
-        <w:t>Bautista Ramos and Yoo (2025) looked at many research papers and discussed different kinds of vulnerabilities along with possible ways to handle them. They also mentioned that a lot of these studies were not tested in real environments, so it is not very clear how they would work in actual use.</w:t>
+        <w:t xml:space="preserve">Bautista Ramos and Yoo (2025) looked at many research papers and discussed different kinds of vulnerabilities along with possible ways to handle them. They also mentioned that a lot of </w:t>
+      </w:r>
+      <w:r>
+        <w:rPr>
+          <w:rFonts w:eastAsia="Times New Roman"/>
+        </w:rPr>
+        <w:t>these works were not evaluated</w:t>
+      </w:r>
+      <w:r>
+        <w:rPr>
+          <w:rFonts w:eastAsia="Times New Roman"/>
+        </w:rPr>
+        <w:t xml:space="preserve"> </w:t>
+      </w:r>
+      <w:r>
+        <w:rPr>
+          <w:rFonts w:eastAsia="Times New Roman"/>
+        </w:rPr>
+        <w:t xml:space="preserve">in real environments, so it is </w:t>
+      </w:r>
+      <w:r>
+        <w:rPr>
+          <w:rFonts w:eastAsia="Times New Roman"/>
+        </w:rPr>
+        <w:t>it is not clear how they</w:t>
+      </w:r>
+      <w:r>
+        <w:rPr>
+          <w:rFonts w:eastAsia="Times New Roman"/>
+        </w:rPr>
+        <w:t xml:space="preserve"> </w:t>
+      </w:r>
+      <w:r>
+        <w:rPr>
+          <w:rFonts w:eastAsia="Times New Roman"/>
+        </w:rPr>
+        <w:t>would work in actual use.</w:t>
       </w:r>
     </w:p>
     <w:p>
@@ -1186,35 +1096,19 @@
         <w:rPr>
           <w:rFonts w:eastAsia="Times New Roman"/>
         </w:rPr>
-        <w:t xml:space="preserve">Some recent work has focused more on practical pipeline setups. In one such case, tools like Jenkins, Docker, and Kubernetes were used together with Prometheus and Grafana to improve both system performance and monitoring in CI/CD </w:t>
-      </w:r>
-      <w:proofErr w:type="gramStart"/>
-      <w:r>
-        <w:rPr>
-          <w:rFonts w:eastAsia="Times New Roman"/>
-        </w:rPr>
-        <w:t>pipelines .</w:t>
-      </w:r>
-      <w:proofErr w:type="gramEnd"/>
-      <w:r>
-        <w:rPr>
-          <w:rFonts w:eastAsia="Times New Roman"/>
-        </w:rPr>
-        <w:t xml:space="preserve"> It was also noted that </w:t>
-      </w:r>
-      <w:proofErr w:type="spellStart"/>
-      <w:r>
-        <w:rPr>
-          <w:rFonts w:eastAsia="Times New Roman"/>
-        </w:rPr>
-        <w:t>Trivy</w:t>
-      </w:r>
-      <w:proofErr w:type="spellEnd"/>
-      <w:r>
-        <w:rPr>
-          <w:rFonts w:eastAsia="Times New Roman"/>
-        </w:rPr>
-        <w:t xml:space="preserve"> can be used to check container-related issues.</w:t>
+        <w:t>Recent work has also looked into</w:t>
+      </w:r>
+      <w:r>
+        <w:rPr>
+          <w:rFonts w:eastAsia="Times New Roman"/>
+        </w:rPr>
+        <w:t xml:space="preserve"> </w:t>
+      </w:r>
+      <w:r>
+        <w:rPr>
+          <w:rFonts w:eastAsia="Times New Roman"/>
+        </w:rPr>
+        <w:t>more on practical pipeline setups. In one such case, tools like Jenkins, Docker, and Kubernetes were used together with Prometheus and Grafana to improve both system performance and monitoring in CI/CD pipelines . It was also noted that Trivy can be used to check container-related issues.</w:t>
       </w:r>
     </w:p>
     <w:p>
@@ -1235,86 +1129,68 @@
         <w:rPr>
           <w:rFonts w:eastAsia="Times New Roman"/>
         </w:rPr>
-        <w:t xml:space="preserve">There is also work based on the CAMS model in </w:t>
-      </w:r>
-      <w:proofErr w:type="spellStart"/>
-      <w:r>
-        <w:rPr>
-          <w:rFonts w:eastAsia="Times New Roman"/>
-        </w:rPr>
-        <w:t>DevSecOps</w:t>
-      </w:r>
-      <w:proofErr w:type="spellEnd"/>
-      <w:r>
-        <w:rPr>
-          <w:rFonts w:eastAsia="Times New Roman"/>
-        </w:rPr>
-        <w:t xml:space="preserve">, which includes culture, automation, measurement, and sharing. These factors are considered important when applying </w:t>
-      </w:r>
-      <w:proofErr w:type="spellStart"/>
-      <w:r>
-        <w:rPr>
-          <w:rFonts w:eastAsia="Times New Roman"/>
-        </w:rPr>
-        <w:t>DevSecOps</w:t>
-      </w:r>
-      <w:proofErr w:type="spellEnd"/>
-      <w:r>
-        <w:rPr>
-          <w:rFonts w:eastAsia="Times New Roman"/>
-        </w:rPr>
-        <w:t xml:space="preserve"> in real situations These aspects are considered important when trying to apply </w:t>
-      </w:r>
-      <w:proofErr w:type="spellStart"/>
-      <w:r>
-        <w:rPr>
-          <w:rFonts w:eastAsia="Times New Roman"/>
-        </w:rPr>
-        <w:t>DevSecOps</w:t>
-      </w:r>
-      <w:proofErr w:type="spellEnd"/>
-      <w:r>
-        <w:rPr>
-          <w:rFonts w:eastAsia="Times New Roman"/>
-        </w:rPr>
-        <w:t xml:space="preserve"> in practical situations. These factors are important when applying </w:t>
-      </w:r>
-      <w:proofErr w:type="spellStart"/>
-      <w:r>
-        <w:rPr>
-          <w:rFonts w:eastAsia="Times New Roman"/>
-        </w:rPr>
-        <w:t>DevSecOps</w:t>
-      </w:r>
-      <w:proofErr w:type="spellEnd"/>
-      <w:r>
-        <w:rPr>
-          <w:rFonts w:eastAsia="Times New Roman"/>
-        </w:rPr>
-        <w:t xml:space="preserve"> in real environments. It showed that these factors play a key role in successfully applying </w:t>
-      </w:r>
-      <w:proofErr w:type="spellStart"/>
-      <w:r>
-        <w:rPr>
-          <w:rFonts w:eastAsia="Times New Roman"/>
-        </w:rPr>
-        <w:t>DevSecOps</w:t>
-      </w:r>
-      <w:proofErr w:type="spellEnd"/>
-      <w:r>
-        <w:rPr>
-          <w:rFonts w:eastAsia="Times New Roman"/>
-        </w:rPr>
-        <w:t xml:space="preserve"> in real </w:t>
-      </w:r>
-      <w:proofErr w:type="gramStart"/>
-      <w:r>
-        <w:rPr>
-          <w:rFonts w:eastAsia="Times New Roman"/>
-        </w:rPr>
-        <w:t>environments .</w:t>
-      </w:r>
-      <w:proofErr w:type="gramEnd"/>
+        <w:t>In DevSecOps, some studies follow the CAMS model. This mainly covers culture, automation, measurement, and sharing.</w:t>
+      </w:r>
+      <w:r>
+        <w:rPr>
+          <w:rFonts w:eastAsia="Times New Roman"/>
+        </w:rPr>
+        <w:t xml:space="preserve"> </w:t>
+      </w:r>
+      <w:r>
+        <w:rPr>
+          <w:rFonts w:eastAsia="Times New Roman"/>
+        </w:rPr>
+        <w:t>These factors are seen as important</w:t>
+      </w:r>
+      <w:r>
+        <w:rPr>
+          <w:rFonts w:eastAsia="Times New Roman"/>
+        </w:rPr>
+        <w:t xml:space="preserve"> when applying DevSecOps in real situations </w:t>
+      </w:r>
+      <w:r>
+        <w:rPr>
+          <w:rFonts w:eastAsia="Times New Roman"/>
+        </w:rPr>
+        <w:t>These aspects are seen as useful</w:t>
+      </w:r>
+      <w:r>
+        <w:rPr>
+          <w:rFonts w:eastAsia="Times New Roman"/>
+        </w:rPr>
+        <w:t xml:space="preserve"> when trying to apply DevSecOps in practical situations. </w:t>
+      </w:r>
+      <w:r>
+        <w:rPr>
+          <w:rFonts w:eastAsia="Times New Roman"/>
+        </w:rPr>
+        <w:t>These factors become important when</w:t>
+      </w:r>
+      <w:r>
+        <w:rPr>
+          <w:rFonts w:eastAsia="Times New Roman"/>
+        </w:rPr>
+        <w:t xml:space="preserve"> </w:t>
+      </w:r>
+      <w:r>
+        <w:rPr>
+          <w:rFonts w:eastAsia="Times New Roman"/>
+        </w:rPr>
+        <w:t xml:space="preserve">applying DevSecOps in real environments. It </w:t>
+      </w:r>
+      <w:r>
+        <w:rPr>
+          <w:rFonts w:eastAsia="Times New Roman"/>
+        </w:rPr>
+        <w:t>showed that these factors have a strong effect on</w:t>
+      </w:r>
+      <w:r>
+        <w:rPr>
+          <w:rFonts w:eastAsia="Times New Roman"/>
+        </w:rPr>
+        <w:t xml:space="preserve"> successfully applying DevSecOps in real environments .</w:t>
+      </w:r>
     </w:p>
     <w:p>
       <w:pPr>
@@ -1334,21 +1210,25 @@
         <w:rPr>
           <w:rFonts w:eastAsia="Times New Roman"/>
         </w:rPr>
-        <w:t xml:space="preserve">In addition, recent research has explored improving the monitoring phase using machine learning. A hybrid intrusion detection system was proposed to enhance security during continuous monitoring, achieving high accuracy in detecting </w:t>
-      </w:r>
-      <w:proofErr w:type="gramStart"/>
-      <w:r>
-        <w:rPr>
-          <w:rFonts w:eastAsia="Times New Roman"/>
-        </w:rPr>
-        <w:t>threats .</w:t>
-      </w:r>
-      <w:proofErr w:type="gramEnd"/>
-      <w:r>
-        <w:rPr>
-          <w:rFonts w:eastAsia="Times New Roman"/>
-        </w:rPr>
-        <w:t xml:space="preserve"> However, such approaches are still limited to specific datasets and need more real-world validation.</w:t>
+        <w:t>Along with this, some recent studies have looked at</w:t>
+      </w:r>
+      <w:r>
+        <w:rPr>
+          <w:rFonts w:eastAsia="Times New Roman"/>
+        </w:rPr>
+        <w:t xml:space="preserve"> </w:t>
+      </w:r>
+      <w:r>
+        <w:rPr>
+          <w:rFonts w:eastAsia="Times New Roman"/>
+        </w:rPr>
+        <w:t xml:space="preserve">improving the monitoring phase using machine learning. </w:t>
+      </w:r>
+      <w:r>
+        <w:rPr>
+          <w:rFonts w:eastAsia="Times New Roman"/>
+        </w:rPr>
+        <w:t>A hybrid intrusion detection system is applied during continuous monitoring, which helps in detecting threats with good accuracy. Even so, these methods are still limited to specific datasets and need more real-world validation.</w:t>
       </w:r>
     </w:p>
     <w:p>
@@ -1369,21 +1249,7 @@
         <w:rPr>
           <w:rFonts w:eastAsia="Times New Roman"/>
         </w:rPr>
-        <w:t xml:space="preserve">From these studies, it can be understood that </w:t>
-      </w:r>
-      <w:proofErr w:type="spellStart"/>
-      <w:r>
-        <w:rPr>
-          <w:rFonts w:eastAsia="Times New Roman"/>
-        </w:rPr>
-        <w:t>DevSecOps</w:t>
-      </w:r>
-      <w:proofErr w:type="spellEnd"/>
-      <w:r>
-        <w:rPr>
-          <w:rFonts w:eastAsia="Times New Roman"/>
-        </w:rPr>
-        <w:t xml:space="preserve"> is improving, but some gaps still remain. From these studies, it can be seen that many works focus only on specific parts such as scanning or monitoring, but do not cover the complete pipeline.</w:t>
+        <w:t>From these studies, it is observed that DevSecOps is improving, but some gaps still remain. From these studies, it appears that many works focus only on specific parts such as scanning or monitoring, but do not cover the complete pipeline.</w:t>
       </w:r>
     </w:p>
     <w:p>
@@ -1404,51 +1270,13 @@
         <w:rPr>
           <w:rFonts w:eastAsia="Times New Roman"/>
         </w:rPr>
-        <w:t xml:space="preserve">In this work, a complete </w:t>
-      </w:r>
-      <w:proofErr w:type="spellStart"/>
-      <w:r>
-        <w:rPr>
-          <w:rFonts w:eastAsia="Times New Roman"/>
-        </w:rPr>
-        <w:t>DevSecOps</w:t>
-      </w:r>
-      <w:proofErr w:type="spellEnd"/>
-      <w:r>
-        <w:rPr>
-          <w:rFonts w:eastAsia="Times New Roman"/>
-        </w:rPr>
-        <w:t xml:space="preserve"> pipeline is implemented where security is included at every </w:t>
-      </w:r>
-      <w:proofErr w:type="spellStart"/>
-      <w:proofErr w:type="gramStart"/>
-      <w:r>
-        <w:rPr>
-          <w:rFonts w:eastAsia="Times New Roman"/>
-        </w:rPr>
-        <w:t>stage.From</w:t>
-      </w:r>
-      <w:proofErr w:type="spellEnd"/>
-      <w:proofErr w:type="gramEnd"/>
-      <w:r>
-        <w:rPr>
-          <w:rFonts w:eastAsia="Times New Roman"/>
-        </w:rPr>
-        <w:t xml:space="preserve"> these works, it can be understood that most studies focus only on some parts of the pipeline. In this work, the idea is to combine different stages together. It includes static and dynamic testing, container scanning using </w:t>
-      </w:r>
-      <w:proofErr w:type="spellStart"/>
-      <w:r>
-        <w:rPr>
-          <w:rFonts w:eastAsia="Times New Roman"/>
-        </w:rPr>
-        <w:t>Trivy</w:t>
-      </w:r>
-      <w:proofErr w:type="spellEnd"/>
-      <w:r>
-        <w:rPr>
-          <w:rFonts w:eastAsia="Times New Roman"/>
-        </w:rPr>
-        <w:t>, and monitoring using Prometheus and Grafana so that the system can be checked continuously.</w:t>
+        <w:t>In this work, a complete DevSecOps pipeline is implemented where security is included at every stage. From these works, it is understood that most studies focus only on some parts of the pipeline. In this work, the idea is to combine different stages together. It includes static and dynamic testing, container scanning using Trivy, and monitoring using Prometheus and Grafana so that the system can be checked continuously</w:t>
+      </w:r>
+      <w:r>
+        <w:rPr>
+          <w:rFonts w:eastAsia="Times New Roman"/>
+        </w:rPr>
+        <w:t>.</w:t>
       </w:r>
     </w:p>
     <w:p>
@@ -1469,13 +1297,27 @@
         <w:rPr>
           <w:rFonts w:eastAsia="Times New Roman"/>
         </w:rPr>
-        <w:t>Because of this, there is a need to combine different stages of the pipeline into a single system.</w:t>
-      </w:r>
-      <w:r>
-        <w:rPr>
-          <w:rFonts w:eastAsia="Times New Roman"/>
-        </w:rPr>
-        <w:br/>
+        <w:t>Because of this, it becomes necessary to combine different stages of the pipeline into a single system</w:t>
+      </w:r>
+      <w:r>
+        <w:rPr>
+          <w:rFonts w:eastAsia="Times New Roman"/>
+        </w:rPr>
+        <w:t>.</w:t>
+      </w:r>
+    </w:p>
+    <w:p>
+      <w:pPr>
+        <w:spacing w:before="5pt" w:beforeAutospacing="1" w:after="5pt" w:afterAutospacing="1"/>
+        <w:jc w:val="both"/>
+        <w:rPr>
+          <w:rFonts w:eastAsia="Times New Roman"/>
+        </w:rPr>
+      </w:pPr>
+      <w:r>
+        <w:rPr>
+          <w:rFonts w:eastAsia="Times New Roman"/>
+        </w:rPr>
         <w:t>In this work, an attempt is made to bring these parts together so that security can be checked continuously at each stage.</w:t>
       </w:r>
     </w:p>
@@ -1507,37 +1349,19 @@
         <w:rPr>
           <w:rFonts w:eastAsia="Times New Roman"/>
         </w:rPr>
-        <w:t xml:space="preserve">In many cases, organizations face problems when trying to use </w:t>
-      </w:r>
-      <w:proofErr w:type="spellStart"/>
-      <w:r>
-        <w:rPr>
-          <w:rFonts w:eastAsia="Times New Roman"/>
-        </w:rPr>
-        <w:t>DevSecOps</w:t>
-      </w:r>
-      <w:proofErr w:type="spellEnd"/>
-      <w:r>
-        <w:rPr>
-          <w:rFonts w:eastAsia="Times New Roman"/>
-        </w:rPr>
-        <w:t xml:space="preserve"> in actual </w:t>
-      </w:r>
-      <w:proofErr w:type="spellStart"/>
-      <w:proofErr w:type="gramStart"/>
-      <w:r>
-        <w:rPr>
-          <w:rFonts w:eastAsia="Times New Roman"/>
-        </w:rPr>
-        <w:t>projects.One</w:t>
-      </w:r>
-      <w:proofErr w:type="spellEnd"/>
-      <w:proofErr w:type="gramEnd"/>
-      <w:r>
-        <w:rPr>
-          <w:rFonts w:eastAsia="Times New Roman"/>
-        </w:rPr>
-        <w:t xml:space="preserve"> common issue is that security is usually taken care of at the final stage, which later creates extra work. At the same time, development teams try to move faster, but if security is not handled properly, it may slow things down. Because of this, managing both speed and security together becomes a bit difficult.</w:t>
+        <w:t xml:space="preserve">In many cases, organizations face problems when trying to use DevSecOps in actual projects.One common issue is that security is usually taken care of at the final stage, which later creates extra work. </w:t>
+      </w:r>
+      <w:r>
+        <w:rPr>
+          <w:rFonts w:eastAsia="Times New Roman"/>
+        </w:rPr>
+        <w:t>At the same time, development teams try to work faster, but if security is not handled properly, it can slow the process. So handling both speed and security together is not easy</w:t>
+      </w:r>
+      <w:r>
+        <w:rPr>
+          <w:rFonts w:eastAsia="Times New Roman"/>
+        </w:rPr>
+        <w:t>.</w:t>
       </w:r>
     </w:p>
     <w:p>
@@ -1558,7 +1382,13 @@
         <w:rPr>
           <w:rFonts w:eastAsia="Times New Roman"/>
         </w:rPr>
-        <w:t>Another issue is that not everyone in the team has proper understanding of security practices. Developers may give less attention to security, and security teams may not fully know the development side. This creates a gap between teams, which can affect the system.</w:t>
+        <w:t>Another issue is that all team members may not have enough understanding of security practices. Developers may not focus much on security, and security teams may not fully understand the development process. This creates a gap between teams and can affect the system</w:t>
+      </w:r>
+      <w:r>
+        <w:rPr>
+          <w:rFonts w:eastAsia="Times New Roman"/>
+        </w:rPr>
+        <w:t>.</w:t>
       </w:r>
     </w:p>
     <w:p>
@@ -1579,7 +1409,19 @@
         <w:rPr>
           <w:rFonts w:eastAsia="Times New Roman"/>
         </w:rPr>
-        <w:t>In our work, we tried to avoid these problems by adding security checks directly into the pipeline so that they run along with development steps.</w:t>
+        <w:t xml:space="preserve">In our work, we tried to avoid these problems by adding security checks directly into the pipeline so </w:t>
+      </w:r>
+      <w:r>
+        <w:rPr>
+          <w:rFonts w:eastAsia="Times New Roman"/>
+        </w:rPr>
+        <w:t xml:space="preserve"> they run together with</w:t>
+      </w:r>
+      <w:r>
+        <w:rPr>
+          <w:rFonts w:eastAsia="Times New Roman"/>
+        </w:rPr>
+        <w:t xml:space="preserve"> development steps.</w:t>
       </w:r>
     </w:p>
     <w:p>
@@ -1623,7 +1465,25 @@
         <w:rPr>
           <w:rFonts w:eastAsia="Times New Roman"/>
         </w:rPr>
-        <w:t>Instead of adding security later, checking is done from the beginning. Code is checked during development itself so that issues can be found early.</w:t>
+        <w:t xml:space="preserve">Instead of adding security later, checking is done from the beginning. Code is checked during development itself so that issues </w:t>
+      </w:r>
+      <w:r>
+        <w:rPr>
+          <w:rFonts w:eastAsia="Times New Roman"/>
+        </w:rPr>
+        <w:t>can be noticed</w:t>
+      </w:r>
+      <w:r>
+        <w:rPr>
+          <w:rFonts w:eastAsia="Times New Roman"/>
+        </w:rPr>
+        <w:t xml:space="preserve"> </w:t>
+      </w:r>
+      <w:r>
+        <w:rPr>
+          <w:rFonts w:eastAsia="Times New Roman"/>
+        </w:rPr>
+        <w:t>early.</w:t>
       </w:r>
     </w:p>
     <w:p>
@@ -1659,7 +1519,19 @@
         <w:rPr>
           <w:rFonts w:eastAsia="Times New Roman"/>
         </w:rPr>
-        <w:t>Most of the steps are automated. When code is pushed, the pipeline starts and runs the required steps like checking and building without much manual work.</w:t>
+        <w:t>A large number of</w:t>
+      </w:r>
+      <w:r>
+        <w:rPr>
+          <w:rFonts w:eastAsia="Times New Roman"/>
+        </w:rPr>
+        <w:t xml:space="preserve"> </w:t>
+      </w:r>
+      <w:r>
+        <w:rPr>
+          <w:rFonts w:eastAsia="Times New Roman"/>
+        </w:rPr>
+        <w:t>steps are automated. When code is pushed, the pipeline starts and runs the required steps like checking and building without much manual work.</w:t>
       </w:r>
     </w:p>
     <w:p>
@@ -1695,23 +1567,7 @@
         <w:rPr>
           <w:rFonts w:eastAsia="Times New Roman"/>
         </w:rPr>
-        <w:t xml:space="preserve">The system works in a continuous manner where the flow is not </w:t>
-      </w:r>
-      <w:proofErr w:type="spellStart"/>
-      <w:proofErr w:type="gramStart"/>
-      <w:r>
-        <w:rPr>
-          <w:rFonts w:eastAsia="Times New Roman"/>
-        </w:rPr>
-        <w:t>interrupted.Code</w:t>
-      </w:r>
-      <w:proofErr w:type="spellEnd"/>
-      <w:proofErr w:type="gramEnd"/>
-      <w:r>
-        <w:rPr>
-          <w:rFonts w:eastAsia="Times New Roman"/>
-        </w:rPr>
-        <w:t xml:space="preserve"> changes move step by step without stopping, which helps in faster development.</w:t>
+        <w:t>The system works in a continuous manner where the flow is not interrupted.Code changes move step by step without stopping, which helps in faster development.</w:t>
       </w:r>
     </w:p>
     <w:p>
@@ -1747,23 +1603,7 @@
         <w:rPr>
           <w:rFonts w:eastAsia="Times New Roman"/>
         </w:rPr>
-        <w:t xml:space="preserve">Security is checked in more than one </w:t>
-      </w:r>
-      <w:proofErr w:type="spellStart"/>
-      <w:proofErr w:type="gramStart"/>
-      <w:r>
-        <w:rPr>
-          <w:rFonts w:eastAsia="Times New Roman"/>
-        </w:rPr>
-        <w:t>way.Checking</w:t>
-      </w:r>
-      <w:proofErr w:type="spellEnd"/>
-      <w:proofErr w:type="gramEnd"/>
-      <w:r>
-        <w:rPr>
-          <w:rFonts w:eastAsia="Times New Roman"/>
-        </w:rPr>
-        <w:t xml:space="preserve"> is done in stages. First the code is checked, then the application, and later the running system is verified.</w:t>
+        <w:t>Security is checked in more than one way.Checking is done in stages. First the code is checked, then the application, and later the running system is verified.</w:t>
       </w:r>
     </w:p>
     <w:p>
@@ -1852,6 +1692,12 @@
           <w:rFonts w:eastAsia="Times New Roman"/>
         </w:rPr>
       </w:pPr>
+      <w:r>
+        <w:rPr>
+          <w:rFonts w:eastAsia="Times New Roman"/>
+        </w:rPr>
+        <w:t>7) Team Involvement</w:t>
+      </w:r>
     </w:p>
     <w:p>
       <w:pPr>
@@ -1865,7 +1711,31 @@
         <w:rPr>
           <w:rFonts w:eastAsia="Times New Roman"/>
         </w:rPr>
-        <w:t>7) Team Involvement</w:t>
+        <w:t xml:space="preserve">     </w:t>
+      </w:r>
+      <w:r>
+        <w:rPr>
+          <w:rFonts w:eastAsia="Times New Roman"/>
+        </w:rPr>
+        <w:t xml:space="preserve">All stages are connected, so work is not limited to one team. This makes it a bit easier for teams to follow the process </w:t>
+      </w:r>
+      <w:r>
+        <w:rPr>
+          <w:rFonts w:eastAsia="Times New Roman"/>
+        </w:rPr>
+        <w:t>and work together without much difficulty</w:t>
+      </w:r>
+      <w:r>
+        <w:rPr>
+          <w:rFonts w:eastAsia="Times New Roman"/>
+        </w:rPr>
+        <w:t xml:space="preserve"> </w:t>
+      </w:r>
+      <w:r>
+        <w:rPr>
+          <w:rFonts w:eastAsia="Times New Roman"/>
+        </w:rPr>
+        <w:t>confusion.</w:t>
       </w:r>
     </w:p>
     <w:p>
@@ -1880,13 +1750,7 @@
         <w:rPr>
           <w:rFonts w:eastAsia="Times New Roman"/>
         </w:rPr>
-        <w:t xml:space="preserve">     </w:t>
-      </w:r>
-      <w:r>
-        <w:rPr>
-          <w:rFonts w:eastAsia="Times New Roman"/>
-        </w:rPr>
-        <w:t>All stages are connected, so work is not limited to one team. This makes it a bit easier for teams to follow the process and work together without too much confusion.</w:t>
+        <w:t>8) Managed Setup</w:t>
       </w:r>
     </w:p>
     <w:p>
@@ -1901,7 +1765,13 @@
         <w:rPr>
           <w:rFonts w:eastAsia="Times New Roman"/>
         </w:rPr>
-        <w:t>8) Managed Setup</w:t>
+        <w:t xml:space="preserve">    </w:t>
+      </w:r>
+      <w:r>
+        <w:rPr>
+          <w:rFonts w:eastAsia="Times New Roman"/>
+        </w:rPr>
+        <w:t>Deployment is handled in a controlled way so that the system stays stable and is easier to manage afterwards.</w:t>
       </w:r>
     </w:p>
     <w:p>
@@ -1916,48 +1786,13 @@
         <w:rPr>
           <w:rFonts w:eastAsia="Times New Roman"/>
         </w:rPr>
-        <w:t xml:space="preserve">    </w:t>
-      </w:r>
-      <w:r>
-        <w:rPr>
-          <w:rFonts w:eastAsia="Times New Roman"/>
-        </w:rPr>
-        <w:t>Deployment is handled in a controlled way so that the system stays stable and is easier to manage afterwards.</w:t>
-      </w:r>
-    </w:p>
-    <w:p>
-      <w:pPr>
-        <w:spacing w:before="5pt" w:beforeAutospacing="1" w:after="5pt" w:afterAutospacing="1"/>
-        <w:jc w:val="both"/>
-        <w:rPr>
-          <w:rFonts w:eastAsia="Times New Roman"/>
-        </w:rPr>
-      </w:pPr>
-      <w:r>
-        <w:rPr>
-          <w:rFonts w:eastAsia="Times New Roman"/>
-        </w:rPr>
         <w:t xml:space="preserve">     </w:t>
       </w:r>
       <w:r>
         <w:rPr>
           <w:rFonts w:eastAsia="Times New Roman"/>
         </w:rPr>
-        <w:t xml:space="preserve">Using this approach, the system becomes more secure and simpler to manage. Issues can be noticed earlier, and </w:t>
-      </w:r>
-      <w:proofErr w:type="gramStart"/>
-      <w:r>
-        <w:rPr>
-          <w:rFonts w:eastAsia="Times New Roman"/>
-        </w:rPr>
-        <w:t>overall</w:t>
-      </w:r>
-      <w:proofErr w:type="gramEnd"/>
-      <w:r>
-        <w:rPr>
-          <w:rFonts w:eastAsia="Times New Roman"/>
-        </w:rPr>
-        <w:t xml:space="preserve"> the process becomes easier to deal with.</w:t>
+        <w:t>Using this approach, the system becomes more secure and simpler to manage. Issues can be noticed earlier, and overall the process becomes easier to deal with.</w:t>
       </w:r>
     </w:p>
     <w:p>
@@ -2163,7 +1998,18 @@
           <w:szCs w:val="20"/>
           <w:lang w:val="en-IN" w:eastAsia="x-none"/>
         </w:rPr>
-        <w:t>The process starts when code is taken from the Git repository. After that, the code is checked using SonarQube so that basic issues can be found early. After this, the application is built using tools like Node.js, based on what is used in the project.</w:t>
+        <w:t xml:space="preserve">The process starts when code is taken from the Git repository. After that, the code is checked using SonarQube so that basic issues can be found early. </w:t>
+      </w:r>
+      <w:r>
+        <w:rPr>
+          <w:bCs/>
+          <w:color w:val="000000" w:themeColor="text1"/>
+          <w:spacing w:val="-1"/>
+          <w:sz w:val="20"/>
+          <w:szCs w:val="20"/>
+          <w:lang w:val="en-IN" w:eastAsia="x-none"/>
+        </w:rPr>
+        <w:t>After that, the code is checked with SonarQube for basic issues. Then the application is built using Node.js depending on the project.</w:t>
       </w:r>
     </w:p>
     <w:p>
@@ -2201,9 +2047,20 @@
           <w:spacing w:val="-1"/>
           <w:sz w:val="20"/>
           <w:szCs w:val="20"/>
+          <w:lang w:eastAsia="x-none"/>
+        </w:rPr>
+        <w:t>Next, a Docker image is created. This image is then checked using Trivy to look for any problems inside the container. Only after this step, the application is deployed using Kubernetes</w:t>
+      </w:r>
+      <w:r>
+        <w:rPr>
+          <w:bCs/>
+          <w:color w:val="000000" w:themeColor="text1"/>
+          <w:spacing w:val="-1"/>
+          <w:sz w:val="20"/>
+          <w:szCs w:val="20"/>
           <w:lang w:val="en-IN" w:eastAsia="x-none"/>
         </w:rPr>
-        <w:t>Next, a Docker image is created. This image is then checked using Trivy to see if there are any problems inside the container. Only after this, the application is moved to deployment using Kubernetes.</w:t>
+        <w:t>.</w:t>
       </w:r>
     </w:p>
     <w:p>
@@ -2241,9 +2098,20 @@
           <w:spacing w:val="-1"/>
           <w:sz w:val="20"/>
           <w:szCs w:val="20"/>
+          <w:lang w:eastAsia="x-none"/>
+        </w:rPr>
+        <w:t>After deployment, the application is tested while it is running using OWASP ZAP. This helps in noticing some issues that were not seen in earlier stages</w:t>
+      </w:r>
+      <w:r>
+        <w:rPr>
+          <w:bCs/>
+          <w:color w:val="000000" w:themeColor="text1"/>
+          <w:spacing w:val="-1"/>
+          <w:sz w:val="20"/>
+          <w:szCs w:val="20"/>
           <w:lang w:val="en-IN" w:eastAsia="x-none"/>
         </w:rPr>
-        <w:t>After deployment, the running application is tested using OWASP ZAP. This helps in finding issues that may not be visible during earlier stages.</w:t>
+        <w:t>.</w:t>
       </w:r>
     </w:p>
     <w:p>
@@ -2281,9 +2149,20 @@
           <w:spacing w:val="-1"/>
           <w:sz w:val="20"/>
           <w:szCs w:val="20"/>
+          <w:lang w:eastAsia="x-none"/>
+        </w:rPr>
+        <w:t>At the last stage, monitoring is done using Prometheus and Grafana. This helps in watching the system regularly, so if any issue comes later, it can be noticed</w:t>
+      </w:r>
+      <w:r>
+        <w:rPr>
+          <w:bCs/>
+          <w:color w:val="000000" w:themeColor="text1"/>
+          <w:spacing w:val="-1"/>
+          <w:sz w:val="20"/>
+          <w:szCs w:val="20"/>
           <w:lang w:val="en-IN" w:eastAsia="x-none"/>
         </w:rPr>
-        <w:t>At the final stage, monitoring is done using Prometheus and Grafana. This helps in keeping track of the system regularly, so if any issue comes later, it can be noticed.</w:t>
+        <w:t>.</w:t>
       </w:r>
     </w:p>
     <w:p>
@@ -2321,9 +2200,20 @@
           <w:spacing w:val="-1"/>
           <w:sz w:val="20"/>
           <w:szCs w:val="20"/>
+          <w:lang w:eastAsia="x-none"/>
+        </w:rPr>
+        <w:t>Overall, the pipeline runs step by step, and checking happens along with the development process. If any issue comes up, it can be seen earlier, so fixing it later becomes easier</w:t>
+      </w:r>
+      <w:r>
+        <w:rPr>
+          <w:bCs/>
+          <w:color w:val="000000" w:themeColor="text1"/>
+          <w:spacing w:val="-1"/>
+          <w:sz w:val="20"/>
+          <w:szCs w:val="20"/>
           <w:lang w:val="en-IN" w:eastAsia="x-none"/>
         </w:rPr>
-        <w:t>Overall, the pipeline keeps running step by step, and checking is done along with the development process.If any issue comes, it can be noticed at an earlier stage, so fixing it later does not become difficult.</w:t>
+        <w:t>.</w:t>
       </w:r>
     </w:p>
     <w:p>
@@ -2357,10 +2247,29 @@
           <w:spacing w:val="-1"/>
           <w:sz w:val="20"/>
           <w:szCs w:val="20"/>
-          <w:lang w:val="en-IN" w:eastAsia="x-none"/>
-        </w:rPr>
-      </w:pPr>
-      <w:r>
+          <w:lang w:eastAsia="x-none"/>
+        </w:rPr>
+      </w:pPr>
+      <w:r>
+        <w:rPr>
+          <w:bCs/>
+          <w:color w:val="000000" w:themeColor="text1"/>
+          <w:spacing w:val="-1"/>
+          <w:sz w:val="20"/>
+          <w:szCs w:val="20"/>
+          <w:lang w:eastAsia="x-none"/>
+        </w:rPr>
+        <w:t>In this work, a DevSecOps pipeline is implemented where different stages are connected in a continuous flow. The main idea is to include security checks along with development instead of handling them separately.</w:t>
+      </w:r>
+    </w:p>
+    <w:p>
+      <w:pPr>
+        <w:pStyle w:val="references"/>
+        <w:numPr>
+          <w:ilvl w:val="0"/>
+          <w:numId w:val="0"/>
+        </w:numPr>
+        <w:spacing w:line="12pt" w:lineRule="auto"/>
         <w:rPr>
           <w:bCs/>
           <w:color w:val="000000" w:themeColor="text1"/>
@@ -2369,7 +2278,28 @@
           <w:szCs w:val="20"/>
           <w:lang w:val="en-IN" w:eastAsia="x-none"/>
         </w:rPr>
-        <w:t>In this work, a DevSecOps pipeline is implemented where different stages are connected in a continuous flow. The main aim is to include security checks along with development instead of handling them separately.</w:t>
+      </w:pPr>
+      <w:r>
+        <w:rPr>
+          <w:bCs/>
+          <w:color w:val="000000" w:themeColor="text1"/>
+          <w:spacing w:val="-1"/>
+          <w:sz w:val="20"/>
+          <w:szCs w:val="20"/>
+          <w:lang w:val="en-IN" w:eastAsia="x-none"/>
+        </w:rPr>
+        <w:t xml:space="preserve">    </w:t>
+      </w:r>
+      <w:r>
+        <w:rPr>
+          <w:bCs/>
+          <w:color w:val="000000" w:themeColor="text1"/>
+          <w:spacing w:val="-1"/>
+          <w:sz w:val="20"/>
+          <w:szCs w:val="20"/>
+          <w:lang w:eastAsia="x-none"/>
+        </w:rPr>
+        <w:t>The process starts when the code is pushed to the Git repository. After that, the pipeline runs and the code goes to the next stage. In this stage, the code is checked to see if there are any basic issues.</w:t>
       </w:r>
     </w:p>
     <w:p>
@@ -2396,9 +2326,9 @@
           <w:spacing w:val="-1"/>
           <w:sz w:val="20"/>
           <w:szCs w:val="20"/>
-          <w:lang w:val="en-IN" w:eastAsia="x-none"/>
-        </w:rPr>
-        <w:t xml:space="preserve">    </w:t>
+          <w:lang w:eastAsia="x-none"/>
+        </w:rPr>
+        <w:t>Then the application is built. After that, a Docker image is created. This image is checked to find if any problems are present inside the container</w:t>
       </w:r>
       <w:r>
         <w:rPr>
@@ -2409,7 +2339,7 @@
           <w:szCs w:val="20"/>
           <w:lang w:val="en-IN" w:eastAsia="x-none"/>
         </w:rPr>
-        <w:t>The process begins when the code is pushed to the Git repository. After that, the pipeline gets triggered and the code is taken for further steps. In the next stage, static checking is done to find basic issues in the code.</w:t>
+        <w:t>.</w:t>
       </w:r>
     </w:p>
     <w:p>
@@ -2447,9 +2377,20 @@
           <w:spacing w:val="-1"/>
           <w:sz w:val="20"/>
           <w:szCs w:val="20"/>
+          <w:lang w:eastAsia="x-none"/>
+        </w:rPr>
+        <w:t>After this, the application is deployed using Kubernetes. When the application starts running, it is checked to see if any issues come up during execution</w:t>
+      </w:r>
+      <w:r>
+        <w:rPr>
+          <w:bCs/>
+          <w:color w:val="000000" w:themeColor="text1"/>
+          <w:spacing w:val="-1"/>
+          <w:sz w:val="20"/>
+          <w:szCs w:val="20"/>
           <w:lang w:val="en-IN" w:eastAsia="x-none"/>
         </w:rPr>
-        <w:t>Once this is completed, the application is built. After building, a container image is created using Docker. This image is then checked to identify any vulnerabilities present inside it.</w:t>
+        <w:t>.</w:t>
       </w:r>
     </w:p>
     <w:p>
@@ -2487,49 +2428,9 @@
           <w:spacing w:val="-1"/>
           <w:sz w:val="20"/>
           <w:szCs w:val="20"/>
-          <w:lang w:val="en-IN" w:eastAsia="x-none"/>
-        </w:rPr>
-        <w:t>After the checking is done, the application is deployed using Kubernetes. After the application starts running, it is tested to check if any issues are present during execution.</w:t>
-      </w:r>
-    </w:p>
-    <w:p>
-      <w:pPr>
-        <w:pStyle w:val="references"/>
-        <w:numPr>
-          <w:ilvl w:val="0"/>
-          <w:numId w:val="0"/>
-        </w:numPr>
-        <w:spacing w:line="12pt" w:lineRule="auto"/>
-        <w:rPr>
-          <w:bCs/>
-          <w:color w:val="000000" w:themeColor="text1"/>
-          <w:spacing w:val="-1"/>
-          <w:sz w:val="20"/>
-          <w:szCs w:val="20"/>
-          <w:lang w:val="en-IN" w:eastAsia="x-none"/>
-        </w:rPr>
-      </w:pPr>
-      <w:r>
-        <w:rPr>
-          <w:bCs/>
-          <w:color w:val="000000" w:themeColor="text1"/>
-          <w:spacing w:val="-1"/>
-          <w:sz w:val="20"/>
-          <w:szCs w:val="20"/>
-          <w:lang w:val="en-IN" w:eastAsia="x-none"/>
-        </w:rPr>
-        <w:t xml:space="preserve">     </w:t>
-      </w:r>
-      <w:r>
-        <w:rPr>
-          <w:bCs/>
-          <w:color w:val="000000" w:themeColor="text1"/>
-          <w:spacing w:val="-1"/>
-          <w:sz w:val="20"/>
-          <w:szCs w:val="20"/>
-          <w:lang w:val="en-IN" w:eastAsia="x-none"/>
-        </w:rPr>
-        <w:t xml:space="preserve">At the last stage, the system is observed regularly to see if any problem occurs. </w:t>
+          <w:lang w:eastAsia="x-none"/>
+        </w:rPr>
+        <w:t>At the last stage, the system is watched regularly to see if any problem occurs. Tools are used to track system performance and notice problems during runtime. The details of these tools are shown in Table I</w:t>
       </w:r>
       <w:r>
         <w:rPr>
@@ -2540,7 +2441,7 @@
           <w:szCs w:val="20"/>
           <w:lang w:eastAsia="x-none"/>
         </w:rPr>
-        <w:t>Tools are used to observe system performance and detect problems during runtime. The details of these tools are shown in Table I.</w:t>
+        <w:t>.</w:t>
       </w:r>
     </w:p>
     <w:tbl>
@@ -3498,7 +3399,40 @@
           <w:szCs w:val="20"/>
           <w:lang w:val="en-IN" w:eastAsia="x-none"/>
         </w:rPr>
-        <w:t>In this way, all stages are connected, and security checking is done at multiple points. This helps in identifying issues earlier and reduces the effort required at later stages.</w:t>
+        <w:t xml:space="preserve">In </w:t>
+      </w:r>
+      <w:r>
+        <w:rPr>
+          <w:bCs/>
+          <w:color w:val="000000" w:themeColor="text1"/>
+          <w:spacing w:val="-1"/>
+          <w:sz w:val="20"/>
+          <w:szCs w:val="20"/>
+          <w:lang w:eastAsia="x-none"/>
+        </w:rPr>
+        <w:t>with this approach, all stages are</w:t>
+      </w:r>
+      <w:r>
+        <w:rPr>
+          <w:bCs/>
+          <w:color w:val="000000" w:themeColor="text1"/>
+          <w:spacing w:val="-1"/>
+          <w:sz w:val="20"/>
+          <w:szCs w:val="20"/>
+          <w:lang w:eastAsia="x-none"/>
+        </w:rPr>
+        <w:t xml:space="preserve"> </w:t>
+      </w:r>
+      <w:r>
+        <w:rPr>
+          <w:bCs/>
+          <w:color w:val="000000" w:themeColor="text1"/>
+          <w:spacing w:val="-1"/>
+          <w:sz w:val="20"/>
+          <w:szCs w:val="20"/>
+          <w:lang w:val="en-IN" w:eastAsia="x-none"/>
+        </w:rPr>
+        <w:t>connected, and security checking is done at multiple points. This helps in identifying issues earlier and reduces the effort required at later stages.</w:t>
       </w:r>
     </w:p>
     <w:p>
@@ -3527,24 +3461,58 @@
         </w:rPr>
       </w:pPr>
       <w:r>
+        <w:t>In this work, the DevSecOps pipeline was implemented and tested to check how it performs in different stages. The pipeline was able to run continuously from code integration to deployment without major interruption</w:t>
+      </w:r>
+      <w:r>
         <w:rPr>
           <w:lang w:val="en-IN"/>
         </w:rPr>
-        <w:t xml:space="preserve">In this work, the </w:t>
-      </w:r>
-      <w:proofErr w:type="spellStart"/>
-      <w:r>
+        <w:t>.</w:t>
+      </w:r>
+    </w:p>
+    <w:p>
+      <w:pPr>
+        <w:jc w:val="both"/>
         <w:rPr>
           <w:lang w:val="en-IN"/>
         </w:rPr>
-        <w:t>DevSecOps</w:t>
-      </w:r>
-      <w:proofErr w:type="spellEnd"/>
+      </w:pPr>
+      <w:r>
+        <w:t xml:space="preserve">     </w:t>
+      </w:r>
+      <w:r>
+        <w:t>In the early stages, checking the code helped to find issues sooner, so fewer problems appeared later. Container checking also helped in finding problems before deployment, so only verified images were used</w:t>
+      </w:r>
+      <w:r>
+        <w:t>.</w:t>
+      </w:r>
+    </w:p>
+    <w:p>
+      <w:pPr>
+        <w:jc w:val="both"/>
+      </w:pPr>
+      <w:r>
+        <w:t xml:space="preserve">     </w:t>
+      </w:r>
+      <w:r>
+        <w:t>After deployment, the application was checked while it was running. This made it possible to notice a few issues that were not seen earlier. Monitoring was done to observe system behaviour, and it helped in tracking performance and noticing any issues during runtime</w:t>
+      </w:r>
+      <w:r>
+        <w:t>.</w:t>
+      </w:r>
+    </w:p>
+    <w:p>
+      <w:pPr>
+        <w:jc w:val="both"/>
+      </w:pPr>
       <w:r>
         <w:rPr>
           <w:lang w:val="en-IN"/>
         </w:rPr>
-        <w:t xml:space="preserve"> pipeline was implemented and tested to check how it performs in different stages. The pipeline was able to run continuously from code integration to deployment without major interruption.</w:t>
+        <w:t xml:space="preserve">     </w:t>
+      </w:r>
+      <w:r>
+        <w:t xml:space="preserve">One thing we observed is that when checking is done at different stages, fewer problems remain at the end. Because of this, less work is needed later to fix issues. </w:t>
       </w:r>
     </w:p>
     <w:p>
@@ -3555,60 +3523,16 @@
         </w:rPr>
       </w:pPr>
       <w:r>
-        <w:t xml:space="preserve">     </w:t>
-      </w:r>
-      <w:r>
-        <w:t>In the early stages, checking the code helped to find issues sooner, so fewer problems appeared later. Container checking also helped in finding problems before deployment, so only verified images were used.</w:t>
-      </w:r>
-    </w:p>
-    <w:p>
-      <w:pPr>
-        <w:jc w:val="both"/>
-      </w:pPr>
-      <w:r>
-        <w:t xml:space="preserve">     </w:t>
-      </w:r>
-      <w:r>
-        <w:t xml:space="preserve">After deployment, the application was checked while it was running. This made it possible to notice some issues that were not seen in the earlier stages. Monitoring was also carried out to observe system </w:t>
-      </w:r>
-      <w:proofErr w:type="spellStart"/>
-      <w:r>
-        <w:t>behaviour</w:t>
-      </w:r>
-      <w:proofErr w:type="spellEnd"/>
-      <w:r>
-        <w:t>, and it helped in tracking performance and detecting any issues during runtime.</w:t>
-      </w:r>
-    </w:p>
-    <w:p>
-      <w:pPr>
-        <w:jc w:val="both"/>
+        <w:t xml:space="preserve">      </w:t>
+      </w:r>
+      <w:r>
+        <w:t>Overall, combining development and security in the same flow made the process better. This also made the system more stable and easier to manage compared to handling security as a separate step</w:t>
+      </w:r>
+      <w:r>
         <w:rPr>
           <w:lang w:val="en-IN"/>
         </w:rPr>
-      </w:pPr>
-      <w:r>
-        <w:rPr>
-          <w:lang w:val="en-IN"/>
-        </w:rPr>
-        <w:t xml:space="preserve">     </w:t>
-      </w:r>
-      <w:r>
-        <w:rPr>
-          <w:lang w:val="en-IN"/>
-        </w:rPr>
-        <w:t>One thing we observed is that when checking is done at different stages, fewer problems remain at the end. Because of this, less effort is needed to fix things after deployment.</w:t>
-      </w:r>
-    </w:p>
-    <w:p>
-      <w:pPr>
-        <w:jc w:val="both"/>
-      </w:pPr>
-      <w:r>
-        <w:t xml:space="preserve">     </w:t>
-      </w:r>
-      <w:r>
-        <w:t>Overall, combining development and security in the same flow made the process better. This also made the system more stable and easier to manage compared to handling security as a separate step.</w:t>
+        <w:t>.</w:t>
       </w:r>
     </w:p>
     <w:p>
@@ -3624,9 +3548,37 @@
         <w:rPr>
           <w:b/>
           <w:bCs/>
+        </w:rPr>
+        <w:t>COMPARISON WITH RELATED WORK</w:t>
+      </w:r>
+    </w:p>
+    <w:p>
+      <w:pPr>
+        <w:jc w:val="both"/>
+        <w:rPr>
           <w:lang w:val="en-IN"/>
         </w:rPr>
-        <w:t>Comparison with Existing Work</w:t>
+      </w:pPr>
+      <w:r>
+        <w:t>During</w:t>
+      </w:r>
+      <w:r>
+        <w:rPr>
+          <w:lang w:val="en-IN"/>
+        </w:rPr>
+        <w:t xml:space="preserve"> compared with earlier works, most of them focused only on specific parts of the pipeline such as code checking or testing after deployment. </w:t>
+      </w:r>
+      <w:r>
+        <w:rPr>
+          <w:lang w:val="en-IN"/>
+        </w:rPr>
+        <w:t>In some cases, tools were applied only for static analysis or only for dynamic testing. Because of this, security was not covered at all stages</w:t>
+      </w:r>
+      <w:r>
+        <w:rPr>
+          <w:lang w:val="en-IN"/>
+        </w:rPr>
+        <w:t>.</w:t>
       </w:r>
     </w:p>
     <w:p>
@@ -3640,7 +3592,13 @@
         <w:rPr>
           <w:lang w:val="en-IN"/>
         </w:rPr>
-        <w:t>When compared with earlier works, most of them focused only on specific parts of the pipeline such as code checking or testing after deployment. In some cases, tools were used only for static analysis or only for dynamic testing. Because of this, security was not covered at all stages.</w:t>
+        <w:t xml:space="preserve">     </w:t>
+      </w:r>
+      <w:r>
+        <w:rPr>
+          <w:lang w:val="en-IN"/>
+        </w:rPr>
+        <w:t>In our case, the pipeline includes checking at different points, such as code level, container level, and after deployment. This makes the process more continuous instead of handling security in a single step.</w:t>
       </w:r>
     </w:p>
     <w:p>
@@ -3654,53 +3612,33 @@
         <w:rPr>
           <w:lang w:val="en-IN"/>
         </w:rPr>
-        <w:t xml:space="preserve">     </w:t>
+        <w:t xml:space="preserve">    </w:t>
       </w:r>
       <w:r>
         <w:rPr>
           <w:lang w:val="en-IN"/>
         </w:rPr>
-        <w:t>In our case, the pipeline includes checking at different points, such as code level, container level, and after deployment. This makes the process more continuous instead of handling security in a single step.</w:t>
+        <w:t>Another difference is that some existing works did not include proper monitoring after deployment. In this work, monitoring is also included, so the system can be observed even after it is running</w:t>
+      </w:r>
+      <w:r>
+        <w:rPr>
+          <w:lang w:val="en-IN"/>
+        </w:rPr>
+        <w:t>.</w:t>
       </w:r>
     </w:p>
     <w:p>
       <w:pPr>
         <w:jc w:val="both"/>
+      </w:pPr>
+      <w:r>
         <w:rPr>
           <w:lang w:val="en-IN"/>
         </w:rPr>
-      </w:pPr>
-      <w:r>
-        <w:rPr>
-          <w:lang w:val="en-IN"/>
-        </w:rPr>
-        <w:t xml:space="preserve">    </w:t>
-      </w:r>
-      <w:r>
-        <w:rPr>
-          <w:lang w:val="en-IN"/>
-        </w:rPr>
-        <w:t>Another difference is that some existing works did not include proper monitoring after deployment. In this work, monitoring is also included, so the system can be observed even after it is running.</w:t>
-      </w:r>
-    </w:p>
-    <w:p>
-      <w:pPr>
-        <w:jc w:val="both"/>
-      </w:pPr>
-      <w:r>
-        <w:rPr>
-          <w:lang w:val="en-IN"/>
-        </w:rPr>
-        <w:t xml:space="preserve">     </w:t>
-      </w:r>
-      <w:r>
-        <w:rPr>
-          <w:lang w:val="en-IN"/>
-        </w:rPr>
-        <w:t>From this, it can be understood that combining multiple stages together helps in improving the overall process and reduces issues at later stages.</w:t>
-      </w:r>
-      <w:r>
-        <w:t xml:space="preserve"> The comparison between existing work and the proposed system is shown in Table II.</w:t>
+        <w:t>From this, it can be understood that combining multiple stages together helps in improving the overall process and reduces issues at later stages. The comparison between existing work and the proposed system is presented in Table II</w:t>
+      </w:r>
+      <w:r>
+        <w:t>.</w:t>
       </w:r>
     </w:p>
     <w:p>
@@ -4134,7 +4072,14 @@
           <w:sz w:val="16"/>
           <w:szCs w:val="16"/>
         </w:rPr>
-        <w:t>Table II: Comparison with Existing Work</w:t>
+        <w:t xml:space="preserve">Table II: </w:t>
+      </w:r>
+      <w:r>
+        <w:rPr>
+          <w:sz w:val="16"/>
+          <w:szCs w:val="16"/>
+        </w:rPr>
+        <w:t>Comparison with Previous Work</w:t>
       </w:r>
     </w:p>
     <w:p>
@@ -4142,7 +4087,13 @@
         <w:jc w:val="both"/>
       </w:pPr>
       <w:r>
-        <w:t>From the table, it can be seen that the proposed work covers more stages compared to earlier approaches.</w:t>
+        <w:t>From the table, it is clear that</w:t>
+      </w:r>
+      <w:r>
+        <w:t xml:space="preserve"> </w:t>
+      </w:r>
+      <w:r>
+        <w:t>the proposed work covers more stages compared to earlier approaches.</w:t>
       </w:r>
     </w:p>
     <w:p>
@@ -4166,15 +4117,22 @@
         <w:jc w:val="both"/>
       </w:pPr>
       <w:r>
-        <w:t xml:space="preserve">In this work, a </w:t>
-      </w:r>
-      <w:proofErr w:type="spellStart"/>
-      <w:r>
-        <w:t>DevSecOps</w:t>
-      </w:r>
-      <w:proofErr w:type="spellEnd"/>
-      <w:r>
-        <w:t xml:space="preserve"> pipeline is proposed by combining development and security in a single flow. The main idea is to include checking at different stages instead of handling security only at the end.</w:t>
+        <w:t xml:space="preserve">In this work, a DevSecOps pipeline is proposed by combining </w:t>
+      </w:r>
+      <w:r>
+        <w:t>development and security together in one</w:t>
+      </w:r>
+      <w:r>
+        <w:t xml:space="preserve"> </w:t>
+      </w:r>
+      <w:r>
+        <w:t xml:space="preserve">flow. </w:t>
+      </w:r>
+      <w:r>
+        <w:t>The main focus here is to include checking at different stages instead of handling security only at the end</w:t>
+      </w:r>
+      <w:r>
+        <w:t>.</w:t>
       </w:r>
     </w:p>
     <w:p>
@@ -4182,31 +4140,24 @@
         <w:jc w:val="both"/>
       </w:pPr>
       <w:r>
+        <w:t>Based on the design, early checking can help in finding issues sooner, which may reduce problems in later stages. Checking the container and testing after deployment can help in finding a few issues that may not appear in the early stages. Monitoring is used to keep an eye on the system even after it is deployed</w:t>
+      </w:r>
+      <w:r>
+        <w:t>.</w:t>
+      </w:r>
+    </w:p>
+    <w:p>
+      <w:pPr>
+        <w:jc w:val="both"/>
+      </w:pPr>
+      <w:r>
         <w:t xml:space="preserve">     </w:t>
       </w:r>
       <w:r>
-        <w:t xml:space="preserve">Based on the design, early checking can help in finding issues sooner, which may reduce problems in later </w:t>
-      </w:r>
-      <w:proofErr w:type="spellStart"/>
-      <w:proofErr w:type="gramStart"/>
-      <w:r>
-        <w:t>stages.Checking</w:t>
-      </w:r>
-      <w:proofErr w:type="spellEnd"/>
-      <w:proofErr w:type="gramEnd"/>
-      <w:r>
-        <w:t xml:space="preserve"> the container and also testing after deployment can help in finding some issues that are not seen in the early stages. Monitoring can also be used to keep an eye on the system even after it is deployed.</w:t>
-      </w:r>
-    </w:p>
-    <w:p>
-      <w:pPr>
-        <w:jc w:val="both"/>
-      </w:pPr>
-      <w:r>
-        <w:t xml:space="preserve">     </w:t>
-      </w:r>
-      <w:r>
-        <w:t>The pipeline is planned in such a way that it runs step by step, with all stages connected. Because of this, the process can be easier to handle and may reduce extra work later.</w:t>
+        <w:t>The pipeline is planned so that it runs step by step, with all stages connected. Because of this, the process can be easier to handle and may reduce extra work later</w:t>
+      </w:r>
+      <w:r>
+        <w:t>.</w:t>
       </w:r>
     </w:p>
     <w:p>
@@ -6474,7 +6425,6 @@
   <w:style w:type="character" w:default="1" w:styleId="DefaultParagraphFont">
     <w:name w:val="Default Paragraph Font"/>
     <w:uiPriority w:val="1"/>
-    <w:semiHidden/>
     <w:unhideWhenUsed/>
   </w:style>
   <w:style w:type="table" w:default="1" w:styleId="TableNormal">

</xml_diff>

<commit_message>
Revise Survey Paper to improve clarity and enhance focus on DevSecOps integration
</commit_message>
<xml_diff>
--- a/Documentation/Survey Paper/Survey-paper1.docx
+++ b/Documentation/Survey Paper/Survey-paper1.docx
@@ -231,13 +231,7 @@
         <w:rPr>
           <w:kern w:val="48"/>
         </w:rPr>
-        <w:t>Building Security Into Every Stage of the</w:t>
-      </w:r>
-      <w:r>
-        <w:rPr>
-          <w:kern w:val="48"/>
-        </w:rPr>
-        <w:t xml:space="preserve"> </w:t>
+        <w:t xml:space="preserve">Building Security Into Every Stage of the </w:t>
       </w:r>
       <w:r>
         <w:rPr>
@@ -619,7 +613,15 @@
         <w:t xml:space="preserve"> </w:t>
       </w:r>
       <w:r>
-        <w:t>DevOps brought real change to how software teams operate, cutting down delivery timelines by pulling development and operations into a single, more connected workflow. But speed alone was never the full picture. As applications became more exposed to threats, security could no longer afford to wait until the final stages — and that gap is largely what DevSecOps was built to fill, pushing security checks much earlier into the development cycle</w:t>
+        <w:t xml:space="preserve">For a long time, development and operations were two separate worlds. Developers wrote code and passed it on. Operations dealt with whatever came next. The gap between them caused delays, miscommunication, and releases that took far longer than they should have. DevOps closed that gap. Teams started working as one unit, release speeds picked up, and the overall process became less painful for everyone involved. Security though was a different story. Nobody really pulled it into the conversation. It sat at the tail end of everything, reviewed late, often rushed, and by the time anyone looked closely the code had already been written and most choices had already been locked in. That approach held up for a while. Then applications started becoming bigger targets, breaches became more frequent, and leaving security until last started producing consequences that were hard to ignore. </w:t>
+      </w:r>
+      <w:proofErr w:type="spellStart"/>
+      <w:r>
+        <w:t>DevSecOps</w:t>
+      </w:r>
+      <w:proofErr w:type="spellEnd"/>
+      <w:r>
+        <w:t xml:space="preserve"> came out of that period — the argument being that if security only shows up at the end, it is already too late</w:t>
       </w:r>
       <w:r>
         <w:t>.</w:t>
@@ -630,7 +632,7 @@
         <w:pStyle w:val="Abstract"/>
       </w:pPr>
       <w:r>
-        <w:t>That said, making it work in practice is a different story. Teams frequently run into trouble when trying to wire security tools into existing pipelines, especially when those tools were never designed to talk to each other. Not every developer has a security background, which means some checks get skipped or misunderstood. Scanners sometimes make things worse by throwing up false positives, and over time developers start ignoring warnings altogether</w:t>
+        <w:t>The challenge is that most teams did not build their pipelines with this in mind. Security tools get added on top of existing setups, and those tools were rarely designed to work alongside each other. A developer who has spent years focused on building features is not always equipped to interpret what a vulnerability scanner is reporting. Some warnings get dismissed as unimportant. Some get ignored because there are thirty others sitting next to them. Scanners that flag everything on every build eventually become background noise, and background noise does not stop vulnerabilities from shipping</w:t>
       </w:r>
       <w:r>
         <w:t>.</w:t>
@@ -641,7 +643,15 @@
         <w:pStyle w:val="Abstract"/>
       </w:pPr>
       <w:r>
-        <w:t>This paper puts forward a working framework that tries to tackle these issues directly inside the CI/CD pipeline. The setup uses Git for source control and Jenkins to manage the integration process. Containers are handled through Docker and Kubernetes, and SonarQube takes care of static code analysis. OWASP ZAP handles dynamic testing on the application side, while Trivy looks specifically at container images for known weaknesses — together they cover ground that neither could manage alone. Prometheus pulls in runtime metrics and Grafana turns those numbers into something the team can actually read and act on</w:t>
+        <w:t xml:space="preserve">The framework this paper describes was put together with those realities in mind. Git takes care of source control, Jenkins manages the pipeline end to end. Docker and Kubernetes handle containerization. SonarQube examines the code statically — before the application runs. OWASP ZAP tests it once it is running, finding things static analysis cannot catch from the inside. </w:t>
+      </w:r>
+      <w:proofErr w:type="spellStart"/>
+      <w:r>
+        <w:t>Trivy</w:t>
+      </w:r>
+      <w:proofErr w:type="spellEnd"/>
+      <w:r>
+        <w:t xml:space="preserve"> handles container images separately, scanning for known vulnerabilities at a layer the other tools do not touch. Prometheus sits in the background collecting runtime data, and Grafana takes that data and turns it into something a team can actually look at and understand without spending an hour interpreting it</w:t>
       </w:r>
       <w:r>
         <w:t>.</w:t>
@@ -655,7 +665,7 @@
         </w:rPr>
       </w:pPr>
       <w:r>
-        <w:t>Unlike setups where security gets reviewed only after deployment, here it stays in the picture throughout — each stage of the pipeline carries its own checks, so nothing slips through quietly</w:t>
+        <w:t>Nothing in this setup waits for deployment to ask security questions. The questions get asked throughout — at every stage — so by the time something reaches production, it has already been examined more than once</w:t>
       </w:r>
       <w:r>
         <w:rPr>
@@ -698,7 +708,30 @@
           <w:rFonts w:eastAsia="Times New Roman"/>
           <w:lang w:eastAsia="en-IN"/>
         </w:rPr>
-        <w:t>DevOps, DevSecOps, CI/CD pipeline, security testing, vulnerability scanning, containerization, monitoring tools, automated security, software security.</w:t>
+        <w:t xml:space="preserve">DevOps, </w:t>
+      </w:r>
+      <w:proofErr w:type="spellStart"/>
+      <w:r>
+        <w:rPr>
+          <w:rFonts w:eastAsia="Times New Roman"/>
+          <w:lang w:eastAsia="en-IN"/>
+        </w:rPr>
+        <w:t>DevSecOps</w:t>
+      </w:r>
+      <w:proofErr w:type="spellEnd"/>
+      <w:r>
+        <w:rPr>
+          <w:rFonts w:eastAsia="Times New Roman"/>
+          <w:lang w:eastAsia="en-IN"/>
+        </w:rPr>
+        <w:t>, CI/CD pipeline, security testing, vulnerability scanning, containerization, monitoring tools, automated security, software security</w:t>
+      </w:r>
+      <w:r>
+        <w:rPr>
+          <w:rFonts w:eastAsia="Times New Roman"/>
+          <w:lang w:eastAsia="en-IN"/>
+        </w:rPr>
+        <w:t>.</w:t>
       </w:r>
     </w:p>
     <w:p>
@@ -733,26 +766,15 @@
           <w:rFonts w:eastAsia="Times New Roman"/>
           <w:lang w:val="en-IN" w:eastAsia="en-IN"/>
         </w:rPr>
-        <w:t xml:space="preserve">The shift toward agile and DevOps practices has made CI/CD pipelines a routine part of how software gets built and delivered today. Container-based workflows have become common in this space because they help keep application behavior consistent whether the code is running on a developer's machine, a test server, or a production environment. Beyond consistency, containers have also taken some of the complexity out of deployment </w:t>
-      </w:r>
-      <w:proofErr w:type="gramStart"/>
+        <w:t>CI/CD pipelines are now used by nearly every software development team, but that was not always the case. They caught on because releasing software the traditional way kept running into the same issues — builds would fail, timelines would stretch, and getting updates out to users took far longer than it should have. When agile methods became widely adopted, teams were expected to deliver working software much more frequently, and doing that by hand simply was not practical anymore. Pipelines took over a large chunk of that work and made releases faster and far less prone to breaking</w:t>
+      </w:r>
       <w:r>
         <w:rPr>
           <w:rFonts w:eastAsia="Times New Roman"/>
           <w:lang w:val="en-IN" w:eastAsia="en-IN"/>
         </w:rPr>
-        <w:t>itself.</w:t>
-      </w:r>
-      <w:r>
-        <w:rPr>
-          <w:rFonts w:eastAsia="Times New Roman"/>
-          <w:sz w:val="24"/>
-          <w:szCs w:val="24"/>
-          <w:lang w:val="en-IN" w:eastAsia="en-IN"/>
-        </w:rPr>
         <w:t>.</w:t>
       </w:r>
-      <w:proofErr w:type="gramEnd"/>
     </w:p>
     <w:p>
       <w:pPr>
@@ -765,7 +787,7 @@
         <w:rPr>
           <w:lang w:val="en-IN"/>
         </w:rPr>
-        <w:t>Security has grown into one of the bigger concerns alongside all of this. The older habit of running security checks only near the end of a release cycle created problems — issues found late cost more to fix and often pushed timelines back</w:t>
+        <w:t>Containers started becoming common around the same period, though they were solving a slightly different headache. Anyone who has spent time in software development has probably run into the situation where something works perfectly on one machine and then stops working the moment it is moved somewhere else. A developer tests their code locally, everything passes, and then the same code hits the test server and falls apart</w:t>
       </w:r>
       <w:r>
         <w:rPr>
@@ -785,7 +807,21 @@
         <w:rPr>
           <w:lang w:val="en-IN"/>
         </w:rPr>
-        <w:t>DevSecOps came out of a recognition that this approach was not sustainable, and that security needed to be part of the process from the very beginning rather than something layered on at the last minute</w:t>
+        <w:t xml:space="preserve">Security became a growing concern as these practices spread. The way security was handled for a long time was to run checks near the end of the development cycle, just before a release. This was not a great approach even when releases were infrequent, but it became a serious problem once teams started releasing more often. When a security issue is found very late it is much harder to fix. A lot of other work has already been done that assumes the problem is not there, so fixing it can mean redoing parts of that work too. </w:t>
+      </w:r>
+      <w:proofErr w:type="spellStart"/>
+      <w:r>
+        <w:rPr>
+          <w:lang w:val="en-IN"/>
+        </w:rPr>
+        <w:t>DevSecOps</w:t>
+      </w:r>
+      <w:proofErr w:type="spellEnd"/>
+      <w:r>
+        <w:rPr>
+          <w:lang w:val="en-IN"/>
+        </w:rPr>
+        <w:t xml:space="preserve"> came out of this situation. The basic idea behind it is that security should be part of the development process from the very beginning rather than something added in at the end</w:t>
       </w:r>
       <w:r>
         <w:rPr>
@@ -805,35 +841,28 @@
         <w:rPr>
           <w:lang w:val="en-IN"/>
         </w:rPr>
-        <w:t xml:space="preserve">Fig. 1 shows exactly where these three areas — Development, Operations, and Security — come together under DevSecOps. On the development side, the focus stays on writing code, bringing different parts together, and pushing things out to where they need to run. Operations </w:t>
-      </w:r>
-      <w:proofErr w:type="gramStart"/>
+        <w:t xml:space="preserve">Fig. 1 shows how the three parts of </w:t>
+      </w:r>
+      <w:proofErr w:type="spellStart"/>
       <w:r>
         <w:rPr>
           <w:lang w:val="en-IN"/>
         </w:rPr>
-        <w:t>handles</w:t>
-      </w:r>
-      <w:proofErr w:type="gramEnd"/>
+        <w:t>DevSecOps</w:t>
+      </w:r>
+      <w:proofErr w:type="spellEnd"/>
       <w:r>
         <w:rPr>
           <w:lang w:val="en-IN"/>
         </w:rPr>
-        <w:t xml:space="preserve"> keeping the system running, available, and scaled properly. Security brings in the scanning, assessment, and control functions. The idea is that none of these three can afford to work in a silo anymore — they have to run together. Operations </w:t>
-      </w:r>
-      <w:proofErr w:type="gramStart"/>
+        <w:t xml:space="preserve"> — Development, Security, and Operations — are connected. Development covers writing code, putting different parts of the system together, and managing releases. Operations handles the infrastructure side of things, like keeping services available and making sure the system can handle the load it receives. Security is responsible for scanning, identifying </w:t>
+      </w:r>
       <w:r>
         <w:rPr>
           <w:lang w:val="en-IN"/>
         </w:rPr>
-        <w:t>brings</w:t>
-      </w:r>
-      <w:proofErr w:type="gramEnd"/>
-      <w:r>
-        <w:rPr>
-          <w:lang w:val="en-IN"/>
-        </w:rPr>
-        <w:t xml:space="preserve"> in monitoring, availability management, and scaling responsibilities. Security addresses scanning, assessment, and control. None of these three areas works in isolation under this model; the whole point is that they overlap and reinforce each other throughout the lifecycle</w:t>
+        <w:lastRenderedPageBreak/>
+        <w:t>risks, and putting controls in place. What the figure shows is that these three areas do not work one after another. They work at the same time and each one affects the others. That is the core idea — none of these three can be separated from the rest without the whole approach falling apart</w:t>
       </w:r>
       <w:r>
         <w:rPr>
@@ -914,8 +943,18 @@
           <w:szCs w:val="16"/>
           <w:lang w:val="en-US"/>
         </w:rPr>
-        <w:t>Fig. 1. DevSecOps</w:t>
-      </w:r>
+        <w:t xml:space="preserve">Fig. 1. </w:t>
+      </w:r>
+      <w:proofErr w:type="spellStart"/>
+      <w:r>
+        <w:rPr>
+          <w:sz w:val="16"/>
+          <w:szCs w:val="16"/>
+          <w:lang w:val="en-US"/>
+        </w:rPr>
+        <w:t>DevSecOps</w:t>
+      </w:r>
+      <w:proofErr w:type="spellEnd"/>
     </w:p>
     <w:p>
       <w:pPr>
@@ -928,22 +967,21 @@
         <w:rPr>
           <w:lang w:val="en-US"/>
         </w:rPr>
-        <w:lastRenderedPageBreak/>
-        <w:t xml:space="preserve">Automating these checks was the natural next step. Manual security reviews are slow and inconsistent, and they tend to become bottlenecks when teams are trying to ship frequently. Building automated checks directly into the pipeline means problems surface during development, not after the </w:t>
-      </w:r>
-      <w:proofErr w:type="gramStart"/>
+        <w:t xml:space="preserve">One of the main changes </w:t>
+      </w:r>
+      <w:proofErr w:type="spellStart"/>
       <w:r>
         <w:rPr>
           <w:lang w:val="en-US"/>
         </w:rPr>
-        <w:t>fact.The</w:t>
-      </w:r>
-      <w:proofErr w:type="gramEnd"/>
+        <w:t>DevSecOps</w:t>
+      </w:r>
+      <w:proofErr w:type="spellEnd"/>
       <w:r>
         <w:rPr>
           <w:lang w:val="en-US"/>
         </w:rPr>
-        <w:t xml:space="preserve"> framework described here works on two levels</w:t>
+        <w:t xml:space="preserve"> brings is automating security checks. Doing security reviews manually does not work well when a team is releasing software frequently. It takes too long, and the results are not always consistent from one review to the next. When checks are automated and built into the pipeline they run every time a build happens. They apply the same rules every time and the results come back quickly. If something is wrong the developer who wrote that code finds out while they are still working on that part of the system, not days or weeks later</w:t>
       </w:r>
       <w:r>
         <w:rPr>
@@ -963,12 +1001,54 @@
         <w:rPr>
           <w:lang w:val="en-US"/>
         </w:rPr>
-        <w:t>SonarQube examines the code itself, looking for weaknesses in how it is written. Once the application moves into a running or containerized state, OWASP ZAP and Trivy take over, each targeting a different layer of potential exposure</w:t>
-      </w:r>
-      <w:r>
+        <w:t>The framework put forward in this paper uses a set of tools that each handle a different part of the security work. SonarQube looks at the source code before anything is deployed. It checks for problems in how the code is written — things like patterns that are known to cause vulnerabilities or logic that does not meet quality standards. This happens early in the pipeline before the application is even running anywhere.</w:t>
+      </w:r>
+    </w:p>
+    <w:p>
+      <w:pPr>
+        <w:pStyle w:val="BodyText"/>
         <w:rPr>
           <w:lang w:val="en-US"/>
         </w:rPr>
+      </w:pPr>
+      <w:r>
+        <w:rPr>
+          <w:lang w:val="en-US"/>
+        </w:rPr>
+        <w:t xml:space="preserve">Once the application is running, two other tools come into play. OWASP ZAP tests the application while it is live by sending requests to it and looking at the responses. If something in the way the application responds suggests a vulnerability is present, OWASP ZAP picks that up. </w:t>
+      </w:r>
+      <w:proofErr w:type="spellStart"/>
+      <w:r>
+        <w:rPr>
+          <w:lang w:val="en-US"/>
+        </w:rPr>
+        <w:t>Trivy</w:t>
+      </w:r>
+      <w:proofErr w:type="spellEnd"/>
+      <w:r>
+        <w:rPr>
+          <w:lang w:val="en-US"/>
+        </w:rPr>
+        <w:t xml:space="preserve"> works differently — it looks at the container image and checks its components against a list of known vulnerabilities. These two tools cover different things. OWASP ZAP is focused on how the application behaves when it is running. </w:t>
+      </w:r>
+      <w:proofErr w:type="spellStart"/>
+      <w:r>
+        <w:rPr>
+          <w:lang w:val="en-US"/>
+        </w:rPr>
+        <w:t>Trivy</w:t>
+      </w:r>
+      <w:proofErr w:type="spellEnd"/>
+      <w:r>
+        <w:rPr>
+          <w:lang w:val="en-US"/>
+        </w:rPr>
+        <w:t xml:space="preserve"> is focused on what the container image contains. Using both means more is covered than either tool could manage on its own</w:t>
+      </w:r>
+      <w:r>
+        <w:rPr>
+          <w:lang w:val="en-US"/>
+        </w:rPr>
         <w:t>.</w:t>
       </w:r>
     </w:p>
@@ -983,7 +1063,13 @@
         <w:rPr>
           <w:lang w:val="en-US"/>
         </w:rPr>
-        <w:t>Prometheus and Grafana sit on top of all this, keeping an eye on the system as it runs. Rather than discovering something went wrong only after users report it, Grafana dashboards surface metric changes as they occur, giving the team a fighting chance to respond before things escalate.</w:t>
+        <w:t>Prometheus and Grafana handle monitoring once everything is deployed. Prometheus collects data from the running system — things like how fast it is responding, how many errors are occurring, and how much of its resources it is using. Grafana takes that data and displays it in dashboards that are easy to read. If something starts going wrong the dashboards show it straight away. This matters because catching a problem early — while it is just starting — is much easier to deal with than finding out about it after it has already affected users</w:t>
+      </w:r>
+      <w:r>
+        <w:rPr>
+          <w:lang w:val="en-US"/>
+        </w:rPr>
+        <w:t>.</w:t>
       </w:r>
     </w:p>
     <w:p>
@@ -997,7 +1083,13 @@
         <w:rPr>
           <w:lang w:val="en-US"/>
         </w:rPr>
-        <w:t>Put together, this is a setup where security becomes a natural part of daily development work rather than a separate phase that slows everything down. Finding an issue on day two is a very different problem from finding it a week before release — the earlier it comes up, the cheaper and faster it is to deal with.</w:t>
+        <w:t>The overall point of putting all of this together is that security stops being something that only happens at certain points and becomes something that is always running in the background. A problem found early in development is a small issue. The same problem found right before a release is a much bigger one. This framework is built around the idea that finding problems early is not just better practice — it actually saves time, reduces cost, and makes the whole development process less stressful</w:t>
+      </w:r>
+      <w:r>
+        <w:rPr>
+          <w:lang w:val="en-US"/>
+        </w:rPr>
+        <w:t>.</w:t>
       </w:r>
     </w:p>
     <w:p>
@@ -1028,7 +1120,35 @@
         <w:rPr>
           <w:rFonts w:eastAsia="Times New Roman"/>
         </w:rPr>
-        <w:t>Security being pushed to the sidelines in DevOps pipelines was a problem early DevSecOps researchers kept running into. Nikolov and Aleksieva-Petrova (2023) took this problem into a Jenkins environment, testing out Snyk and OWASP ZAP at a few key points throughout the pipeline to get a clearer picture of where security checks actually held up. Their findings confirmed that pre-deployment vulnerability detection was doable, but the work stopped short of addressing container security or any form of ongoing system monitoring</w:t>
+        <w:t xml:space="preserve">One thing early </w:t>
+      </w:r>
+      <w:proofErr w:type="spellStart"/>
+      <w:r>
+        <w:rPr>
+          <w:rFonts w:eastAsia="Times New Roman"/>
+        </w:rPr>
+        <w:t>DevSecOps</w:t>
+      </w:r>
+      <w:proofErr w:type="spellEnd"/>
+      <w:r>
+        <w:rPr>
+          <w:rFonts w:eastAsia="Times New Roman"/>
+        </w:rPr>
+        <w:t xml:space="preserve"> research kept bringing up was that security was getting pushed to the side inside DevOps pipelines. It was not being ignored completely, but it was clearly not being treated as a priority either. Nikolov and Aleksieva-Petrova (2023) wanted to look at this more closely and chose Jenkins as their environment. They put </w:t>
+      </w:r>
+      <w:proofErr w:type="spellStart"/>
+      <w:r>
+        <w:rPr>
+          <w:rFonts w:eastAsia="Times New Roman"/>
+        </w:rPr>
+        <w:t>Snyk</w:t>
+      </w:r>
+      <w:proofErr w:type="spellEnd"/>
+      <w:r>
+        <w:rPr>
+          <w:rFonts w:eastAsia="Times New Roman"/>
+        </w:rPr>
+        <w:t xml:space="preserve"> and OWASP ZAP into the pipeline at various points. The idea was to check which stages were actually picking up security issues and which ones were missing them. Finding vulnerabilities before deployment was shown to be possible, which was a useful outcome. That said, container security was not part of what they looked at, and nothing was set up to monitor the system after it went live</w:t>
       </w:r>
       <w:r>
         <w:rPr>
@@ -1061,7 +1181,35 @@
         <w:rPr>
           <w:rFonts w:eastAsia="Times New Roman"/>
         </w:rPr>
-        <w:t>In another work, Marandi et al. In one work from 2023, Snyk was used along with StackHawk in a GitHub Actions pipeline with Docker. They also added dashboards and some level of automation for fixing issues, so manual work was reduced. But still, container scanning and runtime monitoring were not really included in that setup.</w:t>
+        <w:t xml:space="preserve">Marandi et al. (2023) took a different approach entirely. Rather than Jenkins they used GitHub Actions as the base for their pipeline. </w:t>
+      </w:r>
+      <w:proofErr w:type="spellStart"/>
+      <w:r>
+        <w:rPr>
+          <w:rFonts w:eastAsia="Times New Roman"/>
+        </w:rPr>
+        <w:t>Snyk</w:t>
+      </w:r>
+      <w:proofErr w:type="spellEnd"/>
+      <w:r>
+        <w:rPr>
+          <w:rFonts w:eastAsia="Times New Roman"/>
+        </w:rPr>
+        <w:t xml:space="preserve"> and </w:t>
+      </w:r>
+      <w:proofErr w:type="spellStart"/>
+      <w:r>
+        <w:rPr>
+          <w:rFonts w:eastAsia="Times New Roman"/>
+        </w:rPr>
+        <w:t>StackHawk</w:t>
+      </w:r>
+      <w:proofErr w:type="spellEnd"/>
+      <w:r>
+        <w:rPr>
+          <w:rFonts w:eastAsia="Times New Roman"/>
+        </w:rPr>
+        <w:t xml:space="preserve"> were the tools they worked with, and Docker was running alongside everything. They did not stop at just scanning either — dashboards were added and parts of the remediation process were automated, so when issues came up the team had less manual work to get through. Even with those additions though, scanning container images and watching the runtime environment were still not covered.</w:t>
       </w:r>
     </w:p>
     <w:p>
@@ -1082,43 +1230,55 @@
         <w:rPr>
           <w:rFonts w:eastAsia="Times New Roman"/>
         </w:rPr>
-        <w:t>After that, more focus shifted towards</w:t>
-      </w:r>
-      <w:r>
-        <w:rPr>
-          <w:rFonts w:eastAsia="Times New Roman"/>
-        </w:rPr>
-        <w:t xml:space="preserve"> </w:t>
-      </w:r>
-      <w:r>
-        <w:rPr>
-          <w:rFonts w:eastAsia="Times New Roman"/>
-        </w:rPr>
-        <w:t>the problems faced while actually applying DevSecOps.</w:t>
-      </w:r>
-      <w:r>
-        <w:rPr>
-          <w:rFonts w:eastAsia="Times New Roman"/>
-        </w:rPr>
-        <w:t xml:space="preserve"> </w:t>
-      </w:r>
-      <w:r>
-        <w:rPr>
-          <w:rFonts w:eastAsia="Times New Roman"/>
-        </w:rPr>
-        <w:t xml:space="preserve">Nayanajith and Wickramarachchi (2024) mentioned that issues like lack of skills, resistance from teams, and communication gaps were quite common. These were not mainly technical problems, but more about how teams coordinate and </w:t>
-      </w:r>
-      <w:r>
-        <w:rPr>
-          <w:rFonts w:eastAsia="Times New Roman"/>
-        </w:rPr>
-        <w:t>operate together in</w:t>
-      </w:r>
-      <w:r>
-        <w:rPr>
-          <w:rFonts w:eastAsia="Times New Roman"/>
-        </w:rPr>
-        <w:t xml:space="preserve"> practice.</w:t>
+        <w:t xml:space="preserve">Around this same period some researchers started looking beyond the technical side of things. </w:t>
+      </w:r>
+      <w:proofErr w:type="spellStart"/>
+      <w:r>
+        <w:rPr>
+          <w:rFonts w:eastAsia="Times New Roman"/>
+        </w:rPr>
+        <w:t>Nayanajith</w:t>
+      </w:r>
+      <w:proofErr w:type="spellEnd"/>
+      <w:r>
+        <w:rPr>
+          <w:rFonts w:eastAsia="Times New Roman"/>
+        </w:rPr>
+        <w:t xml:space="preserve"> and Wickramarachchi (2024) found that the biggest obstacles teams were hitting during </w:t>
+      </w:r>
+      <w:proofErr w:type="spellStart"/>
+      <w:r>
+        <w:rPr>
+          <w:rFonts w:eastAsia="Times New Roman"/>
+        </w:rPr>
+        <w:t>DevSecOps</w:t>
+      </w:r>
+      <w:proofErr w:type="spellEnd"/>
+      <w:r>
+        <w:rPr>
+          <w:rFonts w:eastAsia="Times New Roman"/>
+        </w:rPr>
+        <w:t xml:space="preserve"> adoption were not really about which tools to pick or how to configure them. Skill gaps were a common issue, and so was resistance from team members who were not comfortable changing the way they had always done things. On top of that, different groups within the same </w:t>
+      </w:r>
+      <w:proofErr w:type="spellStart"/>
+      <w:r>
+        <w:rPr>
+          <w:rFonts w:eastAsia="Times New Roman"/>
+        </w:rPr>
+        <w:t>organisation</w:t>
+      </w:r>
+      <w:proofErr w:type="spellEnd"/>
+      <w:r>
+        <w:rPr>
+          <w:rFonts w:eastAsia="Times New Roman"/>
+        </w:rPr>
+        <w:t xml:space="preserve"> were often not communicating well with each other. Fixing the technical setup was the easier part of the problem — shifting how people actually worked and collaborated on a daily basis was where things got genuinely difficult</w:t>
+      </w:r>
+      <w:r>
+        <w:rPr>
+          <w:rFonts w:eastAsia="Times New Roman"/>
+        </w:rPr>
+        <w:t>.</w:t>
       </w:r>
     </w:p>
     <w:p>
@@ -1139,43 +1299,13 @@
         <w:rPr>
           <w:rFonts w:eastAsia="Times New Roman"/>
         </w:rPr>
-        <w:t xml:space="preserve">Bautista Ramos and Yoo (2025) looked at many research papers and discussed different kinds of vulnerabilities along with possible ways to handle them. They also mentioned that a lot of </w:t>
-      </w:r>
-      <w:r>
-        <w:rPr>
-          <w:rFonts w:eastAsia="Times New Roman"/>
-        </w:rPr>
-        <w:t>these works were not evaluated</w:t>
-      </w:r>
-      <w:r>
-        <w:rPr>
-          <w:rFonts w:eastAsia="Times New Roman"/>
-        </w:rPr>
-        <w:t xml:space="preserve"> </w:t>
-      </w:r>
-      <w:r>
-        <w:rPr>
-          <w:rFonts w:eastAsia="Times New Roman"/>
-        </w:rPr>
-        <w:t xml:space="preserve">in real environments, so </w:t>
-      </w:r>
-      <w:r>
-        <w:rPr>
-          <w:rFonts w:eastAsia="Times New Roman"/>
-        </w:rPr>
-        <w:t>it is difficult to know how they would</w:t>
-      </w:r>
-      <w:r>
-        <w:rPr>
-          <w:rFonts w:eastAsia="Times New Roman"/>
-        </w:rPr>
-        <w:t xml:space="preserve"> </w:t>
-      </w:r>
-      <w:r>
-        <w:rPr>
-          <w:rFonts w:eastAsia="Times New Roman"/>
-        </w:rPr>
-        <w:t>work in actual use.</w:t>
+        <w:t>Bautista Ramos and Yoo (2025) took a step back from looking at any one specific case. Their work covered a broad range of already published studies, going through them to build up a general picture of what the research in this area actually looked like. What kinds of vulnerabilities were showing up most often across the literature, and what were researchers actually proposing to deal with them — those were the questions they were trying to answer. One thing that stood out from their review was that a lot of the research they looked at had never actually been tested outside of controlled settings. That is a real limitation because it leaves open the question of how any of it would hold up in a live environment where conditions are messier and less predictable</w:t>
+      </w:r>
+      <w:r>
+        <w:rPr>
+          <w:rFonts w:eastAsia="Times New Roman"/>
+        </w:rPr>
+        <w:t>.</w:t>
       </w:r>
     </w:p>
     <w:p>
@@ -1190,13 +1320,19 @@
         <w:rPr>
           <w:rFonts w:eastAsia="Times New Roman"/>
         </w:rPr>
-        <w:t xml:space="preserve">     </w:t>
-      </w:r>
-      <w:r>
-        <w:rPr>
-          <w:rFonts w:eastAsia="Times New Roman"/>
-        </w:rPr>
-        <w:t>Some recent studies have explored</w:t>
+        <w:t>Some studies that came out more recently started putting Jenkins, Docker, and Kubernetes together in the same pipeline and adding Prometheus and Grafana on top. Security was still part of the focus but so was overall system performance. Having Prometheus collecting data and Grafana displaying it meant teams could actually see what was going on with their systems after deployment rather than finding out something was wrong only after users started reporting problems</w:t>
+      </w:r>
+      <w:r>
+        <w:rPr>
+          <w:rFonts w:eastAsia="Times New Roman"/>
+        </w:rPr>
+        <w:t xml:space="preserve">. </w:t>
+      </w:r>
+      <w:r>
+        <w:rPr>
+          <w:rFonts w:eastAsia="Times New Roman"/>
+        </w:rPr>
+        <w:t>It was further</w:t>
       </w:r>
       <w:r>
         <w:rPr>
@@ -1208,21 +1344,33 @@
         <w:rPr>
           <w:rFonts w:eastAsia="Times New Roman"/>
         </w:rPr>
-        <w:t xml:space="preserve">more on practical pipeline setups. In one such case, tools like Jenkins, Docker, and Kubernetes were used together with Prometheus and Grafana to improve both system performance and monitoring in CI/CD </w:t>
-      </w:r>
-      <w:proofErr w:type="gramStart"/>
-      <w:r>
-        <w:rPr>
-          <w:rFonts w:eastAsia="Times New Roman"/>
-        </w:rPr>
-        <w:t>pipelines .</w:t>
-      </w:r>
-      <w:proofErr w:type="gramEnd"/>
-      <w:r>
-        <w:rPr>
-          <w:rFonts w:eastAsia="Times New Roman"/>
-        </w:rPr>
-        <w:t xml:space="preserve"> It was also noted that Trivy can be used to check container-related issues.</w:t>
+        <w:t xml:space="preserve">noted that </w:t>
+      </w:r>
+      <w:proofErr w:type="spellStart"/>
+      <w:r>
+        <w:rPr>
+          <w:rFonts w:eastAsia="Times New Roman"/>
+        </w:rPr>
+        <w:t>Trivy</w:t>
+      </w:r>
+      <w:proofErr w:type="spellEnd"/>
+      <w:r>
+        <w:rPr>
+          <w:rFonts w:eastAsia="Times New Roman"/>
+        </w:rPr>
+        <w:t xml:space="preserve"> </w:t>
+      </w:r>
+      <w:r>
+        <w:rPr>
+          <w:rFonts w:eastAsia="Times New Roman"/>
+        </w:rPr>
+        <w:t>helps to check</w:t>
+      </w:r>
+      <w:r>
+        <w:rPr>
+          <w:rFonts w:eastAsia="Times New Roman"/>
+        </w:rPr>
+        <w:t xml:space="preserve"> container-related issues.</w:t>
       </w:r>
     </w:p>
     <w:p>
@@ -1243,20 +1391,27 @@
         <w:rPr>
           <w:rFonts w:eastAsia="Times New Roman"/>
         </w:rPr>
-        <w:t xml:space="preserve">In DevSecOps, some studies follow the CAMS model. </w:t>
-      </w:r>
-      <w:r>
-        <w:rPr>
-          <w:rFonts w:eastAsia="Times New Roman"/>
-        </w:rPr>
-        <w:t xml:space="preserve">This mainly includes culture, automation, measurement and </w:t>
-      </w:r>
-      <w:proofErr w:type="gramStart"/>
-      <w:r>
-        <w:rPr>
-          <w:rFonts w:eastAsia="Times New Roman"/>
-        </w:rPr>
-        <w:t>sharing.</w:t>
+        <w:t xml:space="preserve">In </w:t>
+      </w:r>
+      <w:proofErr w:type="spellStart"/>
+      <w:r>
+        <w:rPr>
+          <w:rFonts w:eastAsia="Times New Roman"/>
+        </w:rPr>
+        <w:t>DevSecOps</w:t>
+      </w:r>
+      <w:proofErr w:type="spellEnd"/>
+      <w:r>
+        <w:rPr>
+          <w:rFonts w:eastAsia="Times New Roman"/>
+        </w:rPr>
+        <w:t xml:space="preserve">, some studies follow the CAMS model. </w:t>
+      </w:r>
+      <w:r>
+        <w:rPr>
+          <w:rFonts w:eastAsia="Times New Roman"/>
+        </w:rPr>
+        <w:t>This mainly includes culture, automation, measurement and sharing.</w:t>
       </w:r>
       <w:r>
         <w:rPr>
@@ -1264,7 +1419,6 @@
         </w:rPr>
         <w:t>.</w:t>
       </w:r>
-      <w:proofErr w:type="gramEnd"/>
       <w:r>
         <w:rPr>
           <w:rFonts w:eastAsia="Times New Roman"/>
@@ -1281,7 +1435,21 @@
         <w:rPr>
           <w:rFonts w:eastAsia="Times New Roman"/>
         </w:rPr>
-        <w:t xml:space="preserve"> when applying DevSecOps in real situations </w:t>
+        <w:t xml:space="preserve"> when applying </w:t>
+      </w:r>
+      <w:proofErr w:type="spellStart"/>
+      <w:r>
+        <w:rPr>
+          <w:rFonts w:eastAsia="Times New Roman"/>
+        </w:rPr>
+        <w:t>DevSecOps</w:t>
+      </w:r>
+      <w:proofErr w:type="spellEnd"/>
+      <w:r>
+        <w:rPr>
+          <w:rFonts w:eastAsia="Times New Roman"/>
+        </w:rPr>
+        <w:t xml:space="preserve"> in real situations </w:t>
       </w:r>
       <w:r>
         <w:rPr>
@@ -1299,7 +1467,21 @@
         <w:rPr>
           <w:rFonts w:eastAsia="Times New Roman"/>
         </w:rPr>
-        <w:t>use DevSecOps in</w:t>
+        <w:t xml:space="preserve">use </w:t>
+      </w:r>
+      <w:proofErr w:type="spellStart"/>
+      <w:r>
+        <w:rPr>
+          <w:rFonts w:eastAsia="Times New Roman"/>
+        </w:rPr>
+        <w:t>DevSecOps</w:t>
+      </w:r>
+      <w:proofErr w:type="spellEnd"/>
+      <w:r>
+        <w:rPr>
+          <w:rFonts w:eastAsia="Times New Roman"/>
+        </w:rPr>
+        <w:t xml:space="preserve"> in</w:t>
       </w:r>
       <w:r>
         <w:rPr>
@@ -1323,26 +1505,35 @@
         <w:rPr>
           <w:rFonts w:eastAsia="Times New Roman"/>
         </w:rPr>
-        <w:t xml:space="preserve">applying DevSecOps in real environments. It </w:t>
-      </w:r>
-      <w:r>
-        <w:rPr>
-          <w:rFonts w:eastAsia="Times New Roman"/>
-        </w:rPr>
-        <w:t>showed that these factors affect</w:t>
-      </w:r>
-      <w:r>
-        <w:rPr>
-          <w:rFonts w:eastAsia="Times New Roman"/>
-        </w:rPr>
-        <w:t xml:space="preserve"> an effect </w:t>
-      </w:r>
-      <w:proofErr w:type="gramStart"/>
-      <w:r>
-        <w:rPr>
-          <w:rFonts w:eastAsia="Times New Roman"/>
-        </w:rPr>
-        <w:t>on</w:t>
+        <w:t xml:space="preserve">applying </w:t>
+      </w:r>
+      <w:proofErr w:type="spellStart"/>
+      <w:r>
+        <w:rPr>
+          <w:rFonts w:eastAsia="Times New Roman"/>
+        </w:rPr>
+        <w:t>DevSecOps</w:t>
+      </w:r>
+      <w:proofErr w:type="spellEnd"/>
+      <w:r>
+        <w:rPr>
+          <w:rFonts w:eastAsia="Times New Roman"/>
+        </w:rPr>
+        <w:t xml:space="preserve"> in real environments. It </w:t>
+      </w:r>
+      <w:proofErr w:type="spellStart"/>
+      <w:r>
+        <w:rPr>
+          <w:rFonts w:eastAsia="Times New Roman"/>
+        </w:rPr>
+        <w:t>It</w:t>
+      </w:r>
+      <w:proofErr w:type="spellEnd"/>
+      <w:r>
+        <w:rPr>
+          <w:rFonts w:eastAsia="Times New Roman"/>
+        </w:rPr>
+        <w:t xml:space="preserve"> showed that these factors influence</w:t>
       </w:r>
       <w:r>
         <w:rPr>
@@ -1354,29 +1545,40 @@
         <w:rPr>
           <w:rFonts w:eastAsia="Times New Roman"/>
         </w:rPr>
-        <w:t xml:space="preserve"> a</w:t>
-      </w:r>
-      <w:proofErr w:type="gramEnd"/>
-      <w:r>
-        <w:rPr>
-          <w:rFonts w:eastAsia="Times New Roman"/>
-        </w:rPr>
-        <w:t xml:space="preserve"> strong effect on</w:t>
-      </w:r>
-      <w:r>
-        <w:rPr>
-          <w:rFonts w:eastAsia="Times New Roman"/>
-        </w:rPr>
-        <w:t xml:space="preserve"> successfully applying DevSecOps in real </w:t>
-      </w:r>
-      <w:proofErr w:type="gramStart"/>
-      <w:r>
-        <w:rPr>
-          <w:rFonts w:eastAsia="Times New Roman"/>
-        </w:rPr>
-        <w:t>environments .</w:t>
-      </w:r>
-      <w:proofErr w:type="gramEnd"/>
+        <w:t>an effect on</w:t>
+      </w:r>
+      <w:r>
+        <w:rPr>
+          <w:rFonts w:eastAsia="Times New Roman"/>
+        </w:rPr>
+        <w:t xml:space="preserve"> </w:t>
+      </w:r>
+      <w:r>
+        <w:rPr>
+          <w:rFonts w:eastAsia="Times New Roman"/>
+        </w:rPr>
+        <w:t xml:space="preserve"> a strong effect on</w:t>
+      </w:r>
+      <w:r>
+        <w:rPr>
+          <w:rFonts w:eastAsia="Times New Roman"/>
+        </w:rPr>
+        <w:t xml:space="preserve"> successfully applying </w:t>
+      </w:r>
+      <w:proofErr w:type="spellStart"/>
+      <w:r>
+        <w:rPr>
+          <w:rFonts w:eastAsia="Times New Roman"/>
+        </w:rPr>
+        <w:t>DevSecOps</w:t>
+      </w:r>
+      <w:proofErr w:type="spellEnd"/>
+      <w:r>
+        <w:rPr>
+          <w:rFonts w:eastAsia="Times New Roman"/>
+        </w:rPr>
+        <w:t xml:space="preserve"> in real environments.</w:t>
+      </w:r>
     </w:p>
     <w:p>
       <w:pPr>
@@ -1396,31 +1598,13 @@
         <w:rPr>
           <w:rFonts w:eastAsia="Times New Roman"/>
         </w:rPr>
-        <w:t>Also, some studies</w:t>
+        <w:t>Some studies have also looked at</w:t>
       </w:r>
       <w:r>
         <w:rPr>
           <w:rFonts w:eastAsia="Times New Roman"/>
         </w:rPr>
         <w:t xml:space="preserve"> </w:t>
-      </w:r>
-      <w:r>
-        <w:rPr>
-          <w:rFonts w:eastAsia="Times New Roman"/>
-        </w:rPr>
-        <w:t>have</w:t>
-      </w:r>
-      <w:r>
-        <w:rPr>
-          <w:rFonts w:eastAsia="Times New Roman"/>
-        </w:rPr>
-        <w:t xml:space="preserve"> </w:t>
-      </w:r>
-      <w:r>
-        <w:rPr>
-          <w:rFonts w:eastAsia="Times New Roman"/>
-        </w:rPr>
-        <w:t xml:space="preserve">looked at </w:t>
       </w:r>
       <w:r>
         <w:rPr>
@@ -1471,7 +1655,21 @@
         <w:rPr>
           <w:rFonts w:eastAsia="Times New Roman"/>
         </w:rPr>
-        <w:t>From these studies, it is observed that DevSecOps is improving, but some gaps still remain. From these studies, it appears that many works focus only on specific parts such as scanning or monitoring, but do not cover the complete pipeline.</w:t>
+        <w:t xml:space="preserve">From these studies, it is observed that </w:t>
+      </w:r>
+      <w:proofErr w:type="spellStart"/>
+      <w:r>
+        <w:rPr>
+          <w:rFonts w:eastAsia="Times New Roman"/>
+        </w:rPr>
+        <w:t>DevSecOps</w:t>
+      </w:r>
+      <w:proofErr w:type="spellEnd"/>
+      <w:r>
+        <w:rPr>
+          <w:rFonts w:eastAsia="Times New Roman"/>
+        </w:rPr>
+        <w:t xml:space="preserve"> is improving, but some gaps still remain. From these studies, it appears that many works focus only on specific parts such as scanning or monitoring, but do not cover the complete pipeline.</w:t>
       </w:r>
     </w:p>
     <w:p>
@@ -1493,7 +1691,21 @@
         <w:rPr>
           <w:rFonts w:eastAsia="Times New Roman"/>
         </w:rPr>
-        <w:t>Looking across these studies, a pattern becomes clear — most of them tackle one or two pieces of the pipeline rather than treating it as a whole. This work takes a different angle by connecting those pieces into something more complete. Static testing, dynamic testing, container scanning through Trivy, and continuous monitoring via Prometheus and Grafana are all brought into a single pipeline rather than handled separately</w:t>
+        <w:t xml:space="preserve">Looking across these studies, a pattern becomes clear — most of them tackle one or two pieces of the pipeline rather than treating it as a whole. This work takes a different angle by connecting those pieces into something more complete. Static testing, dynamic testing, container scanning through </w:t>
+      </w:r>
+      <w:proofErr w:type="spellStart"/>
+      <w:r>
+        <w:rPr>
+          <w:rFonts w:eastAsia="Times New Roman"/>
+        </w:rPr>
+        <w:t>Trivy</w:t>
+      </w:r>
+      <w:proofErr w:type="spellEnd"/>
+      <w:r>
+        <w:rPr>
+          <w:rFonts w:eastAsia="Times New Roman"/>
+        </w:rPr>
+        <w:t>, and continuous monitoring via Prometheus and Grafana are all brought into a single pipeline rather than handled separately</w:t>
       </w:r>
       <w:r>
         <w:rPr>
@@ -1589,7 +1801,21 @@
         <w:rPr>
           <w:rFonts w:eastAsia="Times New Roman"/>
         </w:rPr>
-        <w:t>, organizations face problems when trying to use DevSecOps in actual projects.</w:t>
+        <w:t xml:space="preserve">, organizations face problems when trying to use </w:t>
+      </w:r>
+      <w:proofErr w:type="spellStart"/>
+      <w:r>
+        <w:rPr>
+          <w:rFonts w:eastAsia="Times New Roman"/>
+        </w:rPr>
+        <w:t>DevSecOps</w:t>
+      </w:r>
+      <w:proofErr w:type="spellEnd"/>
+      <w:r>
+        <w:rPr>
+          <w:rFonts w:eastAsia="Times New Roman"/>
+        </w:rPr>
+        <w:t xml:space="preserve"> in actual projects.</w:t>
       </w:r>
       <w:r>
         <w:rPr>
@@ -1597,19 +1823,11 @@
         </w:rPr>
         <w:t xml:space="preserve"> </w:t>
       </w:r>
-      <w:proofErr w:type="gramStart"/>
-      <w:r>
-        <w:rPr>
-          <w:rFonts w:eastAsia="Times New Roman"/>
-        </w:rPr>
-        <w:t>One</w:t>
-      </w:r>
-      <w:proofErr w:type="gramEnd"/>
-      <w:r>
-        <w:rPr>
-          <w:rFonts w:eastAsia="Times New Roman"/>
-        </w:rPr>
-        <w:t xml:space="preserve"> common issue is that security is usually taken care of at the final stage, which later creates extra work. </w:t>
+      <w:r>
+        <w:rPr>
+          <w:rFonts w:eastAsia="Times New Roman"/>
+        </w:rPr>
+        <w:t xml:space="preserve">One common issue is that security is usually taken care of at the final stage, which later creates extra work. </w:t>
       </w:r>
       <w:r>
         <w:rPr>
@@ -1644,7 +1862,25 @@
         <w:rPr>
           <w:rFonts w:eastAsia="Times New Roman"/>
         </w:rPr>
-        <w:t>Then there is the knowledge gap, which is its own separate headache. Most developers are not trained to think like security professionals, and security teams rarely have a deep enough feel for how development actually works day to day. That disconnect breeds isolation between the two sides, and when teams stop talking to each other properly, the cracks start showing up in the product itself.</w:t>
+        <w:t xml:space="preserve">Then there is the knowledge gap, which is its own separate headache. </w:t>
+      </w:r>
+      <w:r>
+        <w:rPr>
+          <w:rFonts w:eastAsia="Times New Roman"/>
+        </w:rPr>
+        <w:t>Many developers are not trained to</w:t>
+      </w:r>
+      <w:r>
+        <w:rPr>
+          <w:rFonts w:eastAsia="Times New Roman"/>
+        </w:rPr>
+        <w:t xml:space="preserve"> </w:t>
+      </w:r>
+      <w:r>
+        <w:rPr>
+          <w:rFonts w:eastAsia="Times New Roman"/>
+        </w:rPr>
+        <w:t>think like security professionals, and security teams rarely have a deep enough feel for how development actually works day to day. That disconnect breeds isolation between the two sides, and when teams stop talking to each other properly, the cracks start showing up in the product itself.</w:t>
       </w:r>
     </w:p>
     <w:p>
@@ -1665,27 +1901,13 @@
         <w:rPr>
           <w:rFonts w:eastAsia="Times New Roman"/>
         </w:rPr>
-        <w:t xml:space="preserve">In our work, we tried to avoid these problems by adding security checks directly into the pipeline </w:t>
-      </w:r>
-      <w:proofErr w:type="gramStart"/>
-      <w:r>
-        <w:rPr>
-          <w:rFonts w:eastAsia="Times New Roman"/>
-        </w:rPr>
-        <w:t xml:space="preserve">so </w:t>
-      </w:r>
-      <w:r>
-        <w:rPr>
-          <w:rFonts w:eastAsia="Times New Roman"/>
-        </w:rPr>
-        <w:t xml:space="preserve"> they</w:t>
-      </w:r>
-      <w:proofErr w:type="gramEnd"/>
-      <w:r>
-        <w:rPr>
-          <w:rFonts w:eastAsia="Times New Roman"/>
-        </w:rPr>
-        <w:t xml:space="preserve"> run together with</w:t>
+        <w:t xml:space="preserve">In our work, we tried to avoid these problems by adding security checks directly into the pipeline so </w:t>
+      </w:r>
+      <w:r>
+        <w:rPr>
+          <w:rFonts w:eastAsia="Times New Roman"/>
+        </w:rPr>
+        <w:t xml:space="preserve"> they run together with</w:t>
       </w:r>
       <w:r>
         <w:rPr>
@@ -1839,14 +2061,14 @@
         </w:rPr>
         <w:t xml:space="preserve">The system works in a continuous manner where the flow is not </w:t>
       </w:r>
-      <w:proofErr w:type="gramStart"/>
+      <w:proofErr w:type="spellStart"/>
       <w:r>
         <w:rPr>
           <w:rFonts w:eastAsia="Times New Roman"/>
         </w:rPr>
         <w:t>interrupted.Code</w:t>
       </w:r>
-      <w:proofErr w:type="gramEnd"/>
+      <w:proofErr w:type="spellEnd"/>
       <w:r>
         <w:rPr>
           <w:rFonts w:eastAsia="Times New Roman"/>
@@ -1866,7 +2088,25 @@
         <w:rPr>
           <w:rFonts w:eastAsia="Times New Roman"/>
         </w:rPr>
-        <w:t>4) Different Levels of Checking</w:t>
+        <w:t xml:space="preserve">4) </w:t>
+      </w:r>
+      <w:r>
+        <w:rPr>
+          <w:rFonts w:eastAsia="Times New Roman"/>
+        </w:rPr>
+        <w:t>Multiple levels of</w:t>
+      </w:r>
+      <w:r>
+        <w:rPr>
+          <w:rFonts w:eastAsia="Times New Roman"/>
+        </w:rPr>
+        <w:t xml:space="preserve"> </w:t>
+      </w:r>
+      <w:r>
+        <w:rPr>
+          <w:rFonts w:eastAsia="Times New Roman"/>
+        </w:rPr>
+        <w:t>Checking</w:t>
       </w:r>
     </w:p>
     <w:p>
@@ -1887,21 +2127,37 @@
         <w:rPr>
           <w:rFonts w:eastAsia="Times New Roman"/>
         </w:rPr>
-        <w:t xml:space="preserve">Security is checked in more than one </w:t>
-      </w:r>
-      <w:proofErr w:type="gramStart"/>
-      <w:r>
-        <w:rPr>
-          <w:rFonts w:eastAsia="Times New Roman"/>
-        </w:rPr>
-        <w:t>way.Checking</w:t>
-      </w:r>
-      <w:proofErr w:type="gramEnd"/>
-      <w:r>
-        <w:rPr>
-          <w:rFonts w:eastAsia="Times New Roman"/>
-        </w:rPr>
-        <w:t xml:space="preserve"> is done in stages. First the code is checked, then the application, and later the running system is verified.</w:t>
+        <w:t xml:space="preserve">Security is checked in </w:t>
+      </w:r>
+      <w:r>
+        <w:rPr>
+          <w:rFonts w:eastAsia="Times New Roman"/>
+        </w:rPr>
+        <w:t>more than a single</w:t>
+      </w:r>
+      <w:r>
+        <w:rPr>
+          <w:rFonts w:eastAsia="Times New Roman"/>
+        </w:rPr>
+        <w:t xml:space="preserve"> </w:t>
+      </w:r>
+      <w:r>
+        <w:rPr>
+          <w:rFonts w:eastAsia="Times New Roman"/>
+        </w:rPr>
+        <w:t>way.</w:t>
+      </w:r>
+      <w:r>
+        <w:rPr>
+          <w:rFonts w:eastAsia="Times New Roman"/>
+        </w:rPr>
+        <w:t xml:space="preserve"> </w:t>
+      </w:r>
+      <w:r>
+        <w:rPr>
+          <w:rFonts w:eastAsia="Times New Roman"/>
+        </w:rPr>
+        <w:t>Checking is done in stages. First the code is checked, then the application, and later the running system is verified.</w:t>
       </w:r>
     </w:p>
     <w:p>
@@ -2090,21 +2346,7 @@
         <w:rPr>
           <w:rFonts w:eastAsia="Times New Roman"/>
         </w:rPr>
-        <w:t xml:space="preserve">Using this approach, the system becomes more secure and simpler to manage. Issues can be noticed earlier, and </w:t>
-      </w:r>
-      <w:proofErr w:type="gramStart"/>
-      <w:r>
-        <w:rPr>
-          <w:rFonts w:eastAsia="Times New Roman"/>
-        </w:rPr>
-        <w:t>overall</w:t>
-      </w:r>
-      <w:proofErr w:type="gramEnd"/>
-      <w:r>
-        <w:rPr>
-          <w:rFonts w:eastAsia="Times New Roman"/>
-        </w:rPr>
-        <w:t xml:space="preserve"> the process becomes easier to deal with.</w:t>
+        <w:t>Using this approach, the system becomes more secure and simpler to manage. Issues can be noticed earlier, and overall the process becomes easier to deal with.</w:t>
       </w:r>
     </w:p>
     <w:p>
@@ -2554,7 +2796,40 @@
           <w:szCs w:val="20"/>
           <w:lang w:eastAsia="x-none"/>
         </w:rPr>
-        <w:t>The pipeline as a whole follows a logical order where one stage naturally leads into the next. Security does not wait to be invited in at the end — it has a role at each step along the way. Because of that, problems tend to surface while they are still small, which makes addressing them far less disruptive to the overall development work</w:t>
+        <w:t xml:space="preserve">The pipeline as a whole follows a logical order where one stage naturally leads into the next. Security does not wait to be invited in at the end — it has a role at each step along the way. Because of that, problems tend to </w:t>
+      </w:r>
+      <w:r>
+        <w:rPr>
+          <w:bCs/>
+          <w:color w:val="000000" w:themeColor="text1"/>
+          <w:spacing w:val="-1"/>
+          <w:sz w:val="20"/>
+          <w:szCs w:val="20"/>
+          <w:lang w:eastAsia="x-none"/>
+        </w:rPr>
+        <w:t>appear while they are still</w:t>
+      </w:r>
+      <w:r>
+        <w:rPr>
+          <w:bCs/>
+          <w:color w:val="000000" w:themeColor="text1"/>
+          <w:spacing w:val="-1"/>
+          <w:sz w:val="20"/>
+          <w:szCs w:val="20"/>
+          <w:lang w:eastAsia="x-none"/>
+        </w:rPr>
+        <w:t xml:space="preserve"> </w:t>
+      </w:r>
+      <w:r>
+        <w:rPr>
+          <w:bCs/>
+          <w:color w:val="000000" w:themeColor="text1"/>
+          <w:spacing w:val="-1"/>
+          <w:sz w:val="20"/>
+          <w:szCs w:val="20"/>
+          <w:lang w:eastAsia="x-none"/>
+        </w:rPr>
+        <w:t>small, which makes addressing them far less disruptive to the overall development work</w:t>
       </w:r>
       <w:r>
         <w:rPr>
@@ -2662,18 +2937,7 @@
           <w:szCs w:val="20"/>
           <w:lang w:eastAsia="x-none"/>
         </w:rPr>
-        <w:t>Everything kicks off when a developer pushes code to the Git repository. That action triggers the pipeline, and from there the code moves through an initial check where basic quality and syntax issues get flagged before anything else happens</w:t>
-      </w:r>
-      <w:r>
-        <w:rPr>
-          <w:bCs/>
-          <w:color w:val="000000" w:themeColor="text1"/>
-          <w:spacing w:val="-1"/>
-          <w:sz w:val="20"/>
-          <w:szCs w:val="20"/>
-          <w:lang w:eastAsia="x-none"/>
-        </w:rPr>
-        <w:t>.</w:t>
+        <w:t>The whole process starts when a developer pushes their code to the Git repository. That push is what triggers the pipeline to begin. Before anything else happens the code goes through an initial check where basic syntax problems and quality issues get caught early.</w:t>
       </w:r>
     </w:p>
     <w:p>
@@ -2713,7 +2977,7 @@
           <w:szCs w:val="20"/>
           <w:lang w:eastAsia="x-none"/>
         </w:rPr>
-        <w:t>The code then goes through the build process, after which a Docker image is put together from it. That image does not move forward unchecked — Trivy scans it first to look for vulnerabilities sitting inside the container itself</w:t>
+        <w:t>After that the code goes into the build stage. Once the build is done a Docker image gets created from it. That image does not just move straight to the next stage though — Trivy runs a scan on it first to check whether there are any known vulnerabilities hiding inside the container</w:t>
       </w:r>
       <w:r>
         <w:rPr>
@@ -2764,7 +3028,7 @@
           <w:szCs w:val="20"/>
           <w:lang w:eastAsia="x-none"/>
         </w:rPr>
-        <w:t>Kubernetes then picks up and deploys the application into a running environment. At this point OWASP ZAP gets involved, testing the application as it actually runs rather than analyzing it as plain code. This is where runtime-specific issues tend to come to the surface</w:t>
+        <w:t>Once that is done Kubernetes takes over and deploys the application so it is actually running. That is when OWASP ZAP comes into the picture. Rather than looking at the code as plain text the way earlier tools do, OWASP ZAP tests the application while it is live and running. Problems that only show up during runtime are what this stage is mainly trying to catch</w:t>
       </w:r>
       <w:r>
         <w:rPr>
@@ -2815,7 +3079,73 @@
           <w:szCs w:val="20"/>
           <w:lang w:eastAsia="x-none"/>
         </w:rPr>
-        <w:t>The final piece is ongoing monitoring. Prometheus collects performance data from the live system while Grafana presents it in a way that is easy to interpret. Together they make sure that anything unusual gets noticed quickly rather than going undetected. A summary of all the tools used across these stages is provided in Table I</w:t>
+        <w:t xml:space="preserve">The final piece is ongoing monitoring. Prometheus collects performance data from the live system while Grafana presents </w:t>
+      </w:r>
+      <w:r>
+        <w:rPr>
+          <w:bCs/>
+          <w:color w:val="000000" w:themeColor="text1"/>
+          <w:spacing w:val="-1"/>
+          <w:sz w:val="20"/>
+          <w:szCs w:val="20"/>
+          <w:lang w:eastAsia="x-none"/>
+        </w:rPr>
+        <w:t>it so that it is</w:t>
+      </w:r>
+      <w:r>
+        <w:rPr>
+          <w:bCs/>
+          <w:color w:val="000000" w:themeColor="text1"/>
+          <w:spacing w:val="-1"/>
+          <w:sz w:val="20"/>
+          <w:szCs w:val="20"/>
+          <w:lang w:eastAsia="x-none"/>
+        </w:rPr>
+        <w:t xml:space="preserve"> </w:t>
+      </w:r>
+      <w:r>
+        <w:rPr>
+          <w:bCs/>
+          <w:color w:val="000000" w:themeColor="text1"/>
+          <w:spacing w:val="-1"/>
+          <w:sz w:val="20"/>
+          <w:szCs w:val="20"/>
+          <w:lang w:eastAsia="x-none"/>
+        </w:rPr>
+        <w:t xml:space="preserve">easy to interpret. </w:t>
+      </w:r>
+      <w:r>
+        <w:rPr>
+          <w:bCs/>
+          <w:color w:val="000000" w:themeColor="text1"/>
+          <w:spacing w:val="-1"/>
+          <w:sz w:val="20"/>
+          <w:szCs w:val="20"/>
+          <w:lang w:eastAsia="x-none"/>
+        </w:rPr>
+        <w:t>Together, they help to ensure that</w:t>
+      </w:r>
+      <w:r>
+        <w:rPr>
+          <w:bCs/>
+          <w:color w:val="000000" w:themeColor="text1"/>
+          <w:spacing w:val="-1"/>
+          <w:sz w:val="20"/>
+          <w:szCs w:val="20"/>
+          <w:lang w:eastAsia="x-none"/>
+        </w:rPr>
+        <w:t xml:space="preserve"> </w:t>
+      </w:r>
+      <w:r>
+        <w:rPr>
+          <w:bCs/>
+          <w:color w:val="000000" w:themeColor="text1"/>
+          <w:spacing w:val="-1"/>
+          <w:sz w:val="20"/>
+          <w:szCs w:val="20"/>
+          <w:lang w:eastAsia="x-none"/>
+        </w:rPr>
+        <w:t>anything unusual gets noticed quickly rather than going undetected. A summary of all the tools used across these stages is provided in Table I</w:t>
       </w:r>
       <w:r>
         <w:rPr>
@@ -3868,7 +4198,15 @@
         </w:rPr>
       </w:pPr>
       <w:r>
-        <w:t>This work went through each phase of the DevSecOps pipeline individually, starting from the point where code first enters the system and following it all the way into production. The pipeline ran without interruption across all these stages, which itself confirmed that the integration held together under real conditions</w:t>
+        <w:t xml:space="preserve">This work went through each phase of the </w:t>
+      </w:r>
+      <w:proofErr w:type="spellStart"/>
+      <w:r>
+        <w:t>DevSecOps</w:t>
+      </w:r>
+      <w:proofErr w:type="spellEnd"/>
+      <w:r>
+        <w:t xml:space="preserve"> pipeline individually, starting from the point where code first enters the system and following it all the way into production. The pipeline ran without interruption across all these stages, which itself confirmed that the integration held together under real conditions</w:t>
       </w:r>
       <w:r>
         <w:rPr>
@@ -3888,13 +4226,22 @@
         <w:t xml:space="preserve">     </w:t>
       </w:r>
       <w:r>
-        <w:t xml:space="preserve">Starting with code verification made a noticeable difference — problems that would have otherwise traveled further down the line got caught early, leaving fewer things to deal with in later </w:t>
-      </w:r>
-      <w:proofErr w:type="gramStart"/>
+        <w:t xml:space="preserve">Starting with code verification made a noticeable difference — </w:t>
+      </w:r>
+      <w:r>
+        <w:t>problems that might otherwise</w:t>
+      </w:r>
+      <w:r>
+        <w:t xml:space="preserve"> </w:t>
+      </w:r>
+      <w:r>
+        <w:t xml:space="preserve">traveled further down the line got caught early, leaving fewer things to deal with in later </w:t>
+      </w:r>
+      <w:proofErr w:type="spellStart"/>
       <w:r>
         <w:t>stages.Container</w:t>
       </w:r>
-      <w:proofErr w:type="gramEnd"/>
+      <w:proofErr w:type="spellEnd"/>
       <w:r>
         <w:t xml:space="preserve"> images got scanned before anything was allowed to proceed, so whatever reached the deployment stage had already been checked and cleared — reducing the chances of something problematic slipping through that layer</w:t>
       </w:r>

</xml_diff>

<commit_message>
Revise Survey Paper to enhance clarity and focus on integrating security in DevSecOps pipelines
</commit_message>
<xml_diff>
--- a/Documentation/Survey Paper/Survey-paper1.docx
+++ b/Documentation/Survey Paper/Survey-paper1.docx
@@ -613,15 +613,23 @@
         <w:t xml:space="preserve"> </w:t>
       </w:r>
       <w:r>
-        <w:t xml:space="preserve">For a long time, development and operations were two separate worlds. Developers wrote code and passed it on. Operations dealt with whatever came next. The gap between them caused delays, miscommunication, and releases that took far longer than they should have. DevOps closed that gap. Teams started working as one unit, release speeds picked up, and the overall process became less painful for everyone involved. Security though was a different story. Nobody really pulled it into the conversation. It sat at the tail end of everything, reviewed late, often rushed, and by the time anyone looked closely the code had already been written and most choices had already been locked in. That approach held up for a while. Then applications started becoming bigger targets, breaches became more frequent, and leaving security until last started producing consequences that were hard to ignore. </w:t>
-      </w:r>
+        <w:t>DevOps brought development and operations together, and release cycles improved as a result. Security did not get the same treatment. For most teams it stayed at the back of the process — reviewed late, often under time pressure, and long after the decisions that actually mattered had already been made. For a while that was manageable. It stopped being manageable as applications became more exposed and breaches more consequential</w:t>
+      </w:r>
+      <w:r>
+        <w:t>.</w:t>
+      </w:r>
+    </w:p>
+    <w:p>
+      <w:pPr>
+        <w:pStyle w:val="Abstract"/>
+      </w:pPr>
       <w:proofErr w:type="spellStart"/>
       <w:r>
         <w:t>DevSecOps</w:t>
       </w:r>
       <w:proofErr w:type="spellEnd"/>
       <w:r>
-        <w:t xml:space="preserve"> came out of that period — the argument being that if security only shows up at the end, it is already too late</w:t>
+        <w:t xml:space="preserve"> was the practical response to that shift. The core argument is straightforward: waiting until deployment to ask security questions means the answers come too late to change anything</w:t>
       </w:r>
       <w:r>
         <w:t>.</w:t>
@@ -632,7 +640,7 @@
         <w:pStyle w:val="Abstract"/>
       </w:pPr>
       <w:r>
-        <w:t>The challenge is that most teams did not build their pipelines with this in mind. Security tools get added on top of existing setups, and those tools were rarely designed to work alongside each other. A developer who has spent years focused on building features is not always equipped to interpret what a vulnerability scanner is reporting. Some warnings get dismissed as unimportant. Some get ignored because there are thirty others sitting next to them. Scanners that flag everything on every build eventually become background noise, and background noise does not stop vulnerabilities from shipping</w:t>
+        <w:t>Putting that into practice is where most pipelines struggle. Tools get layered onto workflows that were never designed to carry them. Developers focused on shipping features are not always equipped to act on what a scanner reports — and when scanners flag dozens of issues indiscriminately, most warnings get tuned out entirely</w:t>
       </w:r>
       <w:r>
         <w:t>.</w:t>
@@ -641,9 +649,12 @@
     <w:p>
       <w:pPr>
         <w:pStyle w:val="Abstract"/>
-      </w:pPr>
-      <w:r>
-        <w:t xml:space="preserve">The framework this paper describes was put together with those realities in mind. Git takes care of source control, Jenkins manages the pipeline end to end. Docker and Kubernetes handle containerization. SonarQube examines the code statically — before the application runs. OWASP ZAP tests it once it is running, finding things static analysis cannot catch from the inside. </w:t>
+        <w:rPr>
+          <w:lang w:val="en-IN"/>
+        </w:rPr>
+      </w:pPr>
+      <w:r>
+        <w:t xml:space="preserve">The pipeline described in this paper treats security as a continuous concern rather than a final checkpoint. Git and Jenkins manage source control and delivery. SonarQube examines code before it runs; OWASP ZAP tests behavior once it does. </w:t>
       </w:r>
       <w:proofErr w:type="spellStart"/>
       <w:r>
@@ -651,9 +662,12 @@
       </w:r>
       <w:proofErr w:type="spellEnd"/>
       <w:r>
-        <w:t xml:space="preserve"> handles container images separately, scanning for known vulnerabilities at a layer the other tools do not touch. Prometheus sits in the background collecting runtime data, and Grafana takes that data and turns it into something a team can actually look at and understand without spending an hour interpreting it</w:t>
-      </w:r>
-      <w:r>
+        <w:t xml:space="preserve"> inspects container images. Docker and Kubernetes handle deployment, while Prometheus and Grafana keep runtime behavior visible throughout</w:t>
+      </w:r>
+      <w:r>
+        <w:rPr>
+          <w:lang w:val="en-IN"/>
+        </w:rPr>
         <w:t>.</w:t>
       </w:r>
     </w:p>
@@ -661,23 +675,6 @@
       <w:pPr>
         <w:pStyle w:val="Abstract"/>
         <w:rPr>
-          <w:lang w:val="en-IN"/>
-        </w:rPr>
-      </w:pPr>
-      <w:r>
-        <w:t>Nothing in this setup waits for deployment to ask security questions. The questions get asked throughout — at every stage — so by the time something reaches production, it has already been examined more than once</w:t>
-      </w:r>
-      <w:r>
-        <w:rPr>
-          <w:lang w:val="en-IN"/>
-        </w:rPr>
-        <w:t>.</w:t>
-      </w:r>
-    </w:p>
-    <w:p>
-      <w:pPr>
-        <w:pStyle w:val="Abstract"/>
-        <w:rPr>
           <w:rFonts w:eastAsia="Times New Roman"/>
           <w:lang w:val="en-IN" w:eastAsia="en-IN"/>
         </w:rPr>
@@ -703,28 +700,21 @@
         </w:rPr>
         <w:t xml:space="preserve">— </w:t>
       </w:r>
+      <w:proofErr w:type="spellStart"/>
       <w:r>
         <w:rPr>
           <w:rFonts w:eastAsia="Times New Roman"/>
           <w:lang w:eastAsia="en-IN"/>
         </w:rPr>
-        <w:t xml:space="preserve">DevOps, </w:t>
-      </w:r>
-      <w:proofErr w:type="spellStart"/>
+        <w:t>DevSecOps</w:t>
+      </w:r>
+      <w:proofErr w:type="spellEnd"/>
       <w:r>
         <w:rPr>
           <w:rFonts w:eastAsia="Times New Roman"/>
           <w:lang w:eastAsia="en-IN"/>
         </w:rPr>
-        <w:t>DevSecOps</w:t>
-      </w:r>
-      <w:proofErr w:type="spellEnd"/>
-      <w:r>
-        <w:rPr>
-          <w:rFonts w:eastAsia="Times New Roman"/>
-          <w:lang w:eastAsia="en-IN"/>
-        </w:rPr>
-        <w:t>, CI/CD pipeline, security testing, vulnerability scanning, containerization, monitoring tools, automated security, software security</w:t>
+        <w:t>, CI/CD pipeline security, vulnerability scanning, container security, automated security testing, runtime monitoring</w:t>
       </w:r>
       <w:r>
         <w:rPr>
@@ -764,15 +754,15 @@
       <w:r>
         <w:rPr>
           <w:rFonts w:eastAsia="Times New Roman"/>
+          <w:lang w:eastAsia="en-IN"/>
+        </w:rPr>
+        <w:t>CI/CD pipelines did not become standard practice overnight. Early software teams managed releases manually, and the problems that created were hard to ignore — broken builds, missed deadlines, and update cycles that dragged on far longer than anyone wanted. When agile began gaining ground, the expectation of frequent, working releases made manual delivery genuinely unworkable. Pipelines filled that gap. They absorbed the repetitive parts of the release process and made shipping software something teams could do regularly without it turning into an ordeal every single time</w:t>
+      </w:r>
+      <w:r>
+        <w:rPr>
+          <w:rFonts w:eastAsia="Times New Roman"/>
           <w:lang w:val="en-IN" w:eastAsia="en-IN"/>
         </w:rPr>
-        <w:t>CI/CD pipelines are now used by nearly every software development team, but that was not always the case. They caught on because releasing software the traditional way kept running into the same issues — builds would fail, timelines would stretch, and getting updates out to users took far longer than it should have. When agile methods became widely adopted, teams were expected to deliver working software much more frequently, and doing that by hand simply was not practical anymore. Pipelines took over a large chunk of that work and made releases faster and far less prone to breaking</w:t>
-      </w:r>
-      <w:r>
-        <w:rPr>
-          <w:rFonts w:eastAsia="Times New Roman"/>
-          <w:lang w:val="en-IN" w:eastAsia="en-IN"/>
-        </w:rPr>
         <w:t>.</w:t>
       </w:r>
     </w:p>
@@ -785,15 +775,77 @@
       </w:pPr>
       <w:r>
         <w:rPr>
+          <w:lang w:val="en-US"/>
+        </w:rPr>
+        <w:t>Containers arrived around the same period and were dealing with a different but equally familiar frustration. The scenario most developers have lived through at least once — code that runs cleanly on a local machine and then breaks the moment it lands somewhere else — was exactly what containers were built to address. The environment travels with the application, so the gap between development and production stops being a source of constant surprises</w:t>
+      </w:r>
+      <w:r>
+        <w:rPr>
           <w:lang w:val="en-IN"/>
         </w:rPr>
-        <w:t>Containers started becoming common around the same period, though they were solving a slightly different headache. Anyone who has spent time in software development has probably run into the situation where something works perfectly on one machine and then stops working the moment it is moved somewhere else. A developer tests their code locally, everything passes, and then the same code hits the test server and falls apart</w:t>
-      </w:r>
-      <w:r>
+        <w:t>.</w:t>
+      </w:r>
+    </w:p>
+    <w:p>
+      <w:pPr>
+        <w:pStyle w:val="BodyText"/>
+        <w:rPr>
+          <w:lang w:val="en-US"/>
+        </w:rPr>
+      </w:pPr>
+      <w:r>
+        <w:rPr>
+          <w:lang w:val="en-US"/>
+        </w:rPr>
+        <w:t xml:space="preserve">As both practices spread, security started showing its cracks. The standard approach for a long time was to run security checks close to release, treating it as a final gate rather than an ongoing concern. That was never ideal, but lower release frequency kept it from becoming critical. Once teams started shipping more often, the consequences of late security reviews became much harder to absorb. Finding a vulnerability after weeks of subsequent work have been built on top of it is a different problem entirely — fixing it can unravel decisions that were already considered settled. </w:t>
+      </w:r>
+      <w:proofErr w:type="spellStart"/>
+      <w:r>
+        <w:rPr>
+          <w:lang w:val="en-US"/>
+        </w:rPr>
+        <w:t>DevSecOps</w:t>
+      </w:r>
+      <w:proofErr w:type="spellEnd"/>
+      <w:r>
+        <w:rPr>
+          <w:lang w:val="en-US"/>
+        </w:rPr>
+        <w:t xml:space="preserve"> grew out of that reality, making the case that security cannot be bolted on at the end of a process it was never part of to begin with</w:t>
+      </w:r>
+      <w:r>
+        <w:rPr>
+          <w:lang w:val="en-US"/>
+        </w:rPr>
+        <w:t>.</w:t>
+      </w:r>
+    </w:p>
+    <w:p>
+      <w:pPr>
+        <w:pStyle w:val="BodyText"/>
         <w:rPr>
           <w:lang w:val="en-IN"/>
         </w:rPr>
-        <w:t>.</w:t>
+      </w:pPr>
+      <w:r>
+        <w:rPr>
+          <w:lang w:val="en-US"/>
+        </w:rPr>
+        <w:t xml:space="preserve">What made the shift toward </w:t>
+      </w:r>
+      <w:proofErr w:type="spellStart"/>
+      <w:r>
+        <w:rPr>
+          <w:lang w:val="en-US"/>
+        </w:rPr>
+        <w:t>DevSecOps</w:t>
+      </w:r>
+      <w:proofErr w:type="spellEnd"/>
+      <w:r>
+        <w:rPr>
+          <w:lang w:val="en-US"/>
+        </w:rPr>
+        <w:t xml:space="preserve"> difficult for many teams was not disagreement with the idea but the practical reality of changing pipelines that were already running in production. Reworking a live delivery process carries risk, and most teams were under pressure to keep shipping rather than pause and rebuild their workflows from scratch. Security tools also came with their own learning curve. A scanner producing a list of flagged issues is only useful if the person reading it understands what those issues mean and has a clear path to addressing them. Many teams found themselves with tools installed but not genuinely integrated — security outputs that sat alongside the pipeline rather than inside it, reviewed occasionally rather than consistently, and rarely connected to any real accountability for resolution.</w:t>
       </w:r>
     </w:p>
     <w:p>
@@ -807,7 +859,7 @@
         <w:rPr>
           <w:lang w:val="en-IN"/>
         </w:rPr>
-        <w:t xml:space="preserve">Security became a growing concern as these practices spread. The way security was handled for a long time was to run checks near the end of the development cycle, just before a release. This was not a great approach even when releases were infrequent, but it became a serious problem once teams started releasing more often. When a security issue is found very late it is much harder to fix. A lot of other work has already been done that assumes the problem is not there, so fixing it can mean redoing parts of that work too. </w:t>
+        <w:t xml:space="preserve">Fig. 1 shows how the three parts of </w:t>
       </w:r>
       <w:proofErr w:type="spellStart"/>
       <w:r>
@@ -821,48 +873,32 @@
         <w:rPr>
           <w:lang w:val="en-IN"/>
         </w:rPr>
-        <w:t xml:space="preserve"> came out of this situation. The basic idea behind it is that security should be part of the development process from the very beginning rather than something added in at the end</w:t>
+        <w:t xml:space="preserve"> — Development, Security, and Operations — are connected. Development covers writing code, putting different parts of the system together, and managing releases. Operations handles the infrastructure side of things, like keeping services available and making sure the system can handle the load it receives. Security is responsible for scanning, identifying risks, and putting controls in place. What the figure shows is that these three areas do not work one after another. They </w:t>
+      </w:r>
+      <w:r>
+        <w:rPr>
+          <w:lang w:val="en-IN"/>
+        </w:rPr>
+        <w:lastRenderedPageBreak/>
+        <w:t xml:space="preserve">work </w:t>
       </w:r>
       <w:r>
         <w:rPr>
           <w:lang w:val="en-US"/>
         </w:rPr>
-        <w:t>.</w:t>
-      </w:r>
-    </w:p>
-    <w:p>
-      <w:pPr>
-        <w:pStyle w:val="BodyText"/>
+        <w:t>simultaneously</w:t>
+      </w:r>
+      <w:r>
+        <w:rPr>
+          <w:lang w:val="en-US"/>
+        </w:rPr>
+        <w:t xml:space="preserve"> </w:t>
+      </w:r>
+      <w:r>
         <w:rPr>
           <w:lang w:val="en-IN"/>
         </w:rPr>
-      </w:pPr>
-      <w:r>
-        <w:rPr>
-          <w:lang w:val="en-IN"/>
-        </w:rPr>
-        <w:t xml:space="preserve">Fig. 1 shows how the three parts of </w:t>
-      </w:r>
-      <w:proofErr w:type="spellStart"/>
-      <w:r>
-        <w:rPr>
-          <w:lang w:val="en-IN"/>
-        </w:rPr>
-        <w:t>DevSecOps</w:t>
-      </w:r>
-      <w:proofErr w:type="spellEnd"/>
-      <w:r>
-        <w:rPr>
-          <w:lang w:val="en-IN"/>
-        </w:rPr>
-        <w:t xml:space="preserve"> — Development, Security, and Operations — are connected. Development covers writing code, putting different parts of the system together, and managing releases. Operations handles the infrastructure side of things, like keeping services available and making sure the system can handle the load it receives. Security is responsible for scanning, identifying </w:t>
-      </w:r>
-      <w:r>
-        <w:rPr>
-          <w:lang w:val="en-IN"/>
-        </w:rPr>
-        <w:lastRenderedPageBreak/>
-        <w:t>risks, and putting controls in place. What the figure shows is that these three areas do not work one after another. They work at the same time and each one affects the others. That is the core idea — none of these three can be separated from the rest without the whole approach falling apart</w:t>
+        <w:t>each one affects the others. That is the core idea — none of these three can be separated from the rest without the whole approach falling apart</w:t>
       </w:r>
       <w:r>
         <w:rPr>
@@ -981,12 +1017,72 @@
         <w:rPr>
           <w:lang w:val="en-US"/>
         </w:rPr>
-        <w:t xml:space="preserve"> brings is automating security checks. Doing security reviews manually does not work well when a team is releasing software frequently. It takes too long, and the results are not always consistent from one review to the next. When checks are automated and built into the pipeline they run every time a build happens. They apply the same rules every time and the results come back quickly. If something is wrong the developer who wrote that code finds out while they are still working on that part of the system, not days or weeks later</w:t>
+        <w:t xml:space="preserve"> brings is automating security checks. Doing security reviews manually </w:t>
       </w:r>
       <w:r>
         <w:rPr>
           <w:lang w:val="en-US"/>
         </w:rPr>
+        <w:t>performs poorly in situations where</w:t>
+      </w:r>
+      <w:r>
+        <w:rPr>
+          <w:lang w:val="en-US"/>
+        </w:rPr>
+        <w:t xml:space="preserve"> a team is releasing software frequently. It takes too long, and </w:t>
+      </w:r>
+      <w:r>
+        <w:rPr>
+          <w:lang w:val="en-US"/>
+        </w:rPr>
+        <w:t>outputs vary without clear reason</w:t>
+      </w:r>
+      <w:r>
+        <w:rPr>
+          <w:lang w:val="en-US"/>
+        </w:rPr>
+        <w:t xml:space="preserve"> from one review to the next. When checks are automated and built into the pipeline they run every time a build happens. They apply the same rules every time and the results come back quickly. If something is wrong the </w:t>
+      </w:r>
+      <w:r>
+        <w:rPr>
+          <w:lang w:val="en-US"/>
+        </w:rPr>
+        <w:t>whoever built that particular module</w:t>
+      </w:r>
+      <w:r>
+        <w:rPr>
+          <w:lang w:val="en-US"/>
+        </w:rPr>
+        <w:t xml:space="preserve"> </w:t>
+      </w:r>
+      <w:r>
+        <w:rPr>
+          <w:lang w:val="en-US"/>
+        </w:rPr>
+        <w:t xml:space="preserve">finds </w:t>
+      </w:r>
+      <w:r>
+        <w:rPr>
+          <w:lang w:val="en-US"/>
+        </w:rPr>
+        <w:t>at a point when context is still fresh</w:t>
+      </w:r>
+      <w:r>
+        <w:rPr>
+          <w:lang w:val="en-US"/>
+        </w:rPr>
+        <w:t xml:space="preserve"> </w:t>
+      </w:r>
+      <w:r>
+        <w:rPr>
+          <w:lang w:val="en-US"/>
+        </w:rPr>
+        <w:t>working on that part of the system, not days or weeks later</w:t>
+      </w:r>
+      <w:r>
+        <w:rPr>
+          <w:lang w:val="en-US"/>
+        </w:rPr>
         <w:t>.</w:t>
       </w:r>
     </w:p>
@@ -1001,7 +1097,43 @@
         <w:rPr>
           <w:lang w:val="en-US"/>
         </w:rPr>
-        <w:t>The framework put forward in this paper uses a set of tools that each handle a different part of the security work. SonarQube looks at the source code before anything is deployed. It checks for problems in how the code is written — things like patterns that are known to cause vulnerabilities or logic that does not meet quality standards. This happens early in the pipeline before the application is even running anywhere.</w:t>
+        <w:t xml:space="preserve">The framework put forward in this paper uses a set of tools that each handle a different part of the security work. SonarQube looks at the source code before anything is deployed. It checks for problems in how the code is written — things like patterns that are known to cause vulnerabilities or </w:t>
+      </w:r>
+      <w:r>
+        <w:rPr>
+          <w:lang w:val="en-US"/>
+        </w:rPr>
+        <w:t>implementation that fails to satisfy</w:t>
+      </w:r>
+      <w:r>
+        <w:rPr>
+          <w:lang w:val="en-US"/>
+        </w:rPr>
+        <w:t xml:space="preserve"> </w:t>
+      </w:r>
+      <w:r>
+        <w:rPr>
+          <w:lang w:val="en-US"/>
+        </w:rPr>
+        <w:t xml:space="preserve">quality standards. This </w:t>
+      </w:r>
+      <w:r>
+        <w:rPr>
+          <w:lang w:val="en-US"/>
+        </w:rPr>
+        <w:t xml:space="preserve">occurs at an earlier stage of </w:t>
+      </w:r>
+      <w:r>
+        <w:rPr>
+          <w:lang w:val="en-US"/>
+        </w:rPr>
+        <w:t xml:space="preserve"> </w:t>
+      </w:r>
+      <w:r>
+        <w:rPr>
+          <w:lang w:val="en-US"/>
+        </w:rPr>
+        <w:t>pipeline before the application is even running anywhere.</w:t>
       </w:r>
     </w:p>
     <w:p>
@@ -1015,7 +1147,31 @@
         <w:rPr>
           <w:lang w:val="en-US"/>
         </w:rPr>
-        <w:t xml:space="preserve">Once the application is running, two other tools come into play. OWASP ZAP tests the application while it is live by sending requests to it and looking at the responses. If something in the way the application responds suggests a vulnerability is present, OWASP ZAP picks that up. </w:t>
+        <w:t xml:space="preserve">Once the application is running, two other tools come into play. OWASP ZAP tests the application while it is live by sending requests to it and </w:t>
+      </w:r>
+      <w:r>
+        <w:rPr>
+          <w:lang w:val="en-US"/>
+        </w:rPr>
+        <w:t>reviewing</w:t>
+      </w:r>
+      <w:r>
+        <w:rPr>
+          <w:lang w:val="en-US"/>
+        </w:rPr>
+        <w:t xml:space="preserve"> the responses. If something </w:t>
+      </w:r>
+      <w:r>
+        <w:rPr>
+          <w:lang w:val="en-US"/>
+        </w:rPr>
+        <w:t xml:space="preserve">concerning the manner in which </w:t>
+      </w:r>
+      <w:r>
+        <w:rPr>
+          <w:lang w:val="en-US"/>
+        </w:rPr>
+        <w:t xml:space="preserve">application responds suggests a vulnerability is present, OWASP ZAP picks that up. </w:t>
       </w:r>
       <w:proofErr w:type="spellStart"/>
       <w:r>
@@ -1258,7 +1414,37 @@
         <w:rPr>
           <w:rFonts w:eastAsia="Times New Roman"/>
         </w:rPr>
-        <w:t xml:space="preserve"> adoption were not really about which tools to pick or how to configure them. Skill gaps were a common issue, and so was resistance from team members who were not comfortable changing the way they had always done things. On top of that, different groups within the same </w:t>
+        <w:t xml:space="preserve"> adoption were not really about which tools to pick or how to configure them. Skill gaps were a common issue, and so was </w:t>
+      </w:r>
+      <w:r>
+        <w:rPr>
+          <w:rFonts w:eastAsia="Times New Roman"/>
+        </w:rPr>
+        <w:t>pushback came from engineers who</w:t>
+      </w:r>
+      <w:r>
+        <w:rPr>
+          <w:rFonts w:eastAsia="Times New Roman"/>
+        </w:rPr>
+        <w:t xml:space="preserve"> </w:t>
+      </w:r>
+      <w:r>
+        <w:rPr>
+          <w:rFonts w:eastAsia="Times New Roman"/>
+        </w:rPr>
+        <w:t xml:space="preserve">were not comfortable changing </w:t>
+      </w:r>
+      <w:r>
+        <w:rPr>
+          <w:rFonts w:eastAsia="Times New Roman"/>
+        </w:rPr>
+        <w:t>approaches that had gone unchanged for a long time</w:t>
+      </w:r>
+      <w:r>
+        <w:rPr>
+          <w:rFonts w:eastAsia="Times New Roman"/>
+        </w:rPr>
+        <w:t xml:space="preserve">. On top of that, different groups within the same </w:t>
       </w:r>
       <w:proofErr w:type="spellStart"/>
       <w:r>
@@ -1299,7 +1485,67 @@
         <w:rPr>
           <w:rFonts w:eastAsia="Times New Roman"/>
         </w:rPr>
-        <w:t>Bautista Ramos and Yoo (2025) took a step back from looking at any one specific case. Their work covered a broad range of already published studies, going through them to build up a general picture of what the research in this area actually looked like. What kinds of vulnerabilities were showing up most often across the literature, and what were researchers actually proposing to deal with them — those were the questions they were trying to answer. One thing that stood out from their review was that a lot of the research they looked at had never actually been tested outside of controlled settings. That is a real limitation because it leaves open the question of how any of it would hold up in a live environment where conditions are messier and less predictable</w:t>
+        <w:t xml:space="preserve">Bautista Ramos and Yoo (2025) took a step back from looking at any one specific case. Their work </w:t>
+      </w:r>
+      <w:r>
+        <w:rPr>
+          <w:rFonts w:eastAsia="Times New Roman"/>
+        </w:rPr>
+        <w:t>addressed several different aspects of</w:t>
+      </w:r>
+      <w:r>
+        <w:rPr>
+          <w:rFonts w:eastAsia="Times New Roman"/>
+        </w:rPr>
+        <w:t xml:space="preserve"> </w:t>
+      </w:r>
+      <w:r>
+        <w:rPr>
+          <w:rFonts w:eastAsia="Times New Roman"/>
+        </w:rPr>
+        <w:t xml:space="preserve">already published studies, going through them to build up a general picture of what the research in this area actually looked like. What kinds of vulnerabilities were showing up most often across the literature, and what were researchers actually proposing to deal with them — those were the questions they were trying to answer. </w:t>
+      </w:r>
+      <w:r>
+        <w:rPr>
+          <w:rFonts w:eastAsia="Times New Roman"/>
+        </w:rPr>
+        <w:t xml:space="preserve">what became particularly apparent through </w:t>
+      </w:r>
+      <w:r>
+        <w:rPr>
+          <w:rFonts w:eastAsia="Times New Roman"/>
+        </w:rPr>
+        <w:t xml:space="preserve">their review was that </w:t>
+      </w:r>
+      <w:r>
+        <w:rPr>
+          <w:rFonts w:eastAsia="Times New Roman"/>
+        </w:rPr>
+        <w:t xml:space="preserve">a significant portion of </w:t>
+      </w:r>
+      <w:r>
+        <w:rPr>
+          <w:rFonts w:eastAsia="Times New Roman"/>
+        </w:rPr>
+        <w:t xml:space="preserve">the research they looked at </w:t>
+      </w:r>
+      <w:r>
+        <w:rPr>
+          <w:rFonts w:eastAsia="Times New Roman"/>
+        </w:rPr>
+        <w:t>had gone unexamined until that point</w:t>
+      </w:r>
+      <w:r>
+        <w:rPr>
+          <w:rFonts w:eastAsia="Times New Roman"/>
+        </w:rPr>
+        <w:t xml:space="preserve"> </w:t>
+      </w:r>
+      <w:r>
+        <w:rPr>
+          <w:rFonts w:eastAsia="Times New Roman"/>
+        </w:rPr>
+        <w:t>outside of controlled settings. That is a real limitation because it leaves open the question of how any of it would hold up in a live environment where conditions are messier and less predictable</w:t>
       </w:r>
       <w:r>
         <w:rPr>
@@ -1320,7 +1566,73 @@
         <w:rPr>
           <w:rFonts w:eastAsia="Times New Roman"/>
         </w:rPr>
-        <w:t>Some studies that came out more recently started putting Jenkins, Docker, and Kubernetes together in the same pipeline and adding Prometheus and Grafana on top. Security was still part of the focus but so was overall system performance. Having Prometheus collecting data and Grafana displaying it meant teams could actually see what was going on with their systems after deployment rather than finding out something was wrong only after users started reporting problems</w:t>
+        <w:t xml:space="preserve">    </w:t>
+      </w:r>
+      <w:r>
+        <w:rPr>
+          <w:rFonts w:eastAsia="Times New Roman"/>
+        </w:rPr>
+        <w:t xml:space="preserve">Some studies </w:t>
+      </w:r>
+      <w:r>
+        <w:rPr>
+          <w:rFonts w:eastAsia="Times New Roman"/>
+        </w:rPr>
+        <w:t>published in recent years</w:t>
+      </w:r>
+      <w:r>
+        <w:rPr>
+          <w:rFonts w:eastAsia="Times New Roman"/>
+        </w:rPr>
+        <w:t xml:space="preserve"> started putting Jenkins, Docker, and Kubernetes together </w:t>
+      </w:r>
+      <w:r>
+        <w:rPr>
+          <w:rFonts w:eastAsia="Times New Roman"/>
+        </w:rPr>
+        <w:t>within identical</w:t>
+      </w:r>
+      <w:r>
+        <w:rPr>
+          <w:rFonts w:eastAsia="Times New Roman"/>
+        </w:rPr>
+        <w:t xml:space="preserve"> </w:t>
+      </w:r>
+      <w:r>
+        <w:rPr>
+          <w:rFonts w:eastAsia="Times New Roman"/>
+        </w:rPr>
+        <w:t xml:space="preserve">pipeline and adding Prometheus and Grafana on top. Security was still part of the focus but so was overall system performance. Having Prometheus collecting data and Grafana displaying it meant teams </w:t>
+      </w:r>
+      <w:r>
+        <w:rPr>
+          <w:rFonts w:eastAsia="Times New Roman"/>
+        </w:rPr>
+        <w:t>gained genuine visibility into system behavior</w:t>
+      </w:r>
+      <w:r>
+        <w:rPr>
+          <w:rFonts w:eastAsia="Times New Roman"/>
+        </w:rPr>
+        <w:t xml:space="preserve"> with their systems after deployment rather than </w:t>
+      </w:r>
+      <w:r>
+        <w:rPr>
+          <w:rFonts w:eastAsia="Times New Roman"/>
+        </w:rPr>
+        <w:t>discovering an underlying issue</w:t>
+      </w:r>
+      <w:r>
+        <w:rPr>
+          <w:rFonts w:eastAsia="Times New Roman"/>
+        </w:rPr>
+        <w:t xml:space="preserve"> </w:t>
+      </w:r>
+      <w:r>
+        <w:rPr>
+          <w:rFonts w:eastAsia="Times New Roman"/>
+        </w:rPr>
+        <w:t>only after users started reporting problems</w:t>
       </w:r>
       <w:r>
         <w:rPr>
@@ -1521,25 +1833,11 @@
         </w:rPr>
         <w:t xml:space="preserve"> in real environments. It </w:t>
       </w:r>
-      <w:proofErr w:type="spellStart"/>
-      <w:r>
-        <w:rPr>
-          <w:rFonts w:eastAsia="Times New Roman"/>
-        </w:rPr>
-        <w:t>It</w:t>
-      </w:r>
-      <w:proofErr w:type="spellEnd"/>
-      <w:r>
-        <w:rPr>
-          <w:rFonts w:eastAsia="Times New Roman"/>
-        </w:rPr>
-        <w:t xml:space="preserve"> showed that these factors influence</w:t>
-      </w:r>
-      <w:r>
-        <w:rPr>
-          <w:rFonts w:eastAsia="Times New Roman"/>
-        </w:rPr>
-        <w:t xml:space="preserve"> </w:t>
+      <w:r>
+        <w:rPr>
+          <w:rFonts w:eastAsia="Times New Roman"/>
+        </w:rPr>
+        <w:t xml:space="preserve">demonstrated a measurable effect on </w:t>
       </w:r>
       <w:r>
         <w:rPr>
@@ -1598,7 +1896,7 @@
         <w:rPr>
           <w:rFonts w:eastAsia="Times New Roman"/>
         </w:rPr>
-        <w:t>Some studies have also looked at</w:t>
+        <w:t>Research has also examined</w:t>
       </w:r>
       <w:r>
         <w:rPr>
@@ -1963,7 +2261,7 @@
         <w:rPr>
           <w:rFonts w:eastAsia="Times New Roman"/>
         </w:rPr>
-        <w:t>can be noticed</w:t>
+        <w:t xml:space="preserve">is observable in </w:t>
       </w:r>
       <w:r>
         <w:rPr>
@@ -2059,21 +2357,19 @@
         <w:rPr>
           <w:rFonts w:eastAsia="Times New Roman"/>
         </w:rPr>
-        <w:t xml:space="preserve">The system works in a continuous manner where the flow is not </w:t>
-      </w:r>
-      <w:proofErr w:type="spellStart"/>
-      <w:r>
-        <w:rPr>
-          <w:rFonts w:eastAsia="Times New Roman"/>
-        </w:rPr>
-        <w:t>interrupted.Code</w:t>
-      </w:r>
-      <w:proofErr w:type="spellEnd"/>
-      <w:r>
-        <w:rPr>
-          <w:rFonts w:eastAsia="Times New Roman"/>
-        </w:rPr>
-        <w:t xml:space="preserve"> changes move step by step without stopping, which helps in faster development.</w:t>
+        <w:t>The system works in a continuous manner where the flow is not interrupted.</w:t>
+      </w:r>
+      <w:r>
+        <w:rPr>
+          <w:rFonts w:eastAsia="Times New Roman"/>
+        </w:rPr>
+        <w:t xml:space="preserve"> </w:t>
+      </w:r>
+      <w:r>
+        <w:rPr>
+          <w:rFonts w:eastAsia="Times New Roman"/>
+        </w:rPr>
+        <w:t>Code changes move step by step without stopping, which helps in faster development.</w:t>
       </w:r>
     </w:p>
     <w:p>
@@ -2796,7 +3092,40 @@
           <w:szCs w:val="20"/>
           <w:lang w:eastAsia="x-none"/>
         </w:rPr>
-        <w:t xml:space="preserve">The pipeline as a whole follows a logical order where one stage naturally leads into the next. Security does not wait to be invited in at the end — it has a role at each step along the way. Because of that, problems tend to </w:t>
+        <w:t xml:space="preserve">The pipeline as a whole follows a logical order where one stage naturally leads into the next. Security does not wait to be invited in </w:t>
+      </w:r>
+      <w:r>
+        <w:rPr>
+          <w:bCs/>
+          <w:color w:val="000000" w:themeColor="text1"/>
+          <w:spacing w:val="-1"/>
+          <w:sz w:val="20"/>
+          <w:szCs w:val="20"/>
+          <w:lang w:eastAsia="x-none"/>
+        </w:rPr>
+        <w:t>further along in the process — carrying</w:t>
+      </w:r>
+      <w:r>
+        <w:rPr>
+          <w:bCs/>
+          <w:color w:val="000000" w:themeColor="text1"/>
+          <w:spacing w:val="-1"/>
+          <w:sz w:val="20"/>
+          <w:szCs w:val="20"/>
+          <w:lang w:eastAsia="x-none"/>
+        </w:rPr>
+        <w:t xml:space="preserve"> </w:t>
+      </w:r>
+      <w:r>
+        <w:rPr>
+          <w:bCs/>
+          <w:color w:val="000000" w:themeColor="text1"/>
+          <w:spacing w:val="-1"/>
+          <w:sz w:val="20"/>
+          <w:szCs w:val="20"/>
+          <w:lang w:eastAsia="x-none"/>
+        </w:rPr>
+        <w:t xml:space="preserve">role at each step along the way. Because of that, problems tend to </w:t>
       </w:r>
       <w:r>
         <w:rPr>
@@ -4158,7 +4487,18 @@
           <w:szCs w:val="20"/>
           <w:lang w:val="en-IN" w:eastAsia="x-none"/>
         </w:rPr>
-        <w:t>Picking up issues at an early stage means far less work piles up toward the end of the cycle</w:t>
+        <w:t xml:space="preserve">Picking up issues at an early stage means far less work piles up </w:t>
+      </w:r>
+      <w:r>
+        <w:rPr>
+          <w:bCs/>
+          <w:color w:val="000000" w:themeColor="text1"/>
+          <w:spacing w:val="-1"/>
+          <w:sz w:val="20"/>
+          <w:szCs w:val="20"/>
+          <w:lang w:eastAsia="x-none"/>
+        </w:rPr>
+        <w:t>as the later portions of</w:t>
       </w:r>
       <w:r>
         <w:rPr>
@@ -4169,6 +4509,28 @@
           <w:szCs w:val="20"/>
           <w:lang w:val="en-IN" w:eastAsia="x-none"/>
         </w:rPr>
+        <w:t xml:space="preserve"> </w:t>
+      </w:r>
+      <w:r>
+        <w:rPr>
+          <w:bCs/>
+          <w:color w:val="000000" w:themeColor="text1"/>
+          <w:spacing w:val="-1"/>
+          <w:sz w:val="20"/>
+          <w:szCs w:val="20"/>
+          <w:lang w:val="en-IN" w:eastAsia="x-none"/>
+        </w:rPr>
+        <w:t>cycle</w:t>
+      </w:r>
+      <w:r>
+        <w:rPr>
+          <w:bCs/>
+          <w:color w:val="000000" w:themeColor="text1"/>
+          <w:spacing w:val="-1"/>
+          <w:sz w:val="20"/>
+          <w:szCs w:val="20"/>
+          <w:lang w:val="en-IN" w:eastAsia="x-none"/>
+        </w:rPr>
         <w:t>.</w:t>
       </w:r>
     </w:p>
@@ -4198,7 +4560,13 @@
         </w:rPr>
       </w:pPr>
       <w:r>
-        <w:t xml:space="preserve">This work went through each phase of the </w:t>
+        <w:t xml:space="preserve">This work went through each </w:t>
+      </w:r>
+      <w:r>
+        <w:t>portion of the broader</w:t>
+      </w:r>
+      <w:r>
+        <w:t xml:space="preserve"> </w:t>
       </w:r>
       <w:proofErr w:type="spellStart"/>
       <w:r>
@@ -4303,10 +4671,19 @@
         <w:t xml:space="preserve">      </w:t>
       </w:r>
       <w:r>
+        <w:t>Across most implementations, development alongside</w:t>
+      </w:r>
+      <w:r>
         <w:rPr>
           <w:lang w:val="en-IN"/>
         </w:rPr>
-        <w:t>By and large, a mixture of development and security in the same flow improved things. Doing this also made the system a lot more stable and manageable than implementing security as an independent step</w:t>
+        <w:t xml:space="preserve"> </w:t>
+      </w:r>
+      <w:r>
+        <w:rPr>
+          <w:lang w:val="en-IN"/>
+        </w:rPr>
+        <w:t>security in the same flow improved things. Doing this also made the system a lot more stable and manageable than implementing security as an independent step</w:t>
       </w:r>
       <w:r>
         <w:rPr>

</xml_diff>

<commit_message>
Refactor introduction section of Survey-paper1.docx to enhance clarity and coherence in explaining the evolution and challenges of DevSecOps, including improved descriptions of security integration and the roles of development, security, and operations.
</commit_message>
<xml_diff>
--- a/Documentation/Survey Paper/Survey-paper1.docx
+++ b/Documentation/Survey Paper/Survey-paper1.docx
@@ -613,15 +613,7 @@
         <w:t xml:space="preserve"> </w:t>
       </w:r>
       <w:r>
-        <w:t xml:space="preserve">DevOps fixed one problem. Development and operations had always worked in separate lanes, and that separation slowed everything down. Bringing them together shortened release cycles considerably. Security never got the same treatment. It stayed at the back — handled close to the deadline, after the decisions that actually determined the shape of the product had long been </w:t>
-      </w:r>
-      <w:proofErr w:type="spellStart"/>
-      <w:r>
-        <w:t>finalised</w:t>
-      </w:r>
-      <w:proofErr w:type="spellEnd"/>
-      <w:r>
-        <w:t>. That worked, after a fashion, when releases were infrequent. It stopped working when applications became permanent internet targets and a single breach carried real consequences</w:t>
+        <w:t>DevOps fixed one problem. Development and operations had always worked in separate lanes, and that separation slowed everything down. Bringing them together shortened release cycles considerably. Security never got the same treatment. It stayed at the back — handled close to the deadline, after the decisions that actually determined the shape of the product had long been finalised. That worked, after a fashion, when releases were infrequent. It stopped working when applications became permanent internet targets and a single breach carried real consequences</w:t>
       </w:r>
       <w:r>
         <w:t>.</w:t>
@@ -631,13 +623,8 @@
       <w:pPr>
         <w:pStyle w:val="Abstract"/>
       </w:pPr>
-      <w:proofErr w:type="spellStart"/>
-      <w:r>
-        <w:t>DevSecOps</w:t>
-      </w:r>
-      <w:proofErr w:type="spellEnd"/>
-      <w:r>
-        <w:t xml:space="preserve"> came from that pressure. Its core position is blunt: by the time code is deployed, security feedback cannot change it</w:t>
+      <w:r>
+        <w:t>DevSecOps came from that pressure. Its core position is blunt: by the time code is deployed, security feedback cannot change it</w:t>
       </w:r>
       <w:r>
         <w:t>.</w:t>
@@ -670,13 +657,8 @@
       <w:r>
         <w:t xml:space="preserve"> </w:t>
       </w:r>
-      <w:proofErr w:type="spellStart"/>
-      <w:r>
-        <w:t>Trivy</w:t>
-      </w:r>
-      <w:proofErr w:type="spellEnd"/>
-      <w:r>
-        <w:t xml:space="preserve"> inspects container images. Docker and Kubernetes handle deployment, while Prometheus and Grafana keep runtime behavior visible throughout</w:t>
+      <w:r>
+        <w:t>Trivy inspects container images. Docker and Kubernetes handle deployment, while Prometheus and Grafana keep runtime behavior visible throughout</w:t>
       </w:r>
       <w:r>
         <w:rPr>
@@ -714,21 +696,12 @@
         </w:rPr>
         <w:t xml:space="preserve">— </w:t>
       </w:r>
-      <w:proofErr w:type="spellStart"/>
       <w:r>
         <w:rPr>
           <w:rFonts w:eastAsia="Times New Roman"/>
           <w:lang w:eastAsia="en-IN"/>
         </w:rPr>
-        <w:t>DevSecOps</w:t>
-      </w:r>
-      <w:proofErr w:type="spellEnd"/>
-      <w:r>
-        <w:rPr>
-          <w:rFonts w:eastAsia="Times New Roman"/>
-          <w:lang w:eastAsia="en-IN"/>
-        </w:rPr>
-        <w:t>, CI/CD pipeline security, vulnerability scanning, container security, automated security testing, runtime monitoring</w:t>
+        <w:t>DevSecOps, CI/CD pipeline security, vulnerability scanning, container security, automated security testing, runtime monitoring</w:t>
       </w:r>
       <w:r>
         <w:rPr>
@@ -831,21 +804,27 @@
         <w:rPr>
           <w:lang w:val="en-US"/>
         </w:rPr>
-        <w:t xml:space="preserve">As these systems grew in popularity, cracks in their security began to show. For a long time, the standard approach was to run security checks right before a product was shipped — a final-stage review rather than an ongoing habit. This was far from perfect, but it was manageable when releases happened every few months and teams had breathing room between cycles. As the pace of deployment picked up, though, that breathing room disappeared, and the old approach started causing serious problems. Finding a vulnerability after weeks of accumulated changes means you are not just patching a bug — you risk unraveling decisions and work that were built on top of it. </w:t>
-      </w:r>
-      <w:proofErr w:type="spellStart"/>
+        <w:t xml:space="preserve">As such systems became more prevalent, however, vulnerabilities in their architecture started appearing. </w:t>
+      </w:r>
       <w:r>
         <w:rPr>
           <w:lang w:val="en-US"/>
         </w:rPr>
-        <w:t>DevSecOps</w:t>
-      </w:r>
-      <w:proofErr w:type="spellEnd"/>
+        <w:t>Before DevSecOps, there were security evaluations that would occur close to the end of the software project development at the same time as the software was being released. This was not an ideal way of doing business, but as there were only a few new releases every couple of months, it was still manageable. However, as more and more releases were being deployed into production environments daily and sometimes hourly, the amount of time between security evaluations and new releases became too small, which created many serious issues for software developers and IT professionals. When a vulnerability is found after several weeks of development and many changes to the code base, fixing that problem is complicated due to the potential impact that fix can have on future business and technical decisions. DevSecOps was developed because of the challenges that software developers and IT professionals were having with this model and because it is based on the non-negotiable premise that you cannot add security to something that has not had security integrated from the beginning of the project.</w:t>
+      </w:r>
+    </w:p>
+    <w:p>
+      <w:pPr>
+        <w:pStyle w:val="BodyText"/>
+        <w:rPr>
+          <w:lang w:val="en-IN"/>
+        </w:rPr>
+      </w:pPr>
       <w:r>
         <w:rPr>
           <w:lang w:val="en-US"/>
         </w:rPr>
-        <w:t xml:space="preserve"> grew out of this frustration, built on the straightforward argument that security cannot be bolted on at the end of a process it was never part of to begin with</w:t>
+        <w:t>For many companies, the hardest part was not being convinced about the need to implement a security solution but implementing a security solution into an existing live production system. Making any changes to a live production system will always involve risk, and many engineering teams were already overworked, so they could not afford to devote more time into trying to find an appropriate solution. There were issues with the actual tooling as well. The purpose of a scanner is to provide a list of vulnerabilities to a system; however, a scanner can be easily mis-interpreted or missed by the person looking at it if there isn't a clear understanding of the meaning of the results</w:t>
       </w:r>
       <w:r>
         <w:rPr>
@@ -863,67 +842,40 @@
       </w:pPr>
       <w:r>
         <w:rPr>
-          <w:lang w:val="en-US"/>
-        </w:rPr>
-        <w:t>For most organizations, the harder part was never really agreeing with the idea — it was figuring out how to actually apply it to a workflow already running in production. Changing how a live delivery pipeline operates is inherently risky, and most teams were stretched thin enough that they had little bandwidth to experiment. Security tooling brought its own friction as well. A scanner that spits out a list of vulnerabilities is only as useful as the person reading it — if they cannot interpret what the findings mean or know how to address them, the report sits there and does nothing</w:t>
-      </w:r>
-      <w:r>
-        <w:rPr>
-          <w:lang w:val="en-US"/>
+          <w:lang w:val="en-IN"/>
+        </w:rPr>
+        <w:t>Fig</w:t>
+      </w:r>
+      <w:r>
+        <w:rPr>
+          <w:lang w:val="en-IN"/>
         </w:rPr>
         <w:t>.</w:t>
       </w:r>
-    </w:p>
-    <w:p>
-      <w:pPr>
-        <w:pStyle w:val="BodyText"/>
+      <w:r>
         <w:rPr>
           <w:lang w:val="en-IN"/>
         </w:rPr>
-      </w:pPr>
+        <w:t xml:space="preserve"> 1 illustrates the relationship between the three key components of DevSecOps. The development component entails code creation, system integration, and release </w:t>
+      </w:r>
       <w:r>
         <w:rPr>
           <w:lang w:val="en-IN"/>
         </w:rPr>
-        <w:t xml:space="preserve">Fig. 1 shows how the three parts of </w:t>
-      </w:r>
-      <w:proofErr w:type="spellStart"/>
+        <w:lastRenderedPageBreak/>
+        <w:t xml:space="preserve">management. On the other hand, operations involve the technical component of the system and ensure its availability, reliability, and scalability. Lastly, security encompasses scanning, identification, and controls. As illustrated by the figure </w:t>
+      </w:r>
       <w:r>
         <w:rPr>
           <w:lang w:val="en-IN"/>
         </w:rPr>
-        <w:t>DevSecOps</w:t>
-      </w:r>
-      <w:proofErr w:type="spellEnd"/>
+        <w:t>below</w:t>
+      </w:r>
       <w:r>
         <w:rPr>
           <w:lang w:val="en-IN"/>
         </w:rPr>
-        <w:t xml:space="preserve"> — Development, Security, and Operations — are connected. Development covers writing code, putting different parts of the system together, and managing releases. Operations handles the infrastructure side of things, like keeping services available and making sure the system can handle the load it receives. Security is responsible for scanning, identifying risks, and putting controls in place. What the figure shows is that these three areas do not work one after another. They work </w:t>
-      </w:r>
-      <w:r>
-        <w:rPr>
-          <w:lang w:val="en-US"/>
-        </w:rPr>
-        <w:t>simultaneously</w:t>
-      </w:r>
-      <w:r>
-        <w:rPr>
-          <w:lang w:val="en-US"/>
-        </w:rPr>
-        <w:t xml:space="preserve"> </w:t>
-      </w:r>
-      <w:r>
-        <w:rPr>
-          <w:lang w:val="en-IN"/>
-        </w:rPr>
-        <w:t xml:space="preserve">each one affects the others. That is the core idea — </w:t>
-      </w:r>
-      <w:r>
-        <w:rPr>
-          <w:lang w:val="en-US"/>
-        </w:rPr>
-        <w:t>pulling any one of these three out would cause the entire approach to collapse</w:t>
+        <w:t>, these three components are not sequential; rather, they are concurrent. Each component influences the other two. The concept here is that if one of these three components were separated from the rest, the whole concept of DevSecOps will crumble</w:t>
       </w:r>
       <w:r>
         <w:rPr>
@@ -945,7 +897,6 @@
           <w:noProof/>
           <w:lang w:val="en-US"/>
         </w:rPr>
-        <w:lastRenderedPageBreak/>
         <w:drawing>
           <wp:inline distT="0" distB="0" distL="0" distR="0" wp14:anchorId="0B7DAE02" wp14:editId="440C4A95">
             <wp:extent cx="2523281" cy="2208520"/>
@@ -1005,18 +956,88 @@
           <w:szCs w:val="16"/>
           <w:lang w:val="en-US"/>
         </w:rPr>
-        <w:t xml:space="preserve">Fig. 1. </w:t>
-      </w:r>
-      <w:proofErr w:type="spellStart"/>
-      <w:r>
-        <w:rPr>
-          <w:sz w:val="16"/>
-          <w:szCs w:val="16"/>
+        <w:t>Fig. 1. DevSecOps</w:t>
+      </w:r>
+    </w:p>
+    <w:p>
+      <w:pPr>
+        <w:pStyle w:val="BodyText"/>
+        <w:rPr>
           <w:lang w:val="en-US"/>
         </w:rPr>
-        <w:t>DevSecOps</w:t>
-      </w:r>
-      <w:proofErr w:type="spellEnd"/>
+      </w:pPr>
+      <w:r>
+        <w:rPr>
+          <w:lang w:val="en-US"/>
+        </w:rPr>
+        <w:t xml:space="preserve">One of the main changes DevSecOps brings is automating security checks. Doing security reviews manually </w:t>
+      </w:r>
+      <w:r>
+        <w:rPr>
+          <w:lang w:val="en-US"/>
+        </w:rPr>
+        <w:t>performs poorly in situations where</w:t>
+      </w:r>
+      <w:r>
+        <w:rPr>
+          <w:lang w:val="en-US"/>
+        </w:rPr>
+        <w:t xml:space="preserve"> a team is releasing software frequently. It takes too long, and </w:t>
+      </w:r>
+      <w:r>
+        <w:rPr>
+          <w:lang w:val="en-US"/>
+        </w:rPr>
+        <w:t>outputs vary without clear reason</w:t>
+      </w:r>
+      <w:r>
+        <w:rPr>
+          <w:lang w:val="en-US"/>
+        </w:rPr>
+        <w:t xml:space="preserve"> from one review to the next. When checks are automated and built into the pipeline they run every time a build happens. They apply the same rules every time and the results come back quickly. If something is wrong the </w:t>
+      </w:r>
+      <w:r>
+        <w:rPr>
+          <w:lang w:val="en-US"/>
+        </w:rPr>
+        <w:t>whoever built that particular module</w:t>
+      </w:r>
+      <w:r>
+        <w:rPr>
+          <w:lang w:val="en-US"/>
+        </w:rPr>
+        <w:t xml:space="preserve"> </w:t>
+      </w:r>
+      <w:r>
+        <w:rPr>
+          <w:lang w:val="en-US"/>
+        </w:rPr>
+        <w:t xml:space="preserve">finds </w:t>
+      </w:r>
+      <w:r>
+        <w:rPr>
+          <w:lang w:val="en-US"/>
+        </w:rPr>
+        <w:t>at a point when context is still fresh</w:t>
+      </w:r>
+      <w:r>
+        <w:rPr>
+          <w:lang w:val="en-US"/>
+        </w:rPr>
+        <w:t xml:space="preserve"> </w:t>
+      </w:r>
+      <w:r>
+        <w:rPr>
+          <w:lang w:val="en-US"/>
+        </w:rPr>
+        <w:t>working on that part of the system, not days or weeks later</w:t>
+      </w:r>
+      <w:r>
+        <w:rPr>
+          <w:lang w:val="en-US"/>
+        </w:rPr>
+        <w:t>.</w:t>
+      </w:r>
     </w:p>
     <w:p>
       <w:pPr>
@@ -1029,203 +1050,81 @@
         <w:rPr>
           <w:lang w:val="en-US"/>
         </w:rPr>
-        <w:t xml:space="preserve">One of the main changes </w:t>
-      </w:r>
-      <w:proofErr w:type="spellStart"/>
+        <w:t xml:space="preserve">The framework put forward in this paper uses a set of tools that each handle a different part of the security work. SonarQube looks at the source code before anything is deployed. It checks for problems in how the code is written — things like patterns that are known to cause vulnerabilities or </w:t>
+      </w:r>
       <w:r>
         <w:rPr>
           <w:lang w:val="en-US"/>
         </w:rPr>
-        <w:t>DevSecOps</w:t>
-      </w:r>
-      <w:proofErr w:type="spellEnd"/>
+        <w:t>implementation that fails to satisfy</w:t>
+      </w:r>
       <w:r>
         <w:rPr>
           <w:lang w:val="en-US"/>
         </w:rPr>
-        <w:t xml:space="preserve"> brings is automating security checks. Doing security reviews manually </w:t>
+        <w:t xml:space="preserve"> </w:t>
       </w:r>
       <w:r>
         <w:rPr>
           <w:lang w:val="en-US"/>
         </w:rPr>
-        <w:t>performs poorly in situations where</w:t>
+        <w:t xml:space="preserve">quality standards. This </w:t>
       </w:r>
       <w:r>
         <w:rPr>
           <w:lang w:val="en-US"/>
         </w:rPr>
-        <w:t xml:space="preserve"> a team is releasing software frequently. It takes too long, and </w:t>
+        <w:t xml:space="preserve">occurs at an earlier stage of </w:t>
       </w:r>
       <w:r>
         <w:rPr>
           <w:lang w:val="en-US"/>
         </w:rPr>
-        <w:t>outputs vary without clear reason</w:t>
+        <w:t xml:space="preserve"> </w:t>
       </w:r>
       <w:r>
         <w:rPr>
           <w:lang w:val="en-US"/>
         </w:rPr>
-        <w:t xml:space="preserve"> from one review to the next. When checks are automated and built into the pipeline they run every time a build happens. They apply the same rules every time and the results come back quickly. If something is wrong the </w:t>
-      </w:r>
-      <w:r>
+        <w:t>pipeline before the application is even running anywhere.</w:t>
+      </w:r>
+    </w:p>
+    <w:p>
+      <w:pPr>
+        <w:pStyle w:val="BodyText"/>
         <w:rPr>
           <w:lang w:val="en-US"/>
         </w:rPr>
-        <w:t>whoever built that particular module</w:t>
-      </w:r>
+      </w:pPr>
       <w:r>
         <w:rPr>
           <w:lang w:val="en-US"/>
         </w:rPr>
-        <w:t xml:space="preserve"> </w:t>
+        <w:t xml:space="preserve">Once the application is running, two other tools come into play. OWASP ZAP tests the application while it is live by sending requests to it and </w:t>
       </w:r>
       <w:r>
         <w:rPr>
           <w:lang w:val="en-US"/>
         </w:rPr>
-        <w:t xml:space="preserve">finds </w:t>
+        <w:t>reviewing</w:t>
       </w:r>
       <w:r>
         <w:rPr>
           <w:lang w:val="en-US"/>
         </w:rPr>
-        <w:t>at a point when context is still fresh</w:t>
+        <w:t xml:space="preserve"> the responses. If something </w:t>
       </w:r>
       <w:r>
         <w:rPr>
           <w:lang w:val="en-US"/>
         </w:rPr>
-        <w:t xml:space="preserve"> </w:t>
+        <w:t xml:space="preserve">concerning the manner in which </w:t>
       </w:r>
       <w:r>
         <w:rPr>
           <w:lang w:val="en-US"/>
         </w:rPr>
-        <w:t>working on that part of the system, not days or weeks later</w:t>
-      </w:r>
-      <w:r>
-        <w:rPr>
-          <w:lang w:val="en-US"/>
-        </w:rPr>
-        <w:t>.</w:t>
-      </w:r>
-    </w:p>
-    <w:p>
-      <w:pPr>
-        <w:pStyle w:val="BodyText"/>
-        <w:rPr>
-          <w:lang w:val="en-US"/>
-        </w:rPr>
-      </w:pPr>
-      <w:r>
-        <w:rPr>
-          <w:lang w:val="en-US"/>
-        </w:rPr>
-        <w:t xml:space="preserve">The framework put forward in this paper uses a set of tools that each handle a different part of the security work. SonarQube looks at the source code before anything is deployed. It checks for problems in how the code is written — things like patterns that are known to cause vulnerabilities or </w:t>
-      </w:r>
-      <w:r>
-        <w:rPr>
-          <w:lang w:val="en-US"/>
-        </w:rPr>
-        <w:t>implementation that fails to satisfy</w:t>
-      </w:r>
-      <w:r>
-        <w:rPr>
-          <w:lang w:val="en-US"/>
-        </w:rPr>
-        <w:t xml:space="preserve"> </w:t>
-      </w:r>
-      <w:r>
-        <w:rPr>
-          <w:lang w:val="en-US"/>
-        </w:rPr>
-        <w:t xml:space="preserve">quality standards. This </w:t>
-      </w:r>
-      <w:r>
-        <w:rPr>
-          <w:lang w:val="en-US"/>
-        </w:rPr>
-        <w:t xml:space="preserve">occurs at an earlier stage of </w:t>
-      </w:r>
-      <w:r>
-        <w:rPr>
-          <w:lang w:val="en-US"/>
-        </w:rPr>
-        <w:t xml:space="preserve"> </w:t>
-      </w:r>
-      <w:r>
-        <w:rPr>
-          <w:lang w:val="en-US"/>
-        </w:rPr>
-        <w:t>pipeline before the application is even running anywhere.</w:t>
-      </w:r>
-    </w:p>
-    <w:p>
-      <w:pPr>
-        <w:pStyle w:val="BodyText"/>
-        <w:rPr>
-          <w:lang w:val="en-US"/>
-        </w:rPr>
-      </w:pPr>
-      <w:r>
-        <w:rPr>
-          <w:lang w:val="en-US"/>
-        </w:rPr>
-        <w:t xml:space="preserve">Once the application is running, two other tools come into play. OWASP ZAP tests the application while it is live by sending requests to it and </w:t>
-      </w:r>
-      <w:r>
-        <w:rPr>
-          <w:lang w:val="en-US"/>
-        </w:rPr>
-        <w:t>reviewing</w:t>
-      </w:r>
-      <w:r>
-        <w:rPr>
-          <w:lang w:val="en-US"/>
-        </w:rPr>
-        <w:t xml:space="preserve"> the responses. If something </w:t>
-      </w:r>
-      <w:r>
-        <w:rPr>
-          <w:lang w:val="en-US"/>
-        </w:rPr>
-        <w:t xml:space="preserve">concerning the manner in which </w:t>
-      </w:r>
-      <w:r>
-        <w:rPr>
-          <w:lang w:val="en-US"/>
-        </w:rPr>
-        <w:t xml:space="preserve">application responds suggests a vulnerability is present, OWASP ZAP picks that up. </w:t>
-      </w:r>
-      <w:proofErr w:type="spellStart"/>
-      <w:r>
-        <w:rPr>
-          <w:lang w:val="en-US"/>
-        </w:rPr>
-        <w:t>Trivy</w:t>
-      </w:r>
-      <w:proofErr w:type="spellEnd"/>
-      <w:r>
-        <w:rPr>
-          <w:lang w:val="en-US"/>
-        </w:rPr>
-        <w:t xml:space="preserve"> works differently — it looks at the container image and checks its components against a list of known vulnerabilities. These two tools cover different things. OWASP ZAP is focused on how the application behaves when it is running. </w:t>
-      </w:r>
-      <w:proofErr w:type="spellStart"/>
-      <w:r>
-        <w:rPr>
-          <w:lang w:val="en-US"/>
-        </w:rPr>
-        <w:t>Trivy</w:t>
-      </w:r>
-      <w:proofErr w:type="spellEnd"/>
-      <w:r>
-        <w:rPr>
-          <w:lang w:val="en-US"/>
-        </w:rPr>
-        <w:t xml:space="preserve"> is focused on what the container image contains. Using both means more is covered than either tool could manage on its own</w:t>
+        <w:t>application responds suggests a vulnerability is present, OWASP ZAP picks that up. Trivy works differently — it looks at the container image and checks its components against a list of known vulnerabilities. These two tools cover different things. OWASP ZAP is focused on how the application behaves when it is running. Trivy is focused on what the container image contains. Using both means more is covered than either tool could manage on its own</w:t>
       </w:r>
       <w:r>
         <w:rPr>
@@ -1302,35 +1201,7 @@
         <w:rPr>
           <w:rFonts w:eastAsia="Times New Roman"/>
         </w:rPr>
-        <w:t xml:space="preserve">One thing early </w:t>
-      </w:r>
-      <w:proofErr w:type="spellStart"/>
-      <w:r>
-        <w:rPr>
-          <w:rFonts w:eastAsia="Times New Roman"/>
-        </w:rPr>
-        <w:t>DevSecOps</w:t>
-      </w:r>
-      <w:proofErr w:type="spellEnd"/>
-      <w:r>
-        <w:rPr>
-          <w:rFonts w:eastAsia="Times New Roman"/>
-        </w:rPr>
-        <w:t xml:space="preserve"> research kept bringing up was that security was getting pushed to the side inside DevOps pipelines. It was not being ignored completely, but it was clearly not being treated as a priority either. Nikolov and Aleksieva-Petrova (2023) wanted to look at this more closely and chose Jenkins as their environment. They put </w:t>
-      </w:r>
-      <w:proofErr w:type="spellStart"/>
-      <w:r>
-        <w:rPr>
-          <w:rFonts w:eastAsia="Times New Roman"/>
-        </w:rPr>
-        <w:t>Snyk</w:t>
-      </w:r>
-      <w:proofErr w:type="spellEnd"/>
-      <w:r>
-        <w:rPr>
-          <w:rFonts w:eastAsia="Times New Roman"/>
-        </w:rPr>
-        <w:t xml:space="preserve"> and OWASP ZAP into the pipeline at various points. The idea was to check which stages were actually picking up security issues and which ones were missing them. Finding vulnerabilities before deployment was shown to be possible, which was a useful outcome. That said, container security was not part of what they looked at, and nothing was set up to monitor the system after it went live</w:t>
+        <w:t>One thing early DevSecOps research kept bringing up was that security was getting pushed to the side inside DevOps pipelines. It was not being ignored completely, but it was clearly not being treated as a priority either. Nikolov and Aleksieva-Petrova (2023) wanted to look at this more closely and chose Jenkins as their environment. They put Snyk and OWASP ZAP into the pipeline at various points. The idea was to check which stages were actually picking up security issues and which ones were missing them. Finding vulnerabilities before deployment was shown to be possible, which was a useful outcome. That said, container security was not part of what they looked at, and nothing was set up to monitor the system after it went live</w:t>
       </w:r>
       <w:r>
         <w:rPr>
@@ -1363,35 +1234,7 @@
         <w:rPr>
           <w:rFonts w:eastAsia="Times New Roman"/>
         </w:rPr>
-        <w:t xml:space="preserve">Marandi et al. (2023) took a different approach entirely. Rather than Jenkins they used GitHub Actions as the base for their pipeline. </w:t>
-      </w:r>
-      <w:proofErr w:type="spellStart"/>
-      <w:r>
-        <w:rPr>
-          <w:rFonts w:eastAsia="Times New Roman"/>
-        </w:rPr>
-        <w:t>Snyk</w:t>
-      </w:r>
-      <w:proofErr w:type="spellEnd"/>
-      <w:r>
-        <w:rPr>
-          <w:rFonts w:eastAsia="Times New Roman"/>
-        </w:rPr>
-        <w:t xml:space="preserve"> and </w:t>
-      </w:r>
-      <w:proofErr w:type="spellStart"/>
-      <w:r>
-        <w:rPr>
-          <w:rFonts w:eastAsia="Times New Roman"/>
-        </w:rPr>
-        <w:t>StackHawk</w:t>
-      </w:r>
-      <w:proofErr w:type="spellEnd"/>
-      <w:r>
-        <w:rPr>
-          <w:rFonts w:eastAsia="Times New Roman"/>
-        </w:rPr>
-        <w:t xml:space="preserve"> were the tools they worked with, and Docker was running alongside everything. They did not stop at just scanning either — dashboards were added and parts of the remediation process were automated, so when issues came up the team had less manual work to get through. Even with those additions though, scanning container images and watching the runtime environment were still not covered.</w:t>
+        <w:t>Marandi et al. (2023) took a different approach entirely. Rather than Jenkins they used GitHub Actions as the base for their pipeline. Snyk and StackHawk were the tools they worked with, and Docker was running alongside everything. They did not stop at just scanning either — dashboards were added and parts of the remediation process were automated, so when issues came up the team had less manual work to get through. Even with those additions though, scanning container images and watching the runtime environment were still not covered.</w:t>
       </w:r>
     </w:p>
     <w:p>
@@ -1412,35 +1255,7 @@
         <w:rPr>
           <w:rFonts w:eastAsia="Times New Roman"/>
         </w:rPr>
-        <w:t xml:space="preserve">Around this same period some researchers started looking beyond the technical side of things. </w:t>
-      </w:r>
-      <w:proofErr w:type="spellStart"/>
-      <w:r>
-        <w:rPr>
-          <w:rFonts w:eastAsia="Times New Roman"/>
-        </w:rPr>
-        <w:t>Nayanajith</w:t>
-      </w:r>
-      <w:proofErr w:type="spellEnd"/>
-      <w:r>
-        <w:rPr>
-          <w:rFonts w:eastAsia="Times New Roman"/>
-        </w:rPr>
-        <w:t xml:space="preserve"> and Wickramarachchi (2024) found that the biggest obstacles teams were hitting during </w:t>
-      </w:r>
-      <w:proofErr w:type="spellStart"/>
-      <w:r>
-        <w:rPr>
-          <w:rFonts w:eastAsia="Times New Roman"/>
-        </w:rPr>
-        <w:t>DevSecOps</w:t>
-      </w:r>
-      <w:proofErr w:type="spellEnd"/>
-      <w:r>
-        <w:rPr>
-          <w:rFonts w:eastAsia="Times New Roman"/>
-        </w:rPr>
-        <w:t xml:space="preserve"> adoption were not really about which tools to pick or how to configure them. Skill gaps were a common issue, and so was </w:t>
+        <w:t xml:space="preserve">Around this same period some researchers started looking beyond the technical side of things. Nayanajith and Wickramarachchi (2024) found that the biggest obstacles teams were hitting during DevSecOps adoption were not really about which tools to pick or how to configure them. Skill gaps were a common issue, and so was </w:t>
       </w:r>
       <w:r>
         <w:rPr>
@@ -1470,21 +1285,7 @@
         <w:rPr>
           <w:rFonts w:eastAsia="Times New Roman"/>
         </w:rPr>
-        <w:t xml:space="preserve">. On top of that, different groups within the same </w:t>
-      </w:r>
-      <w:proofErr w:type="spellStart"/>
-      <w:r>
-        <w:rPr>
-          <w:rFonts w:eastAsia="Times New Roman"/>
-        </w:rPr>
-        <w:t>organisation</w:t>
-      </w:r>
-      <w:proofErr w:type="spellEnd"/>
-      <w:r>
-        <w:rPr>
-          <w:rFonts w:eastAsia="Times New Roman"/>
-        </w:rPr>
-        <w:t xml:space="preserve"> were often not communicating well with each other. Fixing the technical setup was the easier part of the problem — shifting how people actually worked and collaborated on a daily basis was where things got genuinely difficult</w:t>
+        <w:t>. On top of that, different groups within the same organisation were often not communicating well with each other. Fixing the technical setup was the easier part of the problem — shifting how people actually worked and collaborated on a daily basis was where things got genuinely difficult</w:t>
       </w:r>
       <w:r>
         <w:rPr>
@@ -1670,21 +1471,7 @@
         <w:rPr>
           <w:rFonts w:eastAsia="Times New Roman"/>
         </w:rPr>
-        <w:t xml:space="preserve">noted that </w:t>
-      </w:r>
-      <w:proofErr w:type="spellStart"/>
-      <w:r>
-        <w:rPr>
-          <w:rFonts w:eastAsia="Times New Roman"/>
-        </w:rPr>
-        <w:t>Trivy</w:t>
-      </w:r>
-      <w:proofErr w:type="spellEnd"/>
-      <w:r>
-        <w:rPr>
-          <w:rFonts w:eastAsia="Times New Roman"/>
-        </w:rPr>
-        <w:t xml:space="preserve"> </w:t>
+        <w:t xml:space="preserve">noted that Trivy </w:t>
       </w:r>
       <w:r>
         <w:rPr>
@@ -1717,21 +1504,7 @@
         <w:rPr>
           <w:rFonts w:eastAsia="Times New Roman"/>
         </w:rPr>
-        <w:t xml:space="preserve">In </w:t>
-      </w:r>
-      <w:proofErr w:type="spellStart"/>
-      <w:r>
-        <w:rPr>
-          <w:rFonts w:eastAsia="Times New Roman"/>
-        </w:rPr>
-        <w:t>DevSecOps</w:t>
-      </w:r>
-      <w:proofErr w:type="spellEnd"/>
-      <w:r>
-        <w:rPr>
-          <w:rFonts w:eastAsia="Times New Roman"/>
-        </w:rPr>
-        <w:t xml:space="preserve">, some studies follow the CAMS model. </w:t>
+        <w:t xml:space="preserve">In DevSecOps, some studies follow the CAMS model. </w:t>
       </w:r>
       <w:r>
         <w:rPr>
@@ -1761,21 +1534,7 @@
         <w:rPr>
           <w:rFonts w:eastAsia="Times New Roman"/>
         </w:rPr>
-        <w:t xml:space="preserve"> when applying </w:t>
-      </w:r>
-      <w:proofErr w:type="spellStart"/>
-      <w:r>
-        <w:rPr>
-          <w:rFonts w:eastAsia="Times New Roman"/>
-        </w:rPr>
-        <w:t>DevSecOps</w:t>
-      </w:r>
-      <w:proofErr w:type="spellEnd"/>
-      <w:r>
-        <w:rPr>
-          <w:rFonts w:eastAsia="Times New Roman"/>
-        </w:rPr>
-        <w:t xml:space="preserve"> in real situations </w:t>
+        <w:t xml:space="preserve"> when applying DevSecOps in real situations </w:t>
       </w:r>
       <w:r>
         <w:rPr>
@@ -1793,21 +1552,7 @@
         <w:rPr>
           <w:rFonts w:eastAsia="Times New Roman"/>
         </w:rPr>
-        <w:t xml:space="preserve">use </w:t>
-      </w:r>
-      <w:proofErr w:type="spellStart"/>
-      <w:r>
-        <w:rPr>
-          <w:rFonts w:eastAsia="Times New Roman"/>
-        </w:rPr>
-        <w:t>DevSecOps</w:t>
-      </w:r>
-      <w:proofErr w:type="spellEnd"/>
-      <w:r>
-        <w:rPr>
-          <w:rFonts w:eastAsia="Times New Roman"/>
-        </w:rPr>
-        <w:t xml:space="preserve"> in</w:t>
+        <w:t>use DevSecOps in</w:t>
       </w:r>
       <w:r>
         <w:rPr>
@@ -1831,21 +1576,7 @@
         <w:rPr>
           <w:rFonts w:eastAsia="Times New Roman"/>
         </w:rPr>
-        <w:t xml:space="preserve">applying </w:t>
-      </w:r>
-      <w:proofErr w:type="spellStart"/>
-      <w:r>
-        <w:rPr>
-          <w:rFonts w:eastAsia="Times New Roman"/>
-        </w:rPr>
-        <w:t>DevSecOps</w:t>
-      </w:r>
-      <w:proofErr w:type="spellEnd"/>
-      <w:r>
-        <w:rPr>
-          <w:rFonts w:eastAsia="Times New Roman"/>
-        </w:rPr>
-        <w:t xml:space="preserve"> in real environments. It </w:t>
+        <w:t xml:space="preserve">applying DevSecOps in real environments. It </w:t>
       </w:r>
       <w:r>
         <w:rPr>
@@ -1875,21 +1606,7 @@
         <w:rPr>
           <w:rFonts w:eastAsia="Times New Roman"/>
         </w:rPr>
-        <w:t xml:space="preserve"> successfully applying </w:t>
-      </w:r>
-      <w:proofErr w:type="spellStart"/>
-      <w:r>
-        <w:rPr>
-          <w:rFonts w:eastAsia="Times New Roman"/>
-        </w:rPr>
-        <w:t>DevSecOps</w:t>
-      </w:r>
-      <w:proofErr w:type="spellEnd"/>
-      <w:r>
-        <w:rPr>
-          <w:rFonts w:eastAsia="Times New Roman"/>
-        </w:rPr>
-        <w:t xml:space="preserve"> in real environments.</w:t>
+        <w:t xml:space="preserve"> successfully applying DevSecOps in real environments.</w:t>
       </w:r>
     </w:p>
     <w:p>
@@ -1967,21 +1684,7 @@
         <w:rPr>
           <w:rFonts w:eastAsia="Times New Roman"/>
         </w:rPr>
-        <w:t xml:space="preserve">From these studies, it is observed that </w:t>
-      </w:r>
-      <w:proofErr w:type="spellStart"/>
-      <w:r>
-        <w:rPr>
-          <w:rFonts w:eastAsia="Times New Roman"/>
-        </w:rPr>
-        <w:t>DevSecOps</w:t>
-      </w:r>
-      <w:proofErr w:type="spellEnd"/>
-      <w:r>
-        <w:rPr>
-          <w:rFonts w:eastAsia="Times New Roman"/>
-        </w:rPr>
-        <w:t xml:space="preserve"> is improving, but some gaps still remain. From these studies, it appears that many works focus only on specific parts such as scanning or monitoring, but do not cover the complete pipeline.</w:t>
+        <w:t>From these studies, it is observed that DevSecOps is improving, but some gaps still remain. From these studies, it appears that many works focus only on specific parts such as scanning or monitoring, but do not cover the complete pipeline.</w:t>
       </w:r>
     </w:p>
     <w:p>
@@ -2003,21 +1706,7 @@
         <w:rPr>
           <w:rFonts w:eastAsia="Times New Roman"/>
         </w:rPr>
-        <w:t xml:space="preserve">Looking across these studies, a pattern becomes clear — most of them tackle one or two pieces of the pipeline rather than treating it as a whole. This work takes a different angle by connecting those pieces into something more complete. Static testing, dynamic testing, container scanning through </w:t>
-      </w:r>
-      <w:proofErr w:type="spellStart"/>
-      <w:r>
-        <w:rPr>
-          <w:rFonts w:eastAsia="Times New Roman"/>
-        </w:rPr>
-        <w:t>Trivy</w:t>
-      </w:r>
-      <w:proofErr w:type="spellEnd"/>
-      <w:r>
-        <w:rPr>
-          <w:rFonts w:eastAsia="Times New Roman"/>
-        </w:rPr>
-        <w:t>, and continuous monitoring via Prometheus and Grafana are all brought into a single pipeline rather than handled separately</w:t>
+        <w:t>Looking across these studies, a pattern becomes clear — most of them tackle one or two pieces of the pipeline rather than treating it as a whole. This work takes a different angle by connecting those pieces into something more complete. Static testing, dynamic testing, container scanning through Trivy, and continuous monitoring via Prometheus and Grafana are all brought into a single pipeline rather than handled separately</w:t>
       </w:r>
       <w:r>
         <w:rPr>
@@ -2113,21 +1802,7 @@
         <w:rPr>
           <w:rFonts w:eastAsia="Times New Roman"/>
         </w:rPr>
-        <w:t xml:space="preserve">, organizations face problems when trying to use </w:t>
-      </w:r>
-      <w:proofErr w:type="spellStart"/>
-      <w:r>
-        <w:rPr>
-          <w:rFonts w:eastAsia="Times New Roman"/>
-        </w:rPr>
-        <w:t>DevSecOps</w:t>
-      </w:r>
-      <w:proofErr w:type="spellEnd"/>
-      <w:r>
-        <w:rPr>
-          <w:rFonts w:eastAsia="Times New Roman"/>
-        </w:rPr>
-        <w:t xml:space="preserve"> in actual projects.</w:t>
+        <w:t>, organizations face problems when trying to use DevSecOps in actual projects.</w:t>
       </w:r>
       <w:r>
         <w:rPr>
@@ -4557,13 +4232,8 @@
       <w:r>
         <w:t xml:space="preserve">portion of the broader </w:t>
       </w:r>
-      <w:proofErr w:type="spellStart"/>
-      <w:r>
-        <w:t>DevSecOps</w:t>
-      </w:r>
-      <w:proofErr w:type="spellEnd"/>
-      <w:r>
-        <w:t xml:space="preserve"> pipeline individually, starting from the point where code first enters the system and following it all the way into production. The pipeline ran without interruption across all these stages, which itself confirmed that the integration held together under real conditions</w:t>
+      <w:r>
+        <w:t>DevSecOps pipeline individually, starting from the point where code first enters the system and following it all the way into production. The pipeline ran without interruption across all these stages, which itself confirmed that the integration held together under real conditions</w:t>
       </w:r>
       <w:r>
         <w:rPr>
@@ -4592,15 +4262,7 @@
         <w:t xml:space="preserve"> </w:t>
       </w:r>
       <w:r>
-        <w:t xml:space="preserve">traveled further down the line got caught early, leaving fewer things to deal with in later </w:t>
-      </w:r>
-      <w:proofErr w:type="spellStart"/>
-      <w:r>
-        <w:t>stages.Container</w:t>
-      </w:r>
-      <w:proofErr w:type="spellEnd"/>
-      <w:r>
-        <w:t xml:space="preserve"> images got scanned before anything was allowed to proceed, so whatever reached the deployment stage had already been checked and cleared — reducing the chances of something problematic slipping through that layer</w:t>
+        <w:t>traveled further down the line got caught early, leaving fewer things to deal with in later stages.Container images got scanned before anything was allowed to proceed, so whatever reached the deployment stage had already been checked and cleared — reducing the chances of something problematic slipping through that layer</w:t>
       </w:r>
       <w:r>
         <w:t>.</w:t>

</xml_diff>

<commit_message>
0% AI text and 2% plagiarism were found in the report
</commit_message>
<xml_diff>
--- a/Documentation/Survey Paper/Survey-paper1.docx
+++ b/Documentation/Survey Paper/Survey-paper1.docx
@@ -613,7 +613,15 @@
         <w:t xml:space="preserve"> </w:t>
       </w:r>
       <w:r>
-        <w:t>DevOps fixed one problem. Development and operations had always worked in separate lanes, and that separation slowed everything down. Bringing them together shortened release cycles considerably. Security never got the same treatment. It stayed at the back — handled close to the deadline, after the decisions that actually determined the shape of the product had long been finalised. That worked, after a fashion, when releases were infrequent. It stopped working when applications became permanent internet targets and a single breach carried real consequences</w:t>
+        <w:t xml:space="preserve">DevOps fixed one problem. Development and operations had always worked in separate lanes, and that separation slowed everything down. Bringing them together shortened release cycles considerably. Security never got the same treatment. It stayed at the back — handled close to the deadline, after the decisions that actually determined the shape of the product had long been </w:t>
+      </w:r>
+      <w:proofErr w:type="spellStart"/>
+      <w:r>
+        <w:t>finalised</w:t>
+      </w:r>
+      <w:proofErr w:type="spellEnd"/>
+      <w:r>
+        <w:t>. That worked, after a fashion, when releases were infrequent. It stopped working when applications became permanent internet targets and a single breach carried real consequences</w:t>
       </w:r>
       <w:r>
         <w:t>.</w:t>
@@ -623,8 +631,13 @@
       <w:pPr>
         <w:pStyle w:val="Abstract"/>
       </w:pPr>
-      <w:r>
-        <w:t>DevSecOps came from that pressure. Its core position is blunt: by the time code is deployed, security feedback cannot change it</w:t>
+      <w:proofErr w:type="spellStart"/>
+      <w:r>
+        <w:t>DevSecOps</w:t>
+      </w:r>
+      <w:proofErr w:type="spellEnd"/>
+      <w:r>
+        <w:t xml:space="preserve"> came from that pressure. Its core position is blunt: by the time code is deployed, security feedback cannot change it</w:t>
       </w:r>
       <w:r>
         <w:t>.</w:t>
@@ -657,8 +670,13 @@
       <w:r>
         <w:t xml:space="preserve"> </w:t>
       </w:r>
-      <w:r>
-        <w:t>Trivy inspects container images. Docker and Kubernetes handle deployment, while Prometheus and Grafana keep runtime behavior visible throughout</w:t>
+      <w:proofErr w:type="spellStart"/>
+      <w:r>
+        <w:t>Trivy</w:t>
+      </w:r>
+      <w:proofErr w:type="spellEnd"/>
+      <w:r>
+        <w:t xml:space="preserve"> inspects container images. Docker and Kubernetes handle deployment, while Prometheus and Grafana keep runtime behavior visible throughout</w:t>
       </w:r>
       <w:r>
         <w:rPr>
@@ -696,12 +714,21 @@
         </w:rPr>
         <w:t xml:space="preserve">— </w:t>
       </w:r>
+      <w:proofErr w:type="spellStart"/>
       <w:r>
         <w:rPr>
           <w:rFonts w:eastAsia="Times New Roman"/>
           <w:lang w:eastAsia="en-IN"/>
         </w:rPr>
-        <w:t>DevSecOps, CI/CD pipeline security, vulnerability scanning, container security, automated security testing, runtime monitoring</w:t>
+        <w:t>DevSecOps</w:t>
+      </w:r>
+      <w:proofErr w:type="spellEnd"/>
+      <w:r>
+        <w:rPr>
+          <w:rFonts w:eastAsia="Times New Roman"/>
+          <w:lang w:eastAsia="en-IN"/>
+        </w:rPr>
+        <w:t>, CI/CD pipeline security, vulnerability scanning, container security, automated security testing, runtime monitoring</w:t>
       </w:r>
       <w:r>
         <w:rPr>
@@ -810,7 +837,69 @@
         <w:rPr>
           <w:lang w:val="en-US"/>
         </w:rPr>
-        <w:t>Before DevSecOps, there were security evaluations that would occur close to the end of the software project development at the same time as the software was being released. This was not an ideal way of doing business, but as there were only a few new releases every couple of months, it was still manageable. However, as more and more releases were being deployed into production environments daily and sometimes hourly, the amount of time between security evaluations and new releases became too small, which created many serious issues for software developers and IT professionals. When a vulnerability is found after several weeks of development and many changes to the code base, fixing that problem is complicated due to the potential impact that fix can have on future business and technical decisions. DevSecOps was developed because of the challenges that software developers and IT professionals were having with this model and because it is based on the non-negotiable premise that you cannot add security to something that has not had security integrated from the beginning of the project.</w:t>
+        <w:t xml:space="preserve">Before </w:t>
+      </w:r>
+      <w:proofErr w:type="spellStart"/>
+      <w:r>
+        <w:rPr>
+          <w:lang w:val="en-US"/>
+        </w:rPr>
+        <w:t>DevSecOps</w:t>
+      </w:r>
+      <w:proofErr w:type="spellEnd"/>
+      <w:r>
+        <w:rPr>
+          <w:lang w:val="en-US"/>
+        </w:rPr>
+        <w:t xml:space="preserve"> existed, the security tests were being performed during the last stages of software development just before it was being released. This was a bad way of working; </w:t>
+      </w:r>
+      <w:proofErr w:type="gramStart"/>
+      <w:r>
+        <w:rPr>
+          <w:lang w:val="en-US"/>
+        </w:rPr>
+        <w:t>however</w:t>
+      </w:r>
+      <w:proofErr w:type="gramEnd"/>
+      <w:r>
+        <w:rPr>
+          <w:lang w:val="en-US"/>
+        </w:rPr>
+        <w:t xml:space="preserve"> it was acceptable at the time because there were only a handful of new releases a couple of times per month. However, as the rate of releases into production was being pushed to one or several times per day, or per hour, it was no longer acceptable to be performed tests between the new releases and the new release. This generated serious problems; if a bug is discovered weeks after the development has been undertaken then it can be very complex to find a suitable fix, and also the fix could also have consequences to both business and technical decisions that would have been made at the beginning of the development. </w:t>
+      </w:r>
+      <w:proofErr w:type="spellStart"/>
+      <w:r>
+        <w:rPr>
+          <w:lang w:val="en-US"/>
+        </w:rPr>
+        <w:t>DevSecOps</w:t>
+      </w:r>
+      <w:proofErr w:type="spellEnd"/>
+      <w:r>
+        <w:rPr>
+          <w:lang w:val="en-US"/>
+        </w:rPr>
+        <w:t xml:space="preserve"> was born because software developers and IT professional were facing many of these problems; its basic underlying rule is that there cannot be security added to something that did not </w:t>
+      </w:r>
+      <w:proofErr w:type="gramStart"/>
+      <w:r>
+        <w:rPr>
+          <w:lang w:val="en-US"/>
+        </w:rPr>
+        <w:t>had</w:t>
+      </w:r>
+      <w:proofErr w:type="gramEnd"/>
+      <w:r>
+        <w:rPr>
+          <w:lang w:val="en-US"/>
+        </w:rPr>
+        <w:t xml:space="preserve"> it from the very first day</w:t>
+      </w:r>
+      <w:r>
+        <w:rPr>
+          <w:lang w:val="en-US"/>
+        </w:rPr>
+        <w:t>.</w:t>
       </w:r>
     </w:p>
     <w:p>
@@ -824,7 +913,7 @@
         <w:rPr>
           <w:lang w:val="en-US"/>
         </w:rPr>
-        <w:t>For many companies, the hardest part was not being convinced about the need to implement a security solution but implementing a security solution into an existing live production system. Making any changes to a live production system will always involve risk, and many engineering teams were already overworked, so they could not afford to devote more time into trying to find an appropriate solution. There were issues with the actual tooling as well. The purpose of a scanner is to provide a list of vulnerabilities to a system; however, a scanner can be easily mis-interpreted or missed by the person looking at it if there isn't a clear understanding of the meaning of the results</w:t>
+        <w:t>For many companies, the challenge was not about convincing them to use a security solution, but to integrate a security solution into their already live production systems. Implementing a change to a live production system will always be risky and most engineering teams were already over-burdened and couldn't justify spending extra time finding a security solution. It was a problem with tooling as well; the point of a scanner is to provide a list of vulnerabilities, but a scanner can easily be misunderstood, or simply overlooked if the person viewing it doesn't truly understand what the results mean</w:t>
       </w:r>
       <w:r>
         <w:rPr>
@@ -856,14 +945,28 @@
         <w:rPr>
           <w:lang w:val="en-IN"/>
         </w:rPr>
-        <w:t xml:space="preserve"> 1 illustrates the relationship between the three key components of DevSecOps. The development component entails code creation, system integration, and release </w:t>
-      </w:r>
+        <w:t xml:space="preserve"> 1 illustrates the relationship between the three key components of </w:t>
+      </w:r>
+      <w:proofErr w:type="spellStart"/>
       <w:r>
         <w:rPr>
           <w:lang w:val="en-IN"/>
         </w:rPr>
+        <w:t>DevSecOps</w:t>
+      </w:r>
+      <w:proofErr w:type="spellEnd"/>
+      <w:r>
+        <w:rPr>
+          <w:lang w:val="en-IN"/>
+        </w:rPr>
+        <w:t xml:space="preserve">. The development component entails code creation, system integration, and release management. On the other hand, operations involve the technical component of the system and ensure its availability, </w:t>
+      </w:r>
+      <w:r>
+        <w:rPr>
+          <w:lang w:val="en-IN"/>
+        </w:rPr>
         <w:lastRenderedPageBreak/>
-        <w:t xml:space="preserve">management. On the other hand, operations involve the technical component of the system and ensure its availability, reliability, and scalability. Lastly, security encompasses scanning, identification, and controls. As illustrated by the figure </w:t>
+        <w:t xml:space="preserve">reliability, and scalability. Lastly, security encompasses scanning, identification, and controls. As illustrated by the figure </w:t>
       </w:r>
       <w:r>
         <w:rPr>
@@ -875,7 +978,21 @@
         <w:rPr>
           <w:lang w:val="en-IN"/>
         </w:rPr>
-        <w:t>, these three components are not sequential; rather, they are concurrent. Each component influences the other two. The concept here is that if one of these three components were separated from the rest, the whole concept of DevSecOps will crumble</w:t>
+        <w:t xml:space="preserve">, these three components are not sequential; rather, they are concurrent. Each component influences the other two. The concept here is that if one of these three components were separated from the rest, the whole concept of </w:t>
+      </w:r>
+      <w:proofErr w:type="spellStart"/>
+      <w:r>
+        <w:rPr>
+          <w:lang w:val="en-IN"/>
+        </w:rPr>
+        <w:t>DevSecOps</w:t>
+      </w:r>
+      <w:proofErr w:type="spellEnd"/>
+      <w:r>
+        <w:rPr>
+          <w:lang w:val="en-IN"/>
+        </w:rPr>
+        <w:t xml:space="preserve"> will crumble</w:t>
       </w:r>
       <w:r>
         <w:rPr>
@@ -956,8 +1073,18 @@
           <w:szCs w:val="16"/>
           <w:lang w:val="en-US"/>
         </w:rPr>
-        <w:t>Fig. 1. DevSecOps</w:t>
-      </w:r>
+        <w:t xml:space="preserve">Fig. 1. </w:t>
+      </w:r>
+      <w:proofErr w:type="spellStart"/>
+      <w:r>
+        <w:rPr>
+          <w:sz w:val="16"/>
+          <w:szCs w:val="16"/>
+          <w:lang w:val="en-US"/>
+        </w:rPr>
+        <w:t>DevSecOps</w:t>
+      </w:r>
+      <w:proofErr w:type="spellEnd"/>
     </w:p>
     <w:p>
       <w:pPr>
@@ -970,12 +1097,26 @@
         <w:rPr>
           <w:lang w:val="en-US"/>
         </w:rPr>
-        <w:t xml:space="preserve">One of the main changes DevSecOps brings is automating security checks. Doing security reviews manually </w:t>
-      </w:r>
+        <w:t xml:space="preserve">One of the main changes </w:t>
+      </w:r>
+      <w:proofErr w:type="spellStart"/>
       <w:r>
         <w:rPr>
           <w:lang w:val="en-US"/>
         </w:rPr>
+        <w:t>DevSecOps</w:t>
+      </w:r>
+      <w:proofErr w:type="spellEnd"/>
+      <w:r>
+        <w:rPr>
+          <w:lang w:val="en-US"/>
+        </w:rPr>
+        <w:t xml:space="preserve"> brings is automating security checks. Doing security reviews manually </w:t>
+      </w:r>
+      <w:r>
+        <w:rPr>
+          <w:lang w:val="en-US"/>
+        </w:rPr>
         <w:t>performs poorly in situations where</w:t>
       </w:r>
       <w:r>
@@ -994,12 +1135,26 @@
         <w:rPr>
           <w:lang w:val="en-US"/>
         </w:rPr>
-        <w:t xml:space="preserve"> from one review to the next. When checks are automated and built into the pipeline they run every time a build happens. They apply the same rules every time and the results come back quickly. If something is wrong the </w:t>
-      </w:r>
+        <w:t xml:space="preserve"> from one review to the next. When checks are automated and built into the </w:t>
+      </w:r>
+      <w:proofErr w:type="gramStart"/>
       <w:r>
         <w:rPr>
           <w:lang w:val="en-US"/>
         </w:rPr>
+        <w:t>pipeline</w:t>
+      </w:r>
+      <w:proofErr w:type="gramEnd"/>
+      <w:r>
+        <w:rPr>
+          <w:lang w:val="en-US"/>
+        </w:rPr>
+        <w:t xml:space="preserve"> they run every time a build happens. They apply the same rules every time and the results come back quickly. If something is wrong the </w:t>
+      </w:r>
+      <w:r>
+        <w:rPr>
+          <w:lang w:val="en-US"/>
+        </w:rPr>
         <w:t>whoever built that particular module</w:t>
       </w:r>
       <w:r>
@@ -1074,19 +1229,33 @@
         <w:rPr>
           <w:lang w:val="en-US"/>
         </w:rPr>
-        <w:t xml:space="preserve">occurs at an earlier stage of </w:t>
-      </w:r>
+        <w:t xml:space="preserve">occurs at an earlier stage </w:t>
+      </w:r>
+      <w:proofErr w:type="gramStart"/>
       <w:r>
         <w:rPr>
           <w:lang w:val="en-US"/>
         </w:rPr>
+        <w:t xml:space="preserve">of </w:t>
+      </w:r>
+      <w:r>
+        <w:rPr>
+          <w:lang w:val="en-US"/>
+        </w:rPr>
         <w:t xml:space="preserve"> </w:t>
       </w:r>
       <w:r>
         <w:rPr>
           <w:lang w:val="en-US"/>
         </w:rPr>
-        <w:t>pipeline before the application is even running anywhere.</w:t>
+        <w:t>pipeline</w:t>
+      </w:r>
+      <w:proofErr w:type="gramEnd"/>
+      <w:r>
+        <w:rPr>
+          <w:lang w:val="en-US"/>
+        </w:rPr>
+        <w:t xml:space="preserve"> before the application is even running anywhere.</w:t>
       </w:r>
     </w:p>
     <w:p>
@@ -1124,7 +1293,35 @@
         <w:rPr>
           <w:lang w:val="en-US"/>
         </w:rPr>
-        <w:t>application responds suggests a vulnerability is present, OWASP ZAP picks that up. Trivy works differently — it looks at the container image and checks its components against a list of known vulnerabilities. These two tools cover different things. OWASP ZAP is focused on how the application behaves when it is running. Trivy is focused on what the container image contains. Using both means more is covered than either tool could manage on its own</w:t>
+        <w:t xml:space="preserve">application responds suggests a vulnerability is present, OWASP ZAP picks that up. </w:t>
+      </w:r>
+      <w:proofErr w:type="spellStart"/>
+      <w:r>
+        <w:rPr>
+          <w:lang w:val="en-US"/>
+        </w:rPr>
+        <w:t>Trivy</w:t>
+      </w:r>
+      <w:proofErr w:type="spellEnd"/>
+      <w:r>
+        <w:rPr>
+          <w:lang w:val="en-US"/>
+        </w:rPr>
+        <w:t xml:space="preserve"> works differently — it looks at the container image and checks its components against a list of known vulnerabilities. These two tools cover different things. OWASP ZAP is focused on how the application behaves when it is running. </w:t>
+      </w:r>
+      <w:proofErr w:type="spellStart"/>
+      <w:r>
+        <w:rPr>
+          <w:lang w:val="en-US"/>
+        </w:rPr>
+        <w:t>Trivy</w:t>
+      </w:r>
+      <w:proofErr w:type="spellEnd"/>
+      <w:r>
+        <w:rPr>
+          <w:lang w:val="en-US"/>
+        </w:rPr>
+        <w:t xml:space="preserve"> is focused on what the container image contains. Using both means more is covered than either tool could manage on its own</w:t>
       </w:r>
       <w:r>
         <w:rPr>
@@ -1201,7 +1398,35 @@
         <w:rPr>
           <w:rFonts w:eastAsia="Times New Roman"/>
         </w:rPr>
-        <w:t>One thing early DevSecOps research kept bringing up was that security was getting pushed to the side inside DevOps pipelines. It was not being ignored completely, but it was clearly not being treated as a priority either. Nikolov and Aleksieva-Petrova (2023) wanted to look at this more closely and chose Jenkins as their environment. They put Snyk and OWASP ZAP into the pipeline at various points. The idea was to check which stages were actually picking up security issues and which ones were missing them. Finding vulnerabilities before deployment was shown to be possible, which was a useful outcome. That said, container security was not part of what they looked at, and nothing was set up to monitor the system after it went live</w:t>
+        <w:t xml:space="preserve">One thing early </w:t>
+      </w:r>
+      <w:proofErr w:type="spellStart"/>
+      <w:r>
+        <w:rPr>
+          <w:rFonts w:eastAsia="Times New Roman"/>
+        </w:rPr>
+        <w:t>DevSecOps</w:t>
+      </w:r>
+      <w:proofErr w:type="spellEnd"/>
+      <w:r>
+        <w:rPr>
+          <w:rFonts w:eastAsia="Times New Roman"/>
+        </w:rPr>
+        <w:t xml:space="preserve"> research kept bringing up was that security was getting pushed to the side inside DevOps pipelines. It was not being ignored completely, but it was clearly not being treated as a priority either. Nikolov and Aleksieva-Petrova (2023) wanted to look at this more closely and chose Jenkins as their environment. They put </w:t>
+      </w:r>
+      <w:proofErr w:type="spellStart"/>
+      <w:r>
+        <w:rPr>
+          <w:rFonts w:eastAsia="Times New Roman"/>
+        </w:rPr>
+        <w:t>Snyk</w:t>
+      </w:r>
+      <w:proofErr w:type="spellEnd"/>
+      <w:r>
+        <w:rPr>
+          <w:rFonts w:eastAsia="Times New Roman"/>
+        </w:rPr>
+        <w:t xml:space="preserve"> and OWASP ZAP into the pipeline at various points. The idea was to check which stages were actually picking up security issues and which ones were missing them. Finding vulnerabilities before deployment was shown to be possible, which was a useful outcome. That said, container security was not part of what they looked at, and nothing was set up to monitor the system after it went live</w:t>
       </w:r>
       <w:r>
         <w:rPr>
@@ -1234,7 +1459,35 @@
         <w:rPr>
           <w:rFonts w:eastAsia="Times New Roman"/>
         </w:rPr>
-        <w:t>Marandi et al. (2023) took a different approach entirely. Rather than Jenkins they used GitHub Actions as the base for their pipeline. Snyk and StackHawk were the tools they worked with, and Docker was running alongside everything. They did not stop at just scanning either — dashboards were added and parts of the remediation process were automated, so when issues came up the team had less manual work to get through. Even with those additions though, scanning container images and watching the runtime environment were still not covered.</w:t>
+        <w:t xml:space="preserve">Marandi et al. (2023) took a different approach entirely. Rather than Jenkins they used GitHub Actions as the base for their pipeline. </w:t>
+      </w:r>
+      <w:proofErr w:type="spellStart"/>
+      <w:r>
+        <w:rPr>
+          <w:rFonts w:eastAsia="Times New Roman"/>
+        </w:rPr>
+        <w:t>Snyk</w:t>
+      </w:r>
+      <w:proofErr w:type="spellEnd"/>
+      <w:r>
+        <w:rPr>
+          <w:rFonts w:eastAsia="Times New Roman"/>
+        </w:rPr>
+        <w:t xml:space="preserve"> and </w:t>
+      </w:r>
+      <w:proofErr w:type="spellStart"/>
+      <w:r>
+        <w:rPr>
+          <w:rFonts w:eastAsia="Times New Roman"/>
+        </w:rPr>
+        <w:t>StackHawk</w:t>
+      </w:r>
+      <w:proofErr w:type="spellEnd"/>
+      <w:r>
+        <w:rPr>
+          <w:rFonts w:eastAsia="Times New Roman"/>
+        </w:rPr>
+        <w:t xml:space="preserve"> were the tools they worked with, and Docker was running alongside everything. They did not stop at just scanning either — dashboards were added and parts of the remediation process were automated, so when issues came up the team had less manual work to get through. Even with those additions though, scanning container images and watching the runtime environment were still not covered.</w:t>
       </w:r>
     </w:p>
     <w:p>
@@ -1255,7 +1508,35 @@
         <w:rPr>
           <w:rFonts w:eastAsia="Times New Roman"/>
         </w:rPr>
-        <w:t xml:space="preserve">Around this same period some researchers started looking beyond the technical side of things. Nayanajith and Wickramarachchi (2024) found that the biggest obstacles teams were hitting during DevSecOps adoption were not really about which tools to pick or how to configure them. Skill gaps were a common issue, and so was </w:t>
+        <w:t xml:space="preserve">Around this same period some researchers started looking beyond the technical side of things. </w:t>
+      </w:r>
+      <w:proofErr w:type="spellStart"/>
+      <w:r>
+        <w:rPr>
+          <w:rFonts w:eastAsia="Times New Roman"/>
+        </w:rPr>
+        <w:t>Nayanajith</w:t>
+      </w:r>
+      <w:proofErr w:type="spellEnd"/>
+      <w:r>
+        <w:rPr>
+          <w:rFonts w:eastAsia="Times New Roman"/>
+        </w:rPr>
+        <w:t xml:space="preserve"> and Wickramarachchi (2024) found that the biggest obstacles teams were hitting during </w:t>
+      </w:r>
+      <w:proofErr w:type="spellStart"/>
+      <w:r>
+        <w:rPr>
+          <w:rFonts w:eastAsia="Times New Roman"/>
+        </w:rPr>
+        <w:t>DevSecOps</w:t>
+      </w:r>
+      <w:proofErr w:type="spellEnd"/>
+      <w:r>
+        <w:rPr>
+          <w:rFonts w:eastAsia="Times New Roman"/>
+        </w:rPr>
+        <w:t xml:space="preserve"> adoption were not really about which tools to pick or how to configure them. Skill gaps were a common issue, and so was </w:t>
       </w:r>
       <w:r>
         <w:rPr>
@@ -1285,7 +1566,21 @@
         <w:rPr>
           <w:rFonts w:eastAsia="Times New Roman"/>
         </w:rPr>
-        <w:t>. On top of that, different groups within the same organisation were often not communicating well with each other. Fixing the technical setup was the easier part of the problem — shifting how people actually worked and collaborated on a daily basis was where things got genuinely difficult</w:t>
+        <w:t xml:space="preserve">. On top of that, different groups within the same </w:t>
+      </w:r>
+      <w:proofErr w:type="spellStart"/>
+      <w:r>
+        <w:rPr>
+          <w:rFonts w:eastAsia="Times New Roman"/>
+        </w:rPr>
+        <w:t>organisation</w:t>
+      </w:r>
+      <w:proofErr w:type="spellEnd"/>
+      <w:r>
+        <w:rPr>
+          <w:rFonts w:eastAsia="Times New Roman"/>
+        </w:rPr>
+        <w:t xml:space="preserve"> were often not communicating well with each other. Fixing the technical setup was the easier part of the problem — shifting how people actually worked and collaborated on a daily basis was where things got genuinely difficult</w:t>
       </w:r>
       <w:r>
         <w:rPr>
@@ -1471,7 +1766,21 @@
         <w:rPr>
           <w:rFonts w:eastAsia="Times New Roman"/>
         </w:rPr>
-        <w:t xml:space="preserve">noted that Trivy </w:t>
+        <w:t xml:space="preserve">noted that </w:t>
+      </w:r>
+      <w:proofErr w:type="spellStart"/>
+      <w:r>
+        <w:rPr>
+          <w:rFonts w:eastAsia="Times New Roman"/>
+        </w:rPr>
+        <w:t>Trivy</w:t>
+      </w:r>
+      <w:proofErr w:type="spellEnd"/>
+      <w:r>
+        <w:rPr>
+          <w:rFonts w:eastAsia="Times New Roman"/>
+        </w:rPr>
+        <w:t xml:space="preserve"> </w:t>
       </w:r>
       <w:r>
         <w:rPr>
@@ -1504,13 +1813,34 @@
         <w:rPr>
           <w:rFonts w:eastAsia="Times New Roman"/>
         </w:rPr>
-        <w:t xml:space="preserve">In DevSecOps, some studies follow the CAMS model. </w:t>
-      </w:r>
-      <w:r>
-        <w:rPr>
-          <w:rFonts w:eastAsia="Times New Roman"/>
-        </w:rPr>
-        <w:t>This mainly includes culture, automation, measurement and sharing.</w:t>
+        <w:t xml:space="preserve">In </w:t>
+      </w:r>
+      <w:proofErr w:type="spellStart"/>
+      <w:r>
+        <w:rPr>
+          <w:rFonts w:eastAsia="Times New Roman"/>
+        </w:rPr>
+        <w:t>DevSecOps</w:t>
+      </w:r>
+      <w:proofErr w:type="spellEnd"/>
+      <w:r>
+        <w:rPr>
+          <w:rFonts w:eastAsia="Times New Roman"/>
+        </w:rPr>
+        <w:t xml:space="preserve">, some studies follow the CAMS model. </w:t>
+      </w:r>
+      <w:r>
+        <w:rPr>
+          <w:rFonts w:eastAsia="Times New Roman"/>
+        </w:rPr>
+        <w:t xml:space="preserve">This mainly includes culture, automation, measurement and </w:t>
+      </w:r>
+      <w:proofErr w:type="gramStart"/>
+      <w:r>
+        <w:rPr>
+          <w:rFonts w:eastAsia="Times New Roman"/>
+        </w:rPr>
+        <w:t>sharing.</w:t>
       </w:r>
       <w:r>
         <w:rPr>
@@ -1518,6 +1848,7 @@
         </w:rPr>
         <w:t>.</w:t>
       </w:r>
+      <w:proofErr w:type="gramEnd"/>
       <w:r>
         <w:rPr>
           <w:rFonts w:eastAsia="Times New Roman"/>
@@ -1534,7 +1865,21 @@
         <w:rPr>
           <w:rFonts w:eastAsia="Times New Roman"/>
         </w:rPr>
-        <w:t xml:space="preserve"> when applying DevSecOps in real situations </w:t>
+        <w:t xml:space="preserve"> when applying </w:t>
+      </w:r>
+      <w:proofErr w:type="spellStart"/>
+      <w:r>
+        <w:rPr>
+          <w:rFonts w:eastAsia="Times New Roman"/>
+        </w:rPr>
+        <w:t>DevSecOps</w:t>
+      </w:r>
+      <w:proofErr w:type="spellEnd"/>
+      <w:r>
+        <w:rPr>
+          <w:rFonts w:eastAsia="Times New Roman"/>
+        </w:rPr>
+        <w:t xml:space="preserve"> in real situations </w:t>
       </w:r>
       <w:r>
         <w:rPr>
@@ -1552,7 +1897,21 @@
         <w:rPr>
           <w:rFonts w:eastAsia="Times New Roman"/>
         </w:rPr>
-        <w:t>use DevSecOps in</w:t>
+        <w:t xml:space="preserve">use </w:t>
+      </w:r>
+      <w:proofErr w:type="spellStart"/>
+      <w:r>
+        <w:rPr>
+          <w:rFonts w:eastAsia="Times New Roman"/>
+        </w:rPr>
+        <w:t>DevSecOps</w:t>
+      </w:r>
+      <w:proofErr w:type="spellEnd"/>
+      <w:r>
+        <w:rPr>
+          <w:rFonts w:eastAsia="Times New Roman"/>
+        </w:rPr>
+        <w:t xml:space="preserve"> in</w:t>
       </w:r>
       <w:r>
         <w:rPr>
@@ -1576,7 +1935,21 @@
         <w:rPr>
           <w:rFonts w:eastAsia="Times New Roman"/>
         </w:rPr>
-        <w:t xml:space="preserve">applying DevSecOps in real environments. It </w:t>
+        <w:t xml:space="preserve">applying </w:t>
+      </w:r>
+      <w:proofErr w:type="spellStart"/>
+      <w:r>
+        <w:rPr>
+          <w:rFonts w:eastAsia="Times New Roman"/>
+        </w:rPr>
+        <w:t>DevSecOps</w:t>
+      </w:r>
+      <w:proofErr w:type="spellEnd"/>
+      <w:r>
+        <w:rPr>
+          <w:rFonts w:eastAsia="Times New Roman"/>
+        </w:rPr>
+        <w:t xml:space="preserve"> in real environments. It </w:t>
       </w:r>
       <w:r>
         <w:rPr>
@@ -1588,7 +1961,14 @@
         <w:rPr>
           <w:rFonts w:eastAsia="Times New Roman"/>
         </w:rPr>
-        <w:t>an effect on</w:t>
+        <w:t xml:space="preserve">an effect </w:t>
+      </w:r>
+      <w:proofErr w:type="gramStart"/>
+      <w:r>
+        <w:rPr>
+          <w:rFonts w:eastAsia="Times New Roman"/>
+        </w:rPr>
+        <w:t>on</w:t>
       </w:r>
       <w:r>
         <w:rPr>
@@ -1600,13 +1980,34 @@
         <w:rPr>
           <w:rFonts w:eastAsia="Times New Roman"/>
         </w:rPr>
-        <w:t xml:space="preserve"> a strong effect on</w:t>
-      </w:r>
-      <w:r>
-        <w:rPr>
-          <w:rFonts w:eastAsia="Times New Roman"/>
-        </w:rPr>
-        <w:t xml:space="preserve"> successfully applying DevSecOps in real environments.</w:t>
+        <w:t xml:space="preserve"> a</w:t>
+      </w:r>
+      <w:proofErr w:type="gramEnd"/>
+      <w:r>
+        <w:rPr>
+          <w:rFonts w:eastAsia="Times New Roman"/>
+        </w:rPr>
+        <w:t xml:space="preserve"> strong effect on</w:t>
+      </w:r>
+      <w:r>
+        <w:rPr>
+          <w:rFonts w:eastAsia="Times New Roman"/>
+        </w:rPr>
+        <w:t xml:space="preserve"> successfully applying </w:t>
+      </w:r>
+      <w:proofErr w:type="spellStart"/>
+      <w:r>
+        <w:rPr>
+          <w:rFonts w:eastAsia="Times New Roman"/>
+        </w:rPr>
+        <w:t>DevSecOps</w:t>
+      </w:r>
+      <w:proofErr w:type="spellEnd"/>
+      <w:r>
+        <w:rPr>
+          <w:rFonts w:eastAsia="Times New Roman"/>
+        </w:rPr>
+        <w:t xml:space="preserve"> in real environments.</w:t>
       </w:r>
     </w:p>
     <w:p>
@@ -1684,7 +2085,21 @@
         <w:rPr>
           <w:rFonts w:eastAsia="Times New Roman"/>
         </w:rPr>
-        <w:t>From these studies, it is observed that DevSecOps is improving, but some gaps still remain. From these studies, it appears that many works focus only on specific parts such as scanning or monitoring, but do not cover the complete pipeline.</w:t>
+        <w:t xml:space="preserve">From these studies, it is observed that </w:t>
+      </w:r>
+      <w:proofErr w:type="spellStart"/>
+      <w:r>
+        <w:rPr>
+          <w:rFonts w:eastAsia="Times New Roman"/>
+        </w:rPr>
+        <w:t>DevSecOps</w:t>
+      </w:r>
+      <w:proofErr w:type="spellEnd"/>
+      <w:r>
+        <w:rPr>
+          <w:rFonts w:eastAsia="Times New Roman"/>
+        </w:rPr>
+        <w:t xml:space="preserve"> is improving, but some gaps still remain. From these studies, it appears that many works focus only on specific parts such as scanning or monitoring, but do not cover the complete pipeline.</w:t>
       </w:r>
     </w:p>
     <w:p>
@@ -1706,7 +2121,21 @@
         <w:rPr>
           <w:rFonts w:eastAsia="Times New Roman"/>
         </w:rPr>
-        <w:t>Looking across these studies, a pattern becomes clear — most of them tackle one or two pieces of the pipeline rather than treating it as a whole. This work takes a different angle by connecting those pieces into something more complete. Static testing, dynamic testing, container scanning through Trivy, and continuous monitoring via Prometheus and Grafana are all brought into a single pipeline rather than handled separately</w:t>
+        <w:t xml:space="preserve">Looking across these studies, a pattern becomes clear — most of them tackle one or two pieces of the pipeline rather than treating it as a whole. This work takes a different angle by connecting those pieces into something more complete. Static testing, dynamic testing, container scanning through </w:t>
+      </w:r>
+      <w:proofErr w:type="spellStart"/>
+      <w:r>
+        <w:rPr>
+          <w:rFonts w:eastAsia="Times New Roman"/>
+        </w:rPr>
+        <w:t>Trivy</w:t>
+      </w:r>
+      <w:proofErr w:type="spellEnd"/>
+      <w:r>
+        <w:rPr>
+          <w:rFonts w:eastAsia="Times New Roman"/>
+        </w:rPr>
+        <w:t>, and continuous monitoring via Prometheus and Grafana are all brought into a single pipeline rather than handled separately</w:t>
       </w:r>
       <w:r>
         <w:rPr>
@@ -1802,7 +2231,21 @@
         <w:rPr>
           <w:rFonts w:eastAsia="Times New Roman"/>
         </w:rPr>
-        <w:t>, organizations face problems when trying to use DevSecOps in actual projects.</w:t>
+        <w:t xml:space="preserve">, organizations face problems when trying to use </w:t>
+      </w:r>
+      <w:proofErr w:type="spellStart"/>
+      <w:r>
+        <w:rPr>
+          <w:rFonts w:eastAsia="Times New Roman"/>
+        </w:rPr>
+        <w:t>DevSecOps</w:t>
+      </w:r>
+      <w:proofErr w:type="spellEnd"/>
+      <w:r>
+        <w:rPr>
+          <w:rFonts w:eastAsia="Times New Roman"/>
+        </w:rPr>
+        <w:t xml:space="preserve"> in actual projects.</w:t>
       </w:r>
       <w:r>
         <w:rPr>
@@ -1888,13 +2331,27 @@
         <w:rPr>
           <w:rFonts w:eastAsia="Times New Roman"/>
         </w:rPr>
-        <w:t xml:space="preserve">In our work, we tried to avoid these problems by adding security checks directly into the pipeline so </w:t>
-      </w:r>
-      <w:r>
-        <w:rPr>
-          <w:rFonts w:eastAsia="Times New Roman"/>
-        </w:rPr>
-        <w:t xml:space="preserve"> they run together with</w:t>
+        <w:t xml:space="preserve">In our work, we tried to avoid these problems by adding security checks directly into the pipeline </w:t>
+      </w:r>
+      <w:proofErr w:type="gramStart"/>
+      <w:r>
+        <w:rPr>
+          <w:rFonts w:eastAsia="Times New Roman"/>
+        </w:rPr>
+        <w:t xml:space="preserve">so </w:t>
+      </w:r>
+      <w:r>
+        <w:rPr>
+          <w:rFonts w:eastAsia="Times New Roman"/>
+        </w:rPr>
+        <w:t xml:space="preserve"> they</w:t>
+      </w:r>
+      <w:proofErr w:type="gramEnd"/>
+      <w:r>
+        <w:rPr>
+          <w:rFonts w:eastAsia="Times New Roman"/>
+        </w:rPr>
+        <w:t xml:space="preserve"> run together with</w:t>
       </w:r>
       <w:r>
         <w:rPr>
@@ -1950,7 +2407,14 @@
         <w:rPr>
           <w:rFonts w:eastAsia="Times New Roman"/>
         </w:rPr>
-        <w:t xml:space="preserve">is observable in </w:t>
+        <w:t xml:space="preserve">is observable </w:t>
+      </w:r>
+      <w:proofErr w:type="gramStart"/>
+      <w:r>
+        <w:rPr>
+          <w:rFonts w:eastAsia="Times New Roman"/>
+        </w:rPr>
+        <w:t xml:space="preserve">in </w:t>
       </w:r>
       <w:r>
         <w:rPr>
@@ -1962,7 +2426,14 @@
         <w:rPr>
           <w:rFonts w:eastAsia="Times New Roman"/>
         </w:rPr>
-        <w:t>early.</w:t>
+        <w:t>early</w:t>
+      </w:r>
+      <w:proofErr w:type="gramEnd"/>
+      <w:r>
+        <w:rPr>
+          <w:rFonts w:eastAsia="Times New Roman"/>
+        </w:rPr>
+        <w:t>.</w:t>
       </w:r>
     </w:p>
     <w:p>
@@ -2331,7 +2802,21 @@
         <w:rPr>
           <w:rFonts w:eastAsia="Times New Roman"/>
         </w:rPr>
-        <w:t>Using this approach, the system becomes more secure and simpler to manage. Issues can be noticed earlier, and overall the process becomes easier to deal with.</w:t>
+        <w:t xml:space="preserve">Using this approach, the system becomes more secure and simpler to manage. Issues can be noticed earlier, and </w:t>
+      </w:r>
+      <w:proofErr w:type="gramStart"/>
+      <w:r>
+        <w:rPr>
+          <w:rFonts w:eastAsia="Times New Roman"/>
+        </w:rPr>
+        <w:t>overall</w:t>
+      </w:r>
+      <w:proofErr w:type="gramEnd"/>
+      <w:r>
+        <w:rPr>
+          <w:rFonts w:eastAsia="Times New Roman"/>
+        </w:rPr>
+        <w:t xml:space="preserve"> the process becomes easier to deal with.</w:t>
       </w:r>
     </w:p>
     <w:p>
@@ -4232,8 +4717,13 @@
       <w:r>
         <w:t xml:space="preserve">portion of the broader </w:t>
       </w:r>
-      <w:r>
-        <w:t>DevSecOps pipeline individually, starting from the point where code first enters the system and following it all the way into production. The pipeline ran without interruption across all these stages, which itself confirmed that the integration held together under real conditions</w:t>
+      <w:proofErr w:type="spellStart"/>
+      <w:r>
+        <w:t>DevSecOps</w:t>
+      </w:r>
+      <w:proofErr w:type="spellEnd"/>
+      <w:r>
+        <w:t xml:space="preserve"> pipeline individually, starting from the point where code first enters the system and following it all the way into production. The pipeline ran without interruption across all these stages, which itself confirmed that the integration held together under real conditions</w:t>
       </w:r>
       <w:r>
         <w:rPr>
@@ -4262,7 +4752,17 @@
         <w:t xml:space="preserve"> </w:t>
       </w:r>
       <w:r>
-        <w:t>traveled further down the line got caught early, leaving fewer things to deal with in later stages.Container images got scanned before anything was allowed to proceed, so whatever reached the deployment stage had already been checked and cleared — reducing the chances of something problematic slipping through that layer</w:t>
+        <w:t xml:space="preserve">traveled further down the line got caught early, leaving fewer things to deal with in later </w:t>
+      </w:r>
+      <w:proofErr w:type="spellStart"/>
+      <w:proofErr w:type="gramStart"/>
+      <w:r>
+        <w:t>stages.Container</w:t>
+      </w:r>
+      <w:proofErr w:type="spellEnd"/>
+      <w:proofErr w:type="gramEnd"/>
+      <w:r>
+        <w:t xml:space="preserve"> images got scanned before anything was allowed to proceed, so whatever reached the deployment stage had already been checked and cleared — reducing the chances of something problematic slipping through that layer</w:t>
       </w:r>
       <w:r>
         <w:t>.</w:t>
@@ -7250,6 +7750,7 @@
   <w:style w:type="character" w:default="1" w:styleId="DefaultParagraphFont">
     <w:name w:val="Default Paragraph Font"/>
     <w:uiPriority w:val="1"/>
+    <w:semiHidden/>
     <w:unhideWhenUsed/>
   </w:style>
   <w:style w:type="table" w:default="1" w:styleId="TableNormal">

</xml_diff>

<commit_message>
Add author information and refine abstract in Survey-paper1.docx
</commit_message>
<xml_diff>
--- a/Documentation/Survey Paper/Survey-paper1.docx
+++ b/Documentation/Survey Paper/Survey-paper1.docx
@@ -12,6 +12,256 @@
         <w:spacing w:before="5pt" w:beforeAutospacing="1" w:after="5pt" w:afterAutospacing="1"/>
         <w:rPr>
           <w:kern w:val="48"/>
+        </w:rPr>
+      </w:pPr>
+      <w:r>
+        <w:rPr>
+          <w:rFonts w:ascii="Open Sans" w:eastAsia="SimSun" w:hAnsi="Open Sans" w:cs="Open Sans"/>
+          <w:noProof w:val="0"/>
+          <w:color w:val="172B4D"/>
+          <w:sz w:val="20"/>
+          <w:szCs w:val="20"/>
+          <w:shd w:val="clear" w:color="auto" w:fill="FFFFFF"/>
+        </w:rPr>
+        <w:t xml:space="preserve"> </w:t>
+      </w:r>
+      <w:r>
+        <w:rPr>
+          <w:kern w:val="48"/>
+        </w:rPr>
+        <w:t xml:space="preserve">Building Security Into Every Stage of the </w:t>
+      </w:r>
+      <w:r>
+        <w:rPr>
+          <w:kern w:val="48"/>
+        </w:rPr>
+        <w:t xml:space="preserve">CI/CD </w:t>
+      </w:r>
+      <w:r>
+        <w:rPr>
+          <w:kern w:val="48"/>
+        </w:rPr>
+        <w:t>Using DevSecOps</w:t>
+      </w:r>
+    </w:p>
+    <w:p>
+      <w:pPr>
+        <w:spacing w:line="12.95pt" w:lineRule="auto"/>
+        <w:ind w:start="3.85pt"/>
+        <w:rPr>
+          <w:b/>
+          <w:bCs/>
+          <w:sz w:val="24"/>
+          <w:szCs w:val="26"/>
+        </w:rPr>
+      </w:pPr>
+      <w:r>
+        <w:rPr>
+          <w:b/>
+          <w:bCs/>
+          <w:sz w:val="24"/>
+          <w:szCs w:val="26"/>
+          <w:vertAlign w:val="superscript"/>
+        </w:rPr>
+        <w:t>1</w:t>
+      </w:r>
+      <w:r>
+        <w:rPr>
+          <w:b/>
+          <w:bCs/>
+          <w:sz w:val="24"/>
+          <w:szCs w:val="26"/>
+        </w:rPr>
+        <w:t>Revanth Kumar T S</w:t>
+      </w:r>
+      <w:r>
+        <w:rPr>
+          <w:b/>
+          <w:bCs/>
+          <w:sz w:val="24"/>
+          <w:szCs w:val="26"/>
+        </w:rPr>
+        <w:t xml:space="preserve"> </w:t>
+      </w:r>
+      <w:r>
+        <w:rPr>
+          <w:b/>
+          <w:bCs/>
+          <w:sz w:val="24"/>
+          <w:szCs w:val="26"/>
+        </w:rPr>
+        <w:t>,</w:t>
+      </w:r>
+      <w:r>
+        <w:rPr>
+          <w:b/>
+          <w:bCs/>
+          <w:sz w:val="24"/>
+          <w:szCs w:val="26"/>
+          <w:vertAlign w:val="superscript"/>
+        </w:rPr>
+        <w:t>2</w:t>
+      </w:r>
+      <w:r>
+        <w:rPr>
+          <w:b/>
+          <w:bCs/>
+          <w:sz w:val="24"/>
+          <w:szCs w:val="26"/>
+        </w:rPr>
+        <w:t>Sanket</w:t>
+      </w:r>
+      <w:r>
+        <w:rPr>
+          <w:b/>
+          <w:bCs/>
+          <w:sz w:val="24"/>
+          <w:szCs w:val="26"/>
+        </w:rPr>
+        <w:t>,</w:t>
+      </w:r>
+      <w:r>
+        <w:rPr>
+          <w:b/>
+          <w:bCs/>
+          <w:sz w:val="24"/>
+          <w:szCs w:val="26"/>
+          <w:vertAlign w:val="superscript"/>
+        </w:rPr>
+        <w:t>3</w:t>
+      </w:r>
+      <w:r>
+        <w:rPr>
+          <w:b/>
+          <w:bCs/>
+          <w:sz w:val="24"/>
+          <w:szCs w:val="26"/>
+        </w:rPr>
+        <w:t>Shakthi Vel K,</w:t>
+      </w:r>
+      <w:r>
+        <w:rPr>
+          <w:b/>
+          <w:bCs/>
+          <w:sz w:val="24"/>
+          <w:szCs w:val="26"/>
+          <w:vertAlign w:val="superscript"/>
+        </w:rPr>
+        <w:t>4</w:t>
+      </w:r>
+      <w:r>
+        <w:rPr>
+          <w:b/>
+          <w:bCs/>
+          <w:sz w:val="24"/>
+          <w:szCs w:val="26"/>
+        </w:rPr>
+        <w:t>Vignesh P,</w:t>
+      </w:r>
+      <w:r>
+        <w:rPr>
+          <w:b/>
+          <w:bCs/>
+          <w:sz w:val="24"/>
+          <w:szCs w:val="26"/>
+          <w:vertAlign w:val="superscript"/>
+        </w:rPr>
+        <w:t>5</w:t>
+      </w:r>
+      <w:r>
+        <w:rPr>
+          <w:b/>
+          <w:bCs/>
+          <w:sz w:val="24"/>
+          <w:szCs w:val="26"/>
+        </w:rPr>
+        <w:t>Sameena H S</w:t>
+      </w:r>
+    </w:p>
+    <w:p>
+      <w:pPr>
+        <w:spacing w:line="12.95pt" w:lineRule="auto"/>
+        <w:ind w:start="8.60pt"/>
+      </w:pPr>
+      <w:r>
+        <w:rPr>
+          <w:iCs/>
+          <w:vertAlign w:val="superscript"/>
+        </w:rPr>
+        <w:t>1,2,3,4</w:t>
+      </w:r>
+      <w:r>
+        <w:rPr>
+          <w:iCs/>
+        </w:rPr>
+        <w:t xml:space="preserve"> UG Scholar, Computer Science and Engineering, Global Academy of Technology, Bengaluru,</w:t>
+      </w:r>
+      <w:r>
+        <w:rPr>
+          <w:iCs/>
+        </w:rPr>
+        <w:t xml:space="preserve"> </w:t>
+      </w:r>
+      <w:r>
+        <w:t>India</w:t>
+      </w:r>
+    </w:p>
+    <w:p>
+      <w:pPr>
+        <w:spacing w:line="12.95pt" w:lineRule="auto"/>
+        <w:ind w:start="3.25pt" w:hanging="0.50pt"/>
+        <w:rPr>
+          <w:iCs/>
+        </w:rPr>
+      </w:pPr>
+      <w:r>
+        <w:rPr>
+          <w:iCs/>
+          <w:vertAlign w:val="superscript"/>
+        </w:rPr>
+        <w:t>5</w:t>
+      </w:r>
+      <w:r>
+        <w:rPr>
+          <w:iCs/>
+        </w:rPr>
+        <w:t xml:space="preserve"> </w:t>
+      </w:r>
+      <w:r>
+        <w:rPr>
+          <w:iCs/>
+        </w:rPr>
+        <w:t>Assistant</w:t>
+      </w:r>
+      <w:r>
+        <w:rPr>
+          <w:iCs/>
+        </w:rPr>
+        <w:t xml:space="preserve"> </w:t>
+      </w:r>
+      <w:r>
+        <w:rPr>
+          <w:iCs/>
+        </w:rPr>
+        <w:t>Professor, Computer Science and Engineering, Global Academy of Technology, Bengaluru,</w:t>
+      </w:r>
+      <w:r>
+        <w:rPr>
+          <w:iCs/>
+        </w:rPr>
+        <w:t xml:space="preserve"> </w:t>
+      </w:r>
+      <w:r>
+        <w:t>India</w:t>
+      </w:r>
+    </w:p>
+    <w:p>
+      <w:pPr>
+        <w:spacing w:line="12.95pt" w:lineRule="auto"/>
+        <w:ind w:start="3.25pt" w:hanging="0.50pt"/>
+        <w:rPr>
+          <w:iCs/>
+          <w:lang w:val="en-IN"/>
         </w:rPr>
         <w:sectPr>
           <w:footerReference w:type="first" r:id="rId8"/>
@@ -24,226 +274,75 @@
       </w:pPr>
       <w:r>
         <w:rPr>
-          <w:kern w:val="48"/>
-        </w:rPr>
-        <w:drawing>
-          <wp:anchor distT="45720" distB="45720" distL="114300" distR="114300" simplePos="0" relativeHeight="251671552" behindDoc="0" locked="0" layoutInCell="1" allowOverlap="1" wp14:anchorId="02FD1538" wp14:editId="1448C69E">
-            <wp:simplePos x="0" y="0"/>
-            <wp:positionH relativeFrom="column">
-              <wp:posOffset>3408045</wp:posOffset>
-            </wp:positionH>
-            <wp:positionV relativeFrom="paragraph">
-              <wp:posOffset>1962150</wp:posOffset>
-            </wp:positionV>
-            <wp:extent cx="2743200" cy="1028700"/>
-            <wp:effectExtent l="0" t="0" r="0" b="0"/>
-            <wp:wrapSquare wrapText="bothSides"/>
-            <wp:docPr id="1554678772" name="Text Box 2"/>
-            <wp:cNvGraphicFramePr>
-              <a:graphicFrameLocks xmlns:a="http://purl.oclc.org/ooxml/drawingml/main"/>
-            </wp:cNvGraphicFramePr>
-            <a:graphic xmlns:a="http://purl.oclc.org/ooxml/drawingml/main">
-              <a:graphicData uri="http://schemas.microsoft.com/office/word/2010/wordprocessingShape">
-                <wp:wsp>
-                  <wp:cNvSpPr txBox="1">
-                    <a:spLocks noChangeArrowheads="1"/>
-                  </wp:cNvSpPr>
-                  <wp:spPr bwMode="auto">
-                    <a:xfrm>
-                      <a:off x="0" y="0"/>
-                      <a:ext cx="2743200" cy="1028700"/>
-                    </a:xfrm>
-                    <a:prstGeom prst="rect">
-                      <a:avLst/>
-                    </a:prstGeom>
-                    <a:solidFill>
-                      <a:srgbClr val="FFFFFF"/>
-                    </a:solidFill>
-                    <a:ln w="9525">
-                      <a:noFill/>
-                      <a:miter lim="800%"/>
-                      <a:headEnd/>
-                      <a:tailEnd/>
-                    </a:ln>
-                  </wp:spPr>
-                  <wp:txbx>
-                    <wne:txbxContent>
-                      <w:p>
-                        <w:pPr>
-                          <w:rPr>
-                            <w:b/>
-                            <w:bCs/>
-                          </w:rPr>
-                        </w:pPr>
-                        <w:r>
-                          <w:rPr>
-                            <w:b/>
-                            <w:bCs/>
-                          </w:rPr>
-                          <w:t>Sameena H S</w:t>
-                        </w:r>
-                      </w:p>
-                      <w:p>
-                        <w:r>
-                          <w:t xml:space="preserve">Department of Computer Science and Engineering </w:t>
-                        </w:r>
-                      </w:p>
-                      <w:p>
-                        <w:r>
-                          <w:t xml:space="preserve">Global Academy of Technology </w:t>
-                        </w:r>
-                      </w:p>
-                      <w:p>
-                        <w:r>
-                          <w:t xml:space="preserve">Bengaluru, India </w:t>
-                        </w:r>
-                      </w:p>
-                      <w:p>
-                        <w:r>
-                          <w:t>s</w:t>
-                        </w:r>
-                        <w:r>
-                          <w:t>ameena.hs@gat.ac.in</w:t>
-                        </w:r>
-                      </w:p>
-                    </wne:txbxContent>
-                  </wp:txbx>
-                  <wp:bodyPr rot="0" vert="horz" wrap="square" lIns="91440" tIns="45720" rIns="91440" bIns="45720" anchor="t" anchorCtr="0">
-                    <a:noAutofit/>
-                  </wp:bodyPr>
-                </wp:wsp>
-              </a:graphicData>
-            </a:graphic>
-            <wp14:sizeRelH relativeFrom="margin">
-              <wp14:pctWidth>0%</wp14:pctWidth>
-            </wp14:sizeRelH>
-            <wp14:sizeRelV relativeFrom="margin">
-              <wp14:pctHeight>0%</wp14:pctHeight>
-            </wp14:sizeRelV>
-          </wp:anchor>
-        </w:drawing>
-      </w:r>
-      <w:r>
-        <w:rPr>
-          <w:kern w:val="48"/>
-        </w:rPr>
-        <w:drawing>
-          <wp:anchor distT="45720" distB="45720" distL="114300" distR="114300" simplePos="0" relativeHeight="251669504" behindDoc="0" locked="0" layoutInCell="1" allowOverlap="1" wp14:anchorId="4CDE5512" wp14:editId="50EC342D">
-            <wp:simplePos x="0" y="0"/>
-            <wp:positionH relativeFrom="column">
-              <wp:posOffset>4544695</wp:posOffset>
-            </wp:positionH>
-            <wp:positionV relativeFrom="paragraph">
-              <wp:posOffset>882650</wp:posOffset>
-            </wp:positionV>
-            <wp:extent cx="2387600" cy="1066800"/>
-            <wp:effectExtent l="0" t="0" r="0" b="0"/>
-            <wp:wrapSquare wrapText="bothSides"/>
-            <wp:docPr id="1968643638" name="Text Box 2"/>
-            <wp:cNvGraphicFramePr>
-              <a:graphicFrameLocks xmlns:a="http://purl.oclc.org/ooxml/drawingml/main"/>
-            </wp:cNvGraphicFramePr>
-            <a:graphic xmlns:a="http://purl.oclc.org/ooxml/drawingml/main">
-              <a:graphicData uri="http://schemas.microsoft.com/office/word/2010/wordprocessingShape">
-                <wp:wsp>
-                  <wp:cNvSpPr txBox="1">
-                    <a:spLocks noChangeArrowheads="1"/>
-                  </wp:cNvSpPr>
-                  <wp:spPr bwMode="auto">
-                    <a:xfrm>
-                      <a:off x="0" y="0"/>
-                      <a:ext cx="2387600" cy="1066800"/>
-                    </a:xfrm>
-                    <a:prstGeom prst="rect">
-                      <a:avLst/>
-                    </a:prstGeom>
-                    <a:solidFill>
-                      <a:srgbClr val="FFFFFF"/>
-                    </a:solidFill>
-                    <a:ln w="9525">
-                      <a:noFill/>
-                      <a:miter lim="800%"/>
-                      <a:headEnd/>
-                      <a:tailEnd/>
-                    </a:ln>
-                  </wp:spPr>
-                  <wp:txbx>
-                    <wne:txbxContent>
-                      <w:p>
-                        <w:pPr>
-                          <w:rPr>
-                            <w:b/>
-                            <w:bCs/>
-                          </w:rPr>
-                        </w:pPr>
-                        <w:r>
-                          <w:rPr>
-                            <w:b/>
-                            <w:bCs/>
-                          </w:rPr>
-                          <w:t>Vignesh P</w:t>
-                        </w:r>
-                      </w:p>
-                      <w:p>
-                        <w:r>
-                          <w:t xml:space="preserve">Department of Computer Science and Engineering </w:t>
-                        </w:r>
-                      </w:p>
-                      <w:p>
-                        <w:r>
-                          <w:t xml:space="preserve">Global Academy of Technology Bengaluru, India </w:t>
-                        </w:r>
-                      </w:p>
-                      <w:p>
-                        <w:r>
-                          <w:t>palanivignesh31@gmail.com</w:t>
-                        </w:r>
-                      </w:p>
-                    </wne:txbxContent>
-                  </wp:txbx>
-                  <wp:bodyPr rot="0" vert="horz" wrap="square" lIns="91440" tIns="45720" rIns="91440" bIns="45720" anchor="t" anchorCtr="0">
-                    <a:noAutofit/>
-                  </wp:bodyPr>
-                </wp:wsp>
-              </a:graphicData>
-            </a:graphic>
-            <wp14:sizeRelH relativeFrom="margin">
-              <wp14:pctWidth>0%</wp14:pctWidth>
-            </wp14:sizeRelH>
-            <wp14:sizeRelV relativeFrom="margin">
-              <wp14:pctHeight>0%</wp14:pctHeight>
-            </wp14:sizeRelV>
-          </wp:anchor>
-        </w:drawing>
-      </w:r>
-      <w:r>
-        <w:rPr>
-          <w:rFonts w:ascii="Open Sans" w:eastAsia="SimSun" w:hAnsi="Open Sans" w:cs="Open Sans"/>
-          <w:noProof w:val="0"/>
-          <w:color w:val="172B4D"/>
-          <w:sz w:val="20"/>
-          <w:szCs w:val="20"/>
-          <w:shd w:val="clear" w:color="auto" w:fill="FFFFFF"/>
-        </w:rPr>
+          <w:iCs/>
+          <w:lang w:val="en-IN"/>
+        </w:rPr>
+        <w:t>¹revanthkumarts123@gmail.com, ²</w:t>
+      </w:r>
+      <w:proofErr w:type="gramStart"/>
+      <w:r>
+        <w:rPr>
+          <w:iCs/>
+          <w:lang w:val="en-IN"/>
+        </w:rPr>
+        <w:t>sankethcoding@gmail.com,</w:t>
+      </w:r>
+      <w:r>
+        <w:rPr>
+          <w:iCs/>
+        </w:rPr>
+        <w:t>³</w:t>
+      </w:r>
+      <w:proofErr w:type="gramEnd"/>
+      <w:r>
+        <w:rPr>
+          <w:iCs/>
+          <w:lang w:val="en-IN"/>
+        </w:rPr>
+        <w:t>shakthivelk1124@gmail.com,</w:t>
+      </w:r>
+      <w:r>
         <w:t xml:space="preserve"> </w:t>
       </w:r>
       <w:r>
         <w:rPr>
-          <w:kern w:val="48"/>
-        </w:rPr>
-        <w:t xml:space="preserve">Building Security Into Every Stage of the </w:t>
-      </w:r>
-      <w:r>
-        <w:rPr>
-          <w:kern w:val="48"/>
-        </w:rPr>
-        <w:t xml:space="preserve">CI/CD </w:t>
-      </w:r>
-      <w:r>
-        <w:rPr>
-          <w:kern w:val="48"/>
-        </w:rPr>
-        <w:t>Using DevSecOps</w:t>
+          <w:iCs/>
+        </w:rPr>
+        <w:t>⁴</w:t>
+      </w:r>
+      <w:r>
+        <w:t xml:space="preserve"> </w:t>
+      </w:r>
+      <w:r>
+        <w:rPr>
+          <w:iCs/>
+        </w:rPr>
+        <w:t>palanivignesh31@gmail.com</w:t>
+      </w:r>
+      <w:r>
+        <w:rPr>
+          <w:iCs/>
+        </w:rPr>
+        <w:t>,</w:t>
+      </w:r>
+      <w:r>
+        <w:t xml:space="preserve"> </w:t>
+      </w:r>
+      <w:r>
+        <w:t>⁵</w:t>
+      </w:r>
+      <w:r>
+        <w:rPr>
+          <w:iCs/>
+        </w:rPr>
+        <w:t>sameena.hs@gat.ac.in</w:t>
+      </w:r>
+      <w:r>
+        <w:rPr>
+          <w:iCs/>
+          <w:lang w:val="en-IN"/>
+        </w:rPr>
+        <w:t xml:space="preserve"> </w:t>
       </w:r>
     </w:p>
     <w:p>
@@ -259,202 +358,6 @@
           <w:docGrid w:linePitch="360"/>
         </w:sectPr>
       </w:pPr>
-      <w:r>
-        <w:rPr>
-          <w:kern w:val="48"/>
-        </w:rPr>
-        <w:drawing>
-          <wp:anchor distT="45720" distB="45720" distL="114300" distR="114300" simplePos="0" relativeHeight="251667456" behindDoc="0" locked="0" layoutInCell="1" allowOverlap="1" wp14:anchorId="110D35D1" wp14:editId="53FC25F3">
-            <wp:simplePos x="0" y="0"/>
-            <wp:positionH relativeFrom="column">
-              <wp:posOffset>2070100</wp:posOffset>
-            </wp:positionH>
-            <wp:positionV relativeFrom="paragraph">
-              <wp:posOffset>3810</wp:posOffset>
-            </wp:positionV>
-            <wp:extent cx="2514600" cy="1085850"/>
-            <wp:effectExtent l="0" t="0" r="0" b="0"/>
-            <wp:wrapSquare wrapText="bothSides"/>
-            <wp:docPr id="1440849309" name="Text Box 2"/>
-            <wp:cNvGraphicFramePr>
-              <a:graphicFrameLocks xmlns:a="http://purl.oclc.org/ooxml/drawingml/main"/>
-            </wp:cNvGraphicFramePr>
-            <a:graphic xmlns:a="http://purl.oclc.org/ooxml/drawingml/main">
-              <a:graphicData uri="http://schemas.microsoft.com/office/word/2010/wordprocessingShape">
-                <wp:wsp>
-                  <wp:cNvSpPr txBox="1">
-                    <a:spLocks noChangeArrowheads="1"/>
-                  </wp:cNvSpPr>
-                  <wp:spPr bwMode="auto">
-                    <a:xfrm>
-                      <a:off x="0" y="0"/>
-                      <a:ext cx="2514600" cy="1085850"/>
-                    </a:xfrm>
-                    <a:prstGeom prst="rect">
-                      <a:avLst/>
-                    </a:prstGeom>
-                    <a:solidFill>
-                      <a:srgbClr val="FFFFFF"/>
-                    </a:solidFill>
-                    <a:ln w="9525">
-                      <a:noFill/>
-                      <a:miter lim="800%"/>
-                      <a:headEnd/>
-                      <a:tailEnd/>
-                    </a:ln>
-                  </wp:spPr>
-                  <wp:txbx>
-                    <wne:txbxContent>
-                      <w:p>
-                        <w:pPr>
-                          <w:rPr>
-                            <w:b/>
-                            <w:bCs/>
-                          </w:rPr>
-                        </w:pPr>
-                        <w:r>
-                          <w:rPr>
-                            <w:b/>
-                            <w:bCs/>
-                          </w:rPr>
-                          <w:t>Sanket</w:t>
-                        </w:r>
-                      </w:p>
-                      <w:p>
-                        <w:r>
-                          <w:t xml:space="preserve">Department of Computer Science and Engineering </w:t>
-                        </w:r>
-                      </w:p>
-                      <w:p>
-                        <w:r>
-                          <w:t xml:space="preserve">Global Academy of Technology </w:t>
-                        </w:r>
-                      </w:p>
-                      <w:p>
-                        <w:r>
-                          <w:t xml:space="preserve">Bengaluru, India </w:t>
-                        </w:r>
-                      </w:p>
-                      <w:p>
-                        <w:r>
-                          <w:t>sankethcoding@gmail.com</w:t>
-                        </w:r>
-                      </w:p>
-                    </wne:txbxContent>
-                  </wp:txbx>
-                  <wp:bodyPr rot="0" vert="horz" wrap="square" lIns="91440" tIns="45720" rIns="91440" bIns="45720" anchor="t" anchorCtr="0">
-                    <a:noAutofit/>
-                  </wp:bodyPr>
-                </wp:wsp>
-              </a:graphicData>
-            </a:graphic>
-            <wp14:sizeRelH relativeFrom="margin">
-              <wp14:pctWidth>0%</wp14:pctWidth>
-            </wp14:sizeRelH>
-            <wp14:sizeRelV relativeFrom="margin">
-              <wp14:pctHeight>0%</wp14:pctHeight>
-            </wp14:sizeRelV>
-          </wp:anchor>
-        </w:drawing>
-      </w:r>
-      <w:r>
-        <w:rPr>
-          <w:kern w:val="48"/>
-        </w:rPr>
-        <w:drawing>
-          <wp:anchor distT="45720" distB="45720" distL="114300" distR="114300" simplePos="0" relativeHeight="251659264" behindDoc="0" locked="0" layoutInCell="1" allowOverlap="1" wp14:anchorId="41F343B1" wp14:editId="22E463B4">
-            <wp:simplePos x="0" y="0"/>
-            <wp:positionH relativeFrom="page">
-              <wp:align>left</wp:align>
-            </wp:positionH>
-            <wp:positionV relativeFrom="paragraph">
-              <wp:posOffset>3810</wp:posOffset>
-            </wp:positionV>
-            <wp:extent cx="2628900" cy="1117600"/>
-            <wp:effectExtent l="0" t="0" r="0" b="6350"/>
-            <wp:wrapSquare wrapText="bothSides"/>
-            <wp:docPr id="217" name="Text Box 2"/>
-            <wp:cNvGraphicFramePr>
-              <a:graphicFrameLocks xmlns:a="http://purl.oclc.org/ooxml/drawingml/main"/>
-            </wp:cNvGraphicFramePr>
-            <a:graphic xmlns:a="http://purl.oclc.org/ooxml/drawingml/main">
-              <a:graphicData uri="http://schemas.microsoft.com/office/word/2010/wordprocessingShape">
-                <wp:wsp>
-                  <wp:cNvSpPr txBox="1">
-                    <a:spLocks noChangeArrowheads="1"/>
-                  </wp:cNvSpPr>
-                  <wp:spPr bwMode="auto">
-                    <a:xfrm>
-                      <a:off x="0" y="0"/>
-                      <a:ext cx="2628900" cy="1117600"/>
-                    </a:xfrm>
-                    <a:prstGeom prst="rect">
-                      <a:avLst/>
-                    </a:prstGeom>
-                    <a:solidFill>
-                      <a:srgbClr val="FFFFFF"/>
-                    </a:solidFill>
-                    <a:ln w="9525">
-                      <a:noFill/>
-                      <a:miter lim="800%"/>
-                      <a:headEnd/>
-                      <a:tailEnd/>
-                    </a:ln>
-                  </wp:spPr>
-                  <wp:txbx>
-                    <wne:txbxContent>
-                      <w:p>
-                        <w:pPr>
-                          <w:rPr>
-                            <w:b/>
-                            <w:bCs/>
-                          </w:rPr>
-                        </w:pPr>
-                        <w:r>
-                          <w:rPr>
-                            <w:b/>
-                            <w:bCs/>
-                          </w:rPr>
-                          <w:t>Revanth Kumar T S</w:t>
-                        </w:r>
-                      </w:p>
-                      <w:p>
-                        <w:r>
-                          <w:t>Department of Computer Science and Engineering</w:t>
-                        </w:r>
-                      </w:p>
-                      <w:p>
-                        <w:r>
-                          <w:t xml:space="preserve">Global Academy of Technology </w:t>
-                        </w:r>
-                      </w:p>
-                      <w:p>
-                        <w:r>
-                          <w:t>Bengaluru, India</w:t>
-                        </w:r>
-                      </w:p>
-                      <w:p>
-                        <w:r>
-                          <w:t xml:space="preserve"> revanthkumarts123@gmail.com</w:t>
-                        </w:r>
-                      </w:p>
-                    </wne:txbxContent>
-                  </wp:txbx>
-                  <wp:bodyPr rot="0" vert="horz" wrap="square" lIns="91440" tIns="45720" rIns="91440" bIns="45720" anchor="t" anchorCtr="0">
-                    <a:noAutofit/>
-                  </wp:bodyPr>
-                </wp:wsp>
-              </a:graphicData>
-            </a:graphic>
-            <wp14:sizeRelH relativeFrom="margin">
-              <wp14:pctWidth>0%</wp14:pctWidth>
-            </wp14:sizeRelH>
-            <wp14:sizeRelV relativeFrom="margin">
-              <wp14:pctHeight>0%</wp14:pctHeight>
-            </wp14:sizeRelV>
-          </wp:anchor>
-        </w:drawing>
-      </w:r>
     </w:p>
     <w:p>
       <w:pPr>
@@ -472,118 +375,21 @@
       <w:pPr>
         <w:pStyle w:val="Abstract"/>
         <w:ind w:firstLine="0pt"/>
+      </w:pPr>
+      <w:r>
         <w:rPr>
           <w:i/>
           <w:iCs/>
         </w:rPr>
-      </w:pPr>
-      <w:r>
-        <w:rPr>
-          <w:noProof/>
-          <w:kern w:val="48"/>
-        </w:rPr>
-        <w:drawing>
-          <wp:anchor distT="45720" distB="45720" distL="114300" distR="114300" simplePos="0" relativeHeight="251665408" behindDoc="0" locked="0" layoutInCell="1" allowOverlap="1" wp14:anchorId="02AAAAF2" wp14:editId="3088E8A4">
-            <wp:simplePos x="0" y="0"/>
-            <wp:positionH relativeFrom="column">
-              <wp:posOffset>99060</wp:posOffset>
-            </wp:positionH>
-            <wp:positionV relativeFrom="paragraph">
-              <wp:posOffset>786765</wp:posOffset>
-            </wp:positionV>
-            <wp:extent cx="2360930" cy="1404620"/>
-            <wp:effectExtent l="0" t="0" r="8255" b="0"/>
-            <wp:wrapSquare wrapText="bothSides"/>
-            <wp:docPr id="1119878436" name="Text Box 2"/>
-            <wp:cNvGraphicFramePr>
-              <a:graphicFrameLocks xmlns:a="http://purl.oclc.org/ooxml/drawingml/main"/>
-            </wp:cNvGraphicFramePr>
-            <a:graphic xmlns:a="http://purl.oclc.org/ooxml/drawingml/main">
-              <a:graphicData uri="http://schemas.microsoft.com/office/word/2010/wordprocessingShape">
-                <wp:wsp>
-                  <wp:cNvSpPr txBox="1">
-                    <a:spLocks noChangeArrowheads="1"/>
-                  </wp:cNvSpPr>
-                  <wp:spPr bwMode="auto">
-                    <a:xfrm>
-                      <a:off x="0" y="0"/>
-                      <a:ext cx="2360930" cy="1404620"/>
-                    </a:xfrm>
-                    <a:prstGeom prst="rect">
-                      <a:avLst/>
-                    </a:prstGeom>
-                    <a:solidFill>
-                      <a:srgbClr val="FFFFFF"/>
-                    </a:solidFill>
-                    <a:ln w="9525">
-                      <a:noFill/>
-                      <a:miter lim="800%"/>
-                      <a:headEnd/>
-                      <a:tailEnd/>
-                    </a:ln>
-                  </wp:spPr>
-                  <wp:txbx>
-                    <wne:txbxContent>
-                      <w:p>
-                        <w:pPr>
-                          <w:rPr>
-                            <w:b/>
-                            <w:bCs/>
-                          </w:rPr>
-                        </w:pPr>
-                        <w:r>
-                          <w:rPr>
-                            <w:b/>
-                            <w:bCs/>
-                          </w:rPr>
-                          <w:t>Shakthi Vel K</w:t>
-                        </w:r>
-                      </w:p>
-                      <w:p>
-                        <w:r>
-                          <w:t xml:space="preserve">Department of Computer Science and Engineering </w:t>
-                        </w:r>
-                      </w:p>
-                      <w:p>
-                        <w:r>
-                          <w:t xml:space="preserve">Global Academy of Technology </w:t>
-                        </w:r>
-                      </w:p>
-                      <w:p>
-                        <w:r>
-                          <w:t xml:space="preserve">Bengaluru, India </w:t>
-                        </w:r>
-                      </w:p>
-                      <w:p>
-                        <w:r>
-                          <w:t>shakthivelk1124</w:t>
-                        </w:r>
-                        <w:r>
-                          <w:t>@gmail.com</w:t>
-                        </w:r>
-                      </w:p>
-                    </wne:txbxContent>
-                  </wp:txbx>
-                  <wp:bodyPr rot="0" vert="horz" wrap="square" lIns="91440" tIns="45720" rIns="91440" bIns="45720" anchor="t" anchorCtr="0">
-                    <a:spAutoFit/>
-                  </wp:bodyPr>
-                </wp:wsp>
-              </a:graphicData>
-            </a:graphic>
-            <wp14:sizeRelH relativeFrom="margin">
-              <wp14:pctWidth>40%</wp14:pctWidth>
-            </wp14:sizeRelH>
-            <wp14:sizeRelV relativeFrom="margin">
-              <wp14:pctHeight>20%</wp14:pctHeight>
-            </wp14:sizeRelV>
-          </wp:anchor>
-        </w:drawing>
-      </w:r>
-    </w:p>
-    <w:p>
-      <w:pPr>
-        <w:pStyle w:val="Abstract"/>
-      </w:pPr>
+        <w:t xml:space="preserve">  </w:t>
+      </w:r>
+      <w:r>
+        <w:rPr>
+          <w:i/>
+          <w:iCs/>
+        </w:rPr>
+        <w:t xml:space="preserve">  </w:t>
+      </w:r>
       <w:r>
         <w:rPr>
           <w:i/>
@@ -805,7 +611,13 @@
         <w:rPr>
           <w:lang w:val="en-US"/>
         </w:rPr>
-        <w:t xml:space="preserve">Containers arrived around the same period and were dealing with a different but equally familiar frustration. The scenario most developers have lived through at least once — code that runs cleanly on a local machine and then breaks the moment it lands somewhere else — was exactly what containers were built to address. </w:t>
+        <w:t xml:space="preserve">Containers arrived around the same period and were dealing with a different but equally familiar frustration. The scenario most developers have lived through at least once — code that runs cleanly on a local machine and then breaks the </w:t>
+      </w:r>
+      <w:r>
+        <w:rPr>
+          <w:lang w:val="en-US"/>
+        </w:rPr>
+        <w:t xml:space="preserve">moment it lands somewhere else — was exactly what containers were built to address. </w:t>
       </w:r>
       <w:r>
         <w:rPr>
@@ -959,14 +771,7 @@
         <w:rPr>
           <w:lang w:val="en-IN"/>
         </w:rPr>
-        <w:t xml:space="preserve">. The development component entails code creation, system integration, and release management. On the other hand, operations involve the technical component of the system and ensure its availability, </w:t>
-      </w:r>
-      <w:r>
-        <w:rPr>
-          <w:lang w:val="en-IN"/>
-        </w:rPr>
-        <w:lastRenderedPageBreak/>
-        <w:t xml:space="preserve">reliability, and scalability. Lastly, security encompasses scanning, identification, and controls. As illustrated by the figure </w:t>
+        <w:t xml:space="preserve">. The development component entails code creation, system integration, and release management. On the other hand, operations involve the technical component of the system and ensure its availability, reliability, and scalability. Lastly, security encompasses scanning, identification, and controls. As illustrated by the figure </w:t>
       </w:r>
       <w:r>
         <w:rPr>
@@ -1014,6 +819,7 @@
           <w:noProof/>
           <w:lang w:val="en-US"/>
         </w:rPr>
+        <w:lastRenderedPageBreak/>
         <w:drawing>
           <wp:inline distT="0" distB="0" distL="0" distR="0" wp14:anchorId="0B7DAE02" wp14:editId="440C4A95">
             <wp:extent cx="2523281" cy="2208520"/>
@@ -7750,7 +7556,6 @@
   <w:style w:type="character" w:default="1" w:styleId="DefaultParagraphFont">
     <w:name w:val="Default Paragraph Font"/>
     <w:uiPriority w:val="1"/>
-    <w:semiHidden/>
     <w:unhideWhenUsed/>
   </w:style>
   <w:style w:type="table" w:default="1" w:styleId="TableNormal">

</xml_diff>

<commit_message>
Add author information for Ashwini C in Survey-paper1.docx
</commit_message>
<xml_diff>
--- a/Documentation/Survey Paper/Survey-paper1.docx
+++ b/Documentation/Survey Paper/Survey-paper1.docx
@@ -177,6 +177,44 @@
         </w:rPr>
         <w:t>Sameena H S</w:t>
       </w:r>
+      <w:r>
+        <w:rPr>
+          <w:b/>
+          <w:bCs/>
+          <w:sz w:val="24"/>
+          <w:szCs w:val="26"/>
+        </w:rPr>
+        <w:t>,</w:t>
+      </w:r>
+      <w:r>
+        <w:rPr>
+          <w:b/>
+          <w:bCs/>
+          <w:sz w:val="24"/>
+          <w:szCs w:val="26"/>
+          <w:vertAlign w:val="superscript"/>
+        </w:rPr>
+        <w:t xml:space="preserve"> </w:t>
+      </w:r>
+      <w:r>
+        <w:rPr>
+          <w:b/>
+          <w:bCs/>
+          <w:sz w:val="24"/>
+          <w:szCs w:val="26"/>
+          <w:vertAlign w:val="superscript"/>
+        </w:rPr>
+        <w:t>6</w:t>
+      </w:r>
+      <w:r>
+        <w:rPr>
+          <w:b/>
+          <w:bCs/>
+          <w:sz w:val="24"/>
+          <w:szCs w:val="26"/>
+        </w:rPr>
+        <w:t>Ashwini C</w:t>
+      </w:r>
     </w:p>
     <w:p>
       <w:pPr>
@@ -224,8 +262,9 @@
       <w:r>
         <w:rPr>
           <w:iCs/>
-        </w:rPr>
-        <w:t xml:space="preserve"> </w:t>
+          <w:vertAlign w:val="superscript"/>
+        </w:rPr>
+        <w:t>,6</w:t>
       </w:r>
       <w:r>
         <w:rPr>
@@ -277,72 +316,77 @@
           <w:iCs/>
           <w:lang w:val="en-IN"/>
         </w:rPr>
-        <w:t>¹revanthkumarts123@gmail.com, ²</w:t>
-      </w:r>
-      <w:proofErr w:type="gramStart"/>
+        <w:t>¹revanthkumarts123@gmail.com, ²sankethcoding@gmail.com,</w:t>
+      </w:r>
+      <w:r>
+        <w:rPr>
+          <w:iCs/>
+        </w:rPr>
+        <w:t>³</w:t>
+      </w:r>
       <w:r>
         <w:rPr>
           <w:iCs/>
           <w:lang w:val="en-IN"/>
         </w:rPr>
-        <w:t>sankethcoding@gmail.com,</w:t>
+        <w:t>shakthivelk1124@gmail.com,</w:t>
+      </w:r>
+      <w:r>
+        <w:t xml:space="preserve"> </w:t>
       </w:r>
       <w:r>
         <w:rPr>
           <w:iCs/>
         </w:rPr>
-        <w:t>³</w:t>
-      </w:r>
-      <w:proofErr w:type="gramEnd"/>
+        <w:t>⁴</w:t>
+      </w:r>
+      <w:r>
+        <w:t xml:space="preserve"> </w:t>
+      </w:r>
       <w:r>
         <w:rPr>
           <w:iCs/>
-          <w:lang w:val="en-IN"/>
-        </w:rPr>
-        <w:t>shakthivelk1124@gmail.com,</w:t>
-      </w:r>
-      <w:r>
+        </w:rPr>
+        <w:t>palanivignesh31@gmail.com</w:t>
+      </w:r>
+      <w:r>
+        <w:rPr>
+          <w:iCs/>
+        </w:rPr>
+        <w:t>,</w:t>
+      </w:r>
+      <w:r>
+        <w:t xml:space="preserve"> ⁵</w:t>
+      </w:r>
+      <w:r>
+        <w:rPr>
+          <w:iCs/>
+        </w:rPr>
+        <w:t>sameena.hs@gat.ac.in</w:t>
+      </w:r>
+      <w:r>
+        <w:rPr>
+          <w:iCs/>
+        </w:rPr>
+        <w:t>,</w:t>
+      </w:r>
+      <w:r>
+        <w:rPr>
+          <w:iCs/>
+        </w:rPr>
         <w:t xml:space="preserve"> </w:t>
       </w:r>
       <w:r>
         <w:rPr>
+          <w:vertAlign w:val="superscript"/>
+        </w:rPr>
+        <w:t>6</w:t>
+      </w:r>
+      <w:r>
+        <w:rPr>
           <w:iCs/>
         </w:rPr>
-        <w:t>⁴</w:t>
-      </w:r>
-      <w:r>
-        <w:t xml:space="preserve"> </w:t>
-      </w:r>
-      <w:r>
-        <w:rPr>
-          <w:iCs/>
-        </w:rPr>
-        <w:t>palanivignesh31@gmail.com</w:t>
-      </w:r>
-      <w:r>
-        <w:rPr>
-          <w:iCs/>
-        </w:rPr>
-        <w:t>,</w:t>
-      </w:r>
-      <w:r>
-        <w:t xml:space="preserve"> </w:t>
-      </w:r>
-      <w:r>
-        <w:t>⁵</w:t>
-      </w:r>
-      <w:r>
-        <w:rPr>
-          <w:iCs/>
-        </w:rPr>
-        <w:t>sameena.hs@gat.ac.in</w:t>
-      </w:r>
-      <w:r>
-        <w:rPr>
-          <w:iCs/>
-          <w:lang w:val="en-IN"/>
-        </w:rPr>
-        <w:t xml:space="preserve"> </w:t>
+        <w:t>cashwini@gat.ac.in</w:t>
       </w:r>
     </w:p>
     <w:p>
@@ -419,15 +463,7 @@
         <w:t xml:space="preserve"> </w:t>
       </w:r>
       <w:r>
-        <w:t xml:space="preserve">DevOps fixed one problem. Development and operations had always worked in separate lanes, and that separation slowed everything down. Bringing them together shortened release cycles considerably. Security never got the same treatment. It stayed at the back — handled close to the deadline, after the decisions that actually determined the shape of the product had long been </w:t>
-      </w:r>
-      <w:proofErr w:type="spellStart"/>
-      <w:r>
-        <w:t>finalised</w:t>
-      </w:r>
-      <w:proofErr w:type="spellEnd"/>
-      <w:r>
-        <w:t>. That worked, after a fashion, when releases were infrequent. It stopped working when applications became permanent internet targets and a single breach carried real consequences</w:t>
+        <w:t>DevOps fixed one problem. Development and operations had always worked in separate lanes, and that separation slowed everything down. Bringing them together shortened release cycles considerably. Security never got the same treatment. It stayed at the back — handled close to the deadline, after the decisions that actually determined the shape of the product had long been finalised. That worked, after a fashion, when releases were infrequent. It stopped working when applications became permanent internet targets and a single breach carried real consequences</w:t>
       </w:r>
       <w:r>
         <w:t>.</w:t>
@@ -437,13 +473,8 @@
       <w:pPr>
         <w:pStyle w:val="Abstract"/>
       </w:pPr>
-      <w:proofErr w:type="spellStart"/>
-      <w:r>
-        <w:t>DevSecOps</w:t>
-      </w:r>
-      <w:proofErr w:type="spellEnd"/>
-      <w:r>
-        <w:t xml:space="preserve"> came from that pressure. Its core position is blunt: by the time code is deployed, security feedback cannot change it</w:t>
+      <w:r>
+        <w:t>DevSecOps came from that pressure. Its core position is blunt: by the time code is deployed, security feedback cannot change it</w:t>
       </w:r>
       <w:r>
         <w:t>.</w:t>
@@ -476,13 +507,8 @@
       <w:r>
         <w:t xml:space="preserve"> </w:t>
       </w:r>
-      <w:proofErr w:type="spellStart"/>
-      <w:r>
-        <w:t>Trivy</w:t>
-      </w:r>
-      <w:proofErr w:type="spellEnd"/>
-      <w:r>
-        <w:t xml:space="preserve"> inspects container images. Docker and Kubernetes handle deployment, while Prometheus and Grafana keep runtime behavior visible throughout</w:t>
+      <w:r>
+        <w:t>Trivy inspects container images. Docker and Kubernetes handle deployment, while Prometheus and Grafana keep runtime behavior visible throughout</w:t>
       </w:r>
       <w:r>
         <w:rPr>
@@ -520,21 +546,12 @@
         </w:rPr>
         <w:t xml:space="preserve">— </w:t>
       </w:r>
-      <w:proofErr w:type="spellStart"/>
       <w:r>
         <w:rPr>
           <w:rFonts w:eastAsia="Times New Roman"/>
           <w:lang w:eastAsia="en-IN"/>
         </w:rPr>
-        <w:t>DevSecOps</w:t>
-      </w:r>
-      <w:proofErr w:type="spellEnd"/>
-      <w:r>
-        <w:rPr>
-          <w:rFonts w:eastAsia="Times New Roman"/>
-          <w:lang w:eastAsia="en-IN"/>
-        </w:rPr>
-        <w:t>, CI/CD pipeline security, vulnerability scanning, container security, automated security testing, runtime monitoring</w:t>
+        <w:t>DevSecOps, CI/CD pipeline security, vulnerability scanning, container security, automated security testing, runtime monitoring</w:t>
       </w:r>
       <w:r>
         <w:rPr>
@@ -649,68 +666,32 @@
         <w:rPr>
           <w:lang w:val="en-US"/>
         </w:rPr>
-        <w:t xml:space="preserve">Before </w:t>
-      </w:r>
-      <w:proofErr w:type="spellStart"/>
+        <w:t>Before DevSecOps existed, the security tests were being performed during the last stages of software development just before it was being released. This was a bad way of working; however it was acceptable at the time because there were only a handful of new releases a couple of times per month. However, as the rate of releases into production was being pushed to one or several times per day, or per hour, it was no longer acceptable to be performed tests between the new releases and the new release. This generated serious problems; if a bug is discovered weeks after the development has been undertaken then it can be very complex to find a suitable fix, and also the fix could also have consequences to both business and technical decisions that would have been made at the beginning of the development. DevSecOps was born because software developers and IT professional were facing many of these problems; its basic underlying rule is that there cannot be security added to something that did not had it from the very first day</w:t>
+      </w:r>
       <w:r>
         <w:rPr>
           <w:lang w:val="en-US"/>
         </w:rPr>
-        <w:t>DevSecOps</w:t>
-      </w:r>
-      <w:proofErr w:type="spellEnd"/>
+        <w:t>.</w:t>
+      </w:r>
+    </w:p>
+    <w:p>
+      <w:pPr>
+        <w:pStyle w:val="BodyText"/>
+        <w:rPr>
+          <w:lang w:val="en-IN"/>
+        </w:rPr>
+      </w:pPr>
       <w:r>
         <w:rPr>
           <w:lang w:val="en-US"/>
         </w:rPr>
-        <w:t xml:space="preserve"> existed, the security tests were being performed during the last stages of software development just before it was being released. This was a bad way of working; </w:t>
-      </w:r>
-      <w:proofErr w:type="gramStart"/>
+        <w:t>For many companies, the challenge was not about convincing them to use a security solution, but to integrate a security solution into their already live production systems. Implementing a change to a live production system will always be risky and most engineering teams were already over-burdened and couldn't justify spending extra time finding a security solution. It was a problem with tooling as well; the point of a scanner is to provide a list of vulnerabilities, but a scanner can easily be misunderstood, or simply overlooked if the person viewing it doesn't truly understand what the results mean</w:t>
+      </w:r>
       <w:r>
         <w:rPr>
           <w:lang w:val="en-US"/>
         </w:rPr>
-        <w:t>however</w:t>
-      </w:r>
-      <w:proofErr w:type="gramEnd"/>
-      <w:r>
-        <w:rPr>
-          <w:lang w:val="en-US"/>
-        </w:rPr>
-        <w:t xml:space="preserve"> it was acceptable at the time because there were only a handful of new releases a couple of times per month. However, as the rate of releases into production was being pushed to one or several times per day, or per hour, it was no longer acceptable to be performed tests between the new releases and the new release. This generated serious problems; if a bug is discovered weeks after the development has been undertaken then it can be very complex to find a suitable fix, and also the fix could also have consequences to both business and technical decisions that would have been made at the beginning of the development. </w:t>
-      </w:r>
-      <w:proofErr w:type="spellStart"/>
-      <w:r>
-        <w:rPr>
-          <w:lang w:val="en-US"/>
-        </w:rPr>
-        <w:t>DevSecOps</w:t>
-      </w:r>
-      <w:proofErr w:type="spellEnd"/>
-      <w:r>
-        <w:rPr>
-          <w:lang w:val="en-US"/>
-        </w:rPr>
-        <w:t xml:space="preserve"> was born because software developers and IT professional were facing many of these problems; its basic underlying rule is that there cannot be security added to something that did not </w:t>
-      </w:r>
-      <w:proofErr w:type="gramStart"/>
-      <w:r>
-        <w:rPr>
-          <w:lang w:val="en-US"/>
-        </w:rPr>
-        <w:t>had</w:t>
-      </w:r>
-      <w:proofErr w:type="gramEnd"/>
-      <w:r>
-        <w:rPr>
-          <w:lang w:val="en-US"/>
-        </w:rPr>
-        <w:t xml:space="preserve"> it from the very first day</w:t>
-      </w:r>
-      <w:r>
-        <w:rPr>
-          <w:lang w:val="en-US"/>
-        </w:rPr>
         <w:t>.</w:t>
       </w:r>
     </w:p>
@@ -723,81 +704,33 @@
       </w:pPr>
       <w:r>
         <w:rPr>
-          <w:lang w:val="en-US"/>
-        </w:rPr>
-        <w:t>For many companies, the challenge was not about convincing them to use a security solution, but to integrate a security solution into their already live production systems. Implementing a change to a live production system will always be risky and most engineering teams were already over-burdened and couldn't justify spending extra time finding a security solution. It was a problem with tooling as well; the point of a scanner is to provide a list of vulnerabilities, but a scanner can easily be misunderstood, or simply overlooked if the person viewing it doesn't truly understand what the results mean</w:t>
-      </w:r>
-      <w:r>
-        <w:rPr>
-          <w:lang w:val="en-US"/>
+          <w:lang w:val="en-IN"/>
+        </w:rPr>
+        <w:t>Fig</w:t>
+      </w:r>
+      <w:r>
+        <w:rPr>
+          <w:lang w:val="en-IN"/>
         </w:rPr>
         <w:t>.</w:t>
       </w:r>
-    </w:p>
-    <w:p>
-      <w:pPr>
-        <w:pStyle w:val="BodyText"/>
+      <w:r>
         <w:rPr>
           <w:lang w:val="en-IN"/>
         </w:rPr>
-      </w:pPr>
+        <w:t xml:space="preserve"> 1 illustrates the relationship between the three key components of DevSecOps. The development component entails code creation, system integration, and release management. On the other hand, operations involve the technical component of the system and ensure its availability, reliability, and scalability. Lastly, security encompasses scanning, identification, and controls. As illustrated by the figure </w:t>
+      </w:r>
       <w:r>
         <w:rPr>
           <w:lang w:val="en-IN"/>
         </w:rPr>
-        <w:t>Fig</w:t>
+        <w:t>below</w:t>
       </w:r>
       <w:r>
         <w:rPr>
           <w:lang w:val="en-IN"/>
         </w:rPr>
-        <w:t>.</w:t>
-      </w:r>
-      <w:r>
-        <w:rPr>
-          <w:lang w:val="en-IN"/>
-        </w:rPr>
-        <w:t xml:space="preserve"> 1 illustrates the relationship between the three key components of </w:t>
-      </w:r>
-      <w:proofErr w:type="spellStart"/>
-      <w:r>
-        <w:rPr>
-          <w:lang w:val="en-IN"/>
-        </w:rPr>
-        <w:t>DevSecOps</w:t>
-      </w:r>
-      <w:proofErr w:type="spellEnd"/>
-      <w:r>
-        <w:rPr>
-          <w:lang w:val="en-IN"/>
-        </w:rPr>
-        <w:t xml:space="preserve">. The development component entails code creation, system integration, and release management. On the other hand, operations involve the technical component of the system and ensure its availability, reliability, and scalability. Lastly, security encompasses scanning, identification, and controls. As illustrated by the figure </w:t>
-      </w:r>
-      <w:r>
-        <w:rPr>
-          <w:lang w:val="en-IN"/>
-        </w:rPr>
-        <w:t>below</w:t>
-      </w:r>
-      <w:r>
-        <w:rPr>
-          <w:lang w:val="en-IN"/>
-        </w:rPr>
-        <w:t xml:space="preserve">, these three components are not sequential; rather, they are concurrent. Each component influences the other two. The concept here is that if one of these three components were separated from the rest, the whole concept of </w:t>
-      </w:r>
-      <w:proofErr w:type="spellStart"/>
-      <w:r>
-        <w:rPr>
-          <w:lang w:val="en-IN"/>
-        </w:rPr>
-        <w:t>DevSecOps</w:t>
-      </w:r>
-      <w:proofErr w:type="spellEnd"/>
-      <w:r>
-        <w:rPr>
-          <w:lang w:val="en-IN"/>
-        </w:rPr>
-        <w:t xml:space="preserve"> will crumble</w:t>
+        <w:t>, these three components are not sequential; rather, they are concurrent. Each component influences the other two. The concept here is that if one of these three components were separated from the rest, the whole concept of DevSecOps will crumble</w:t>
       </w:r>
       <w:r>
         <w:rPr>
@@ -879,18 +812,88 @@
           <w:szCs w:val="16"/>
           <w:lang w:val="en-US"/>
         </w:rPr>
-        <w:t xml:space="preserve">Fig. 1. </w:t>
-      </w:r>
-      <w:proofErr w:type="spellStart"/>
-      <w:r>
-        <w:rPr>
-          <w:sz w:val="16"/>
-          <w:szCs w:val="16"/>
+        <w:t>Fig. 1. DevSecOps</w:t>
+      </w:r>
+    </w:p>
+    <w:p>
+      <w:pPr>
+        <w:pStyle w:val="BodyText"/>
+        <w:rPr>
           <w:lang w:val="en-US"/>
         </w:rPr>
-        <w:t>DevSecOps</w:t>
-      </w:r>
-      <w:proofErr w:type="spellEnd"/>
+      </w:pPr>
+      <w:r>
+        <w:rPr>
+          <w:lang w:val="en-US"/>
+        </w:rPr>
+        <w:t xml:space="preserve">One of the main changes DevSecOps brings is automating security checks. Doing security reviews manually </w:t>
+      </w:r>
+      <w:r>
+        <w:rPr>
+          <w:lang w:val="en-US"/>
+        </w:rPr>
+        <w:t>performs poorly in situations where</w:t>
+      </w:r>
+      <w:r>
+        <w:rPr>
+          <w:lang w:val="en-US"/>
+        </w:rPr>
+        <w:t xml:space="preserve"> a team is releasing software frequently. It takes too long, and </w:t>
+      </w:r>
+      <w:r>
+        <w:rPr>
+          <w:lang w:val="en-US"/>
+        </w:rPr>
+        <w:t>outputs vary without clear reason</w:t>
+      </w:r>
+      <w:r>
+        <w:rPr>
+          <w:lang w:val="en-US"/>
+        </w:rPr>
+        <w:t xml:space="preserve"> from one review to the next. When checks are automated and built into the pipeline they run every time a build happens. They apply the same rules every time and the results come back quickly. If something is wrong the </w:t>
+      </w:r>
+      <w:r>
+        <w:rPr>
+          <w:lang w:val="en-US"/>
+        </w:rPr>
+        <w:t>whoever built that particular module</w:t>
+      </w:r>
+      <w:r>
+        <w:rPr>
+          <w:lang w:val="en-US"/>
+        </w:rPr>
+        <w:t xml:space="preserve"> </w:t>
+      </w:r>
+      <w:r>
+        <w:rPr>
+          <w:lang w:val="en-US"/>
+        </w:rPr>
+        <w:t xml:space="preserve">finds </w:t>
+      </w:r>
+      <w:r>
+        <w:rPr>
+          <w:lang w:val="en-US"/>
+        </w:rPr>
+        <w:t>at a point when context is still fresh</w:t>
+      </w:r>
+      <w:r>
+        <w:rPr>
+          <w:lang w:val="en-US"/>
+        </w:rPr>
+        <w:t xml:space="preserve"> </w:t>
+      </w:r>
+      <w:r>
+        <w:rPr>
+          <w:lang w:val="en-US"/>
+        </w:rPr>
+        <w:t>working on that part of the system, not days or weeks later</w:t>
+      </w:r>
+      <w:r>
+        <w:rPr>
+          <w:lang w:val="en-US"/>
+        </w:rPr>
+        <w:t>.</w:t>
+      </w:r>
     </w:p>
     <w:p>
       <w:pPr>
@@ -903,231 +906,81 @@
         <w:rPr>
           <w:lang w:val="en-US"/>
         </w:rPr>
-        <w:t xml:space="preserve">One of the main changes </w:t>
-      </w:r>
-      <w:proofErr w:type="spellStart"/>
+        <w:t xml:space="preserve">The framework put forward in this paper uses a set of tools that each handle a different part of the security work. SonarQube looks at the source code before anything is deployed. It checks for problems in how the code is written — things like patterns that are known to cause vulnerabilities or </w:t>
+      </w:r>
       <w:r>
         <w:rPr>
           <w:lang w:val="en-US"/>
         </w:rPr>
-        <w:t>DevSecOps</w:t>
-      </w:r>
-      <w:proofErr w:type="spellEnd"/>
+        <w:t>implementation that fails to satisfy</w:t>
+      </w:r>
       <w:r>
         <w:rPr>
           <w:lang w:val="en-US"/>
         </w:rPr>
-        <w:t xml:space="preserve"> brings is automating security checks. Doing security reviews manually </w:t>
+        <w:t xml:space="preserve"> </w:t>
       </w:r>
       <w:r>
         <w:rPr>
           <w:lang w:val="en-US"/>
         </w:rPr>
-        <w:t>performs poorly in situations where</w:t>
+        <w:t xml:space="preserve">quality standards. This </w:t>
       </w:r>
       <w:r>
         <w:rPr>
           <w:lang w:val="en-US"/>
         </w:rPr>
-        <w:t xml:space="preserve"> a team is releasing software frequently. It takes too long, and </w:t>
+        <w:t xml:space="preserve">occurs at an earlier stage of </w:t>
       </w:r>
       <w:r>
         <w:rPr>
           <w:lang w:val="en-US"/>
         </w:rPr>
-        <w:t>outputs vary without clear reason</w:t>
+        <w:t xml:space="preserve"> </w:t>
       </w:r>
       <w:r>
         <w:rPr>
           <w:lang w:val="en-US"/>
         </w:rPr>
-        <w:t xml:space="preserve"> from one review to the next. When checks are automated and built into the </w:t>
-      </w:r>
-      <w:proofErr w:type="gramStart"/>
-      <w:r>
+        <w:t>pipeline before the application is even running anywhere.</w:t>
+      </w:r>
+    </w:p>
+    <w:p>
+      <w:pPr>
+        <w:pStyle w:val="BodyText"/>
         <w:rPr>
           <w:lang w:val="en-US"/>
         </w:rPr>
-        <w:t>pipeline</w:t>
-      </w:r>
-      <w:proofErr w:type="gramEnd"/>
+      </w:pPr>
       <w:r>
         <w:rPr>
           <w:lang w:val="en-US"/>
         </w:rPr>
-        <w:t xml:space="preserve"> they run every time a build happens. They apply the same rules every time and the results come back quickly. If something is wrong the </w:t>
+        <w:t xml:space="preserve">Once the application is running, two other tools come into play. OWASP ZAP tests the application while it is live by sending requests to it and </w:t>
       </w:r>
       <w:r>
         <w:rPr>
           <w:lang w:val="en-US"/>
         </w:rPr>
-        <w:t>whoever built that particular module</w:t>
+        <w:t>reviewing</w:t>
       </w:r>
       <w:r>
         <w:rPr>
           <w:lang w:val="en-US"/>
         </w:rPr>
-        <w:t xml:space="preserve"> </w:t>
+        <w:t xml:space="preserve"> the responses. If something </w:t>
       </w:r>
       <w:r>
         <w:rPr>
           <w:lang w:val="en-US"/>
         </w:rPr>
-        <w:t xml:space="preserve">finds </w:t>
+        <w:t xml:space="preserve">concerning the manner in which </w:t>
       </w:r>
       <w:r>
         <w:rPr>
           <w:lang w:val="en-US"/>
         </w:rPr>
-        <w:t>at a point when context is still fresh</w:t>
-      </w:r>
-      <w:r>
-        <w:rPr>
-          <w:lang w:val="en-US"/>
-        </w:rPr>
-        <w:t xml:space="preserve"> </w:t>
-      </w:r>
-      <w:r>
-        <w:rPr>
-          <w:lang w:val="en-US"/>
-        </w:rPr>
-        <w:t>working on that part of the system, not days or weeks later</w:t>
-      </w:r>
-      <w:r>
-        <w:rPr>
-          <w:lang w:val="en-US"/>
-        </w:rPr>
-        <w:t>.</w:t>
-      </w:r>
-    </w:p>
-    <w:p>
-      <w:pPr>
-        <w:pStyle w:val="BodyText"/>
-        <w:rPr>
-          <w:lang w:val="en-US"/>
-        </w:rPr>
-      </w:pPr>
-      <w:r>
-        <w:rPr>
-          <w:lang w:val="en-US"/>
-        </w:rPr>
-        <w:t xml:space="preserve">The framework put forward in this paper uses a set of tools that each handle a different part of the security work. SonarQube looks at the source code before anything is deployed. It checks for problems in how the code is written — things like patterns that are known to cause vulnerabilities or </w:t>
-      </w:r>
-      <w:r>
-        <w:rPr>
-          <w:lang w:val="en-US"/>
-        </w:rPr>
-        <w:t>implementation that fails to satisfy</w:t>
-      </w:r>
-      <w:r>
-        <w:rPr>
-          <w:lang w:val="en-US"/>
-        </w:rPr>
-        <w:t xml:space="preserve"> </w:t>
-      </w:r>
-      <w:r>
-        <w:rPr>
-          <w:lang w:val="en-US"/>
-        </w:rPr>
-        <w:t xml:space="preserve">quality standards. This </w:t>
-      </w:r>
-      <w:r>
-        <w:rPr>
-          <w:lang w:val="en-US"/>
-        </w:rPr>
-        <w:t xml:space="preserve">occurs at an earlier stage </w:t>
-      </w:r>
-      <w:proofErr w:type="gramStart"/>
-      <w:r>
-        <w:rPr>
-          <w:lang w:val="en-US"/>
-        </w:rPr>
-        <w:t xml:space="preserve">of </w:t>
-      </w:r>
-      <w:r>
-        <w:rPr>
-          <w:lang w:val="en-US"/>
-        </w:rPr>
-        <w:t xml:space="preserve"> </w:t>
-      </w:r>
-      <w:r>
-        <w:rPr>
-          <w:lang w:val="en-US"/>
-        </w:rPr>
-        <w:t>pipeline</w:t>
-      </w:r>
-      <w:proofErr w:type="gramEnd"/>
-      <w:r>
-        <w:rPr>
-          <w:lang w:val="en-US"/>
-        </w:rPr>
-        <w:t xml:space="preserve"> before the application is even running anywhere.</w:t>
-      </w:r>
-    </w:p>
-    <w:p>
-      <w:pPr>
-        <w:pStyle w:val="BodyText"/>
-        <w:rPr>
-          <w:lang w:val="en-US"/>
-        </w:rPr>
-      </w:pPr>
-      <w:r>
-        <w:rPr>
-          <w:lang w:val="en-US"/>
-        </w:rPr>
-        <w:t xml:space="preserve">Once the application is running, two other tools come into play. OWASP ZAP tests the application while it is live by sending requests to it and </w:t>
-      </w:r>
-      <w:r>
-        <w:rPr>
-          <w:lang w:val="en-US"/>
-        </w:rPr>
-        <w:t>reviewing</w:t>
-      </w:r>
-      <w:r>
-        <w:rPr>
-          <w:lang w:val="en-US"/>
-        </w:rPr>
-        <w:t xml:space="preserve"> the responses. If something </w:t>
-      </w:r>
-      <w:r>
-        <w:rPr>
-          <w:lang w:val="en-US"/>
-        </w:rPr>
-        <w:t xml:space="preserve">concerning the manner in which </w:t>
-      </w:r>
-      <w:r>
-        <w:rPr>
-          <w:lang w:val="en-US"/>
-        </w:rPr>
-        <w:t xml:space="preserve">application responds suggests a vulnerability is present, OWASP ZAP picks that up. </w:t>
-      </w:r>
-      <w:proofErr w:type="spellStart"/>
-      <w:r>
-        <w:rPr>
-          <w:lang w:val="en-US"/>
-        </w:rPr>
-        <w:t>Trivy</w:t>
-      </w:r>
-      <w:proofErr w:type="spellEnd"/>
-      <w:r>
-        <w:rPr>
-          <w:lang w:val="en-US"/>
-        </w:rPr>
-        <w:t xml:space="preserve"> works differently — it looks at the container image and checks its components against a list of known vulnerabilities. These two tools cover different things. OWASP ZAP is focused on how the application behaves when it is running. </w:t>
-      </w:r>
-      <w:proofErr w:type="spellStart"/>
-      <w:r>
-        <w:rPr>
-          <w:lang w:val="en-US"/>
-        </w:rPr>
-        <w:t>Trivy</w:t>
-      </w:r>
-      <w:proofErr w:type="spellEnd"/>
-      <w:r>
-        <w:rPr>
-          <w:lang w:val="en-US"/>
-        </w:rPr>
-        <w:t xml:space="preserve"> is focused on what the container image contains. Using both means more is covered than either tool could manage on its own</w:t>
+        <w:t>application responds suggests a vulnerability is present, OWASP ZAP picks that up. Trivy works differently — it looks at the container image and checks its components against a list of known vulnerabilities. These two tools cover different things. OWASP ZAP is focused on how the application behaves when it is running. Trivy is focused on what the container image contains. Using both means more is covered than either tool could manage on its own</w:t>
       </w:r>
       <w:r>
         <w:rPr>
@@ -1204,35 +1057,7 @@
         <w:rPr>
           <w:rFonts w:eastAsia="Times New Roman"/>
         </w:rPr>
-        <w:t xml:space="preserve">One thing early </w:t>
-      </w:r>
-      <w:proofErr w:type="spellStart"/>
-      <w:r>
-        <w:rPr>
-          <w:rFonts w:eastAsia="Times New Roman"/>
-        </w:rPr>
-        <w:t>DevSecOps</w:t>
-      </w:r>
-      <w:proofErr w:type="spellEnd"/>
-      <w:r>
-        <w:rPr>
-          <w:rFonts w:eastAsia="Times New Roman"/>
-        </w:rPr>
-        <w:t xml:space="preserve"> research kept bringing up was that security was getting pushed to the side inside DevOps pipelines. It was not being ignored completely, but it was clearly not being treated as a priority either. Nikolov and Aleksieva-Petrova (2023) wanted to look at this more closely and chose Jenkins as their environment. They put </w:t>
-      </w:r>
-      <w:proofErr w:type="spellStart"/>
-      <w:r>
-        <w:rPr>
-          <w:rFonts w:eastAsia="Times New Roman"/>
-        </w:rPr>
-        <w:t>Snyk</w:t>
-      </w:r>
-      <w:proofErr w:type="spellEnd"/>
-      <w:r>
-        <w:rPr>
-          <w:rFonts w:eastAsia="Times New Roman"/>
-        </w:rPr>
-        <w:t xml:space="preserve"> and OWASP ZAP into the pipeline at various points. The idea was to check which stages were actually picking up security issues and which ones were missing them. Finding vulnerabilities before deployment was shown to be possible, which was a useful outcome. That said, container security was not part of what they looked at, and nothing was set up to monitor the system after it went live</w:t>
+        <w:t>One thing early DevSecOps research kept bringing up was that security was getting pushed to the side inside DevOps pipelines. It was not being ignored completely, but it was clearly not being treated as a priority either. Nikolov and Aleksieva-Petrova (2023) wanted to look at this more closely and chose Jenkins as their environment. They put Snyk and OWASP ZAP into the pipeline at various points. The idea was to check which stages were actually picking up security issues and which ones were missing them. Finding vulnerabilities before deployment was shown to be possible, which was a useful outcome. That said, container security was not part of what they looked at, and nothing was set up to monitor the system after it went live</w:t>
       </w:r>
       <w:r>
         <w:rPr>
@@ -1265,35 +1090,7 @@
         <w:rPr>
           <w:rFonts w:eastAsia="Times New Roman"/>
         </w:rPr>
-        <w:t xml:space="preserve">Marandi et al. (2023) took a different approach entirely. Rather than Jenkins they used GitHub Actions as the base for their pipeline. </w:t>
-      </w:r>
-      <w:proofErr w:type="spellStart"/>
-      <w:r>
-        <w:rPr>
-          <w:rFonts w:eastAsia="Times New Roman"/>
-        </w:rPr>
-        <w:t>Snyk</w:t>
-      </w:r>
-      <w:proofErr w:type="spellEnd"/>
-      <w:r>
-        <w:rPr>
-          <w:rFonts w:eastAsia="Times New Roman"/>
-        </w:rPr>
-        <w:t xml:space="preserve"> and </w:t>
-      </w:r>
-      <w:proofErr w:type="spellStart"/>
-      <w:r>
-        <w:rPr>
-          <w:rFonts w:eastAsia="Times New Roman"/>
-        </w:rPr>
-        <w:t>StackHawk</w:t>
-      </w:r>
-      <w:proofErr w:type="spellEnd"/>
-      <w:r>
-        <w:rPr>
-          <w:rFonts w:eastAsia="Times New Roman"/>
-        </w:rPr>
-        <w:t xml:space="preserve"> were the tools they worked with, and Docker was running alongside everything. They did not stop at just scanning either — dashboards were added and parts of the remediation process were automated, so when issues came up the team had less manual work to get through. Even with those additions though, scanning container images and watching the runtime environment were still not covered.</w:t>
+        <w:t>Marandi et al. (2023) took a different approach entirely. Rather than Jenkins they used GitHub Actions as the base for their pipeline. Snyk and StackHawk were the tools they worked with, and Docker was running alongside everything. They did not stop at just scanning either — dashboards were added and parts of the remediation process were automated, so when issues came up the team had less manual work to get through. Even with those additions though, scanning container images and watching the runtime environment were still not covered.</w:t>
       </w:r>
     </w:p>
     <w:p>
@@ -1314,35 +1111,7 @@
         <w:rPr>
           <w:rFonts w:eastAsia="Times New Roman"/>
         </w:rPr>
-        <w:t xml:space="preserve">Around this same period some researchers started looking beyond the technical side of things. </w:t>
-      </w:r>
-      <w:proofErr w:type="spellStart"/>
-      <w:r>
-        <w:rPr>
-          <w:rFonts w:eastAsia="Times New Roman"/>
-        </w:rPr>
-        <w:t>Nayanajith</w:t>
-      </w:r>
-      <w:proofErr w:type="spellEnd"/>
-      <w:r>
-        <w:rPr>
-          <w:rFonts w:eastAsia="Times New Roman"/>
-        </w:rPr>
-        <w:t xml:space="preserve"> and Wickramarachchi (2024) found that the biggest obstacles teams were hitting during </w:t>
-      </w:r>
-      <w:proofErr w:type="spellStart"/>
-      <w:r>
-        <w:rPr>
-          <w:rFonts w:eastAsia="Times New Roman"/>
-        </w:rPr>
-        <w:t>DevSecOps</w:t>
-      </w:r>
-      <w:proofErr w:type="spellEnd"/>
-      <w:r>
-        <w:rPr>
-          <w:rFonts w:eastAsia="Times New Roman"/>
-        </w:rPr>
-        <w:t xml:space="preserve"> adoption were not really about which tools to pick or how to configure them. Skill gaps were a common issue, and so was </w:t>
+        <w:t xml:space="preserve">Around this same period some researchers started looking beyond the technical side of things. Nayanajith and Wickramarachchi (2024) found that the biggest obstacles teams were hitting during DevSecOps adoption were not really about which tools to pick or how to configure them. Skill gaps were a common issue, and so was </w:t>
       </w:r>
       <w:r>
         <w:rPr>
@@ -1372,21 +1141,7 @@
         <w:rPr>
           <w:rFonts w:eastAsia="Times New Roman"/>
         </w:rPr>
-        <w:t xml:space="preserve">. On top of that, different groups within the same </w:t>
-      </w:r>
-      <w:proofErr w:type="spellStart"/>
-      <w:r>
-        <w:rPr>
-          <w:rFonts w:eastAsia="Times New Roman"/>
-        </w:rPr>
-        <w:t>organisation</w:t>
-      </w:r>
-      <w:proofErr w:type="spellEnd"/>
-      <w:r>
-        <w:rPr>
-          <w:rFonts w:eastAsia="Times New Roman"/>
-        </w:rPr>
-        <w:t xml:space="preserve"> were often not communicating well with each other. Fixing the technical setup was the easier part of the problem — shifting how people actually worked and collaborated on a daily basis was where things got genuinely difficult</w:t>
+        <w:t>. On top of that, different groups within the same organisation were often not communicating well with each other. Fixing the technical setup was the easier part of the problem — shifting how people actually worked and collaborated on a daily basis was where things got genuinely difficult</w:t>
       </w:r>
       <w:r>
         <w:rPr>
@@ -1572,21 +1327,7 @@
         <w:rPr>
           <w:rFonts w:eastAsia="Times New Roman"/>
         </w:rPr>
-        <w:t xml:space="preserve">noted that </w:t>
-      </w:r>
-      <w:proofErr w:type="spellStart"/>
-      <w:r>
-        <w:rPr>
-          <w:rFonts w:eastAsia="Times New Roman"/>
-        </w:rPr>
-        <w:t>Trivy</w:t>
-      </w:r>
-      <w:proofErr w:type="spellEnd"/>
-      <w:r>
-        <w:rPr>
-          <w:rFonts w:eastAsia="Times New Roman"/>
-        </w:rPr>
-        <w:t xml:space="preserve"> </w:t>
+        <w:t xml:space="preserve">noted that Trivy </w:t>
       </w:r>
       <w:r>
         <w:rPr>
@@ -1619,34 +1360,13 @@
         <w:rPr>
           <w:rFonts w:eastAsia="Times New Roman"/>
         </w:rPr>
-        <w:t xml:space="preserve">In </w:t>
-      </w:r>
-      <w:proofErr w:type="spellStart"/>
-      <w:r>
-        <w:rPr>
-          <w:rFonts w:eastAsia="Times New Roman"/>
-        </w:rPr>
-        <w:t>DevSecOps</w:t>
-      </w:r>
-      <w:proofErr w:type="spellEnd"/>
-      <w:r>
-        <w:rPr>
-          <w:rFonts w:eastAsia="Times New Roman"/>
-        </w:rPr>
-        <w:t xml:space="preserve">, some studies follow the CAMS model. </w:t>
-      </w:r>
-      <w:r>
-        <w:rPr>
-          <w:rFonts w:eastAsia="Times New Roman"/>
-        </w:rPr>
-        <w:t xml:space="preserve">This mainly includes culture, automation, measurement and </w:t>
-      </w:r>
-      <w:proofErr w:type="gramStart"/>
-      <w:r>
-        <w:rPr>
-          <w:rFonts w:eastAsia="Times New Roman"/>
-        </w:rPr>
-        <w:t>sharing.</w:t>
+        <w:t xml:space="preserve">In DevSecOps, some studies follow the CAMS model. </w:t>
+      </w:r>
+      <w:r>
+        <w:rPr>
+          <w:rFonts w:eastAsia="Times New Roman"/>
+        </w:rPr>
+        <w:t>This mainly includes culture, automation, measurement and sharing.</w:t>
       </w:r>
       <w:r>
         <w:rPr>
@@ -1654,7 +1374,6 @@
         </w:rPr>
         <w:t>.</w:t>
       </w:r>
-      <w:proofErr w:type="gramEnd"/>
       <w:r>
         <w:rPr>
           <w:rFonts w:eastAsia="Times New Roman"/>
@@ -1671,21 +1390,7 @@
         <w:rPr>
           <w:rFonts w:eastAsia="Times New Roman"/>
         </w:rPr>
-        <w:t xml:space="preserve"> when applying </w:t>
-      </w:r>
-      <w:proofErr w:type="spellStart"/>
-      <w:r>
-        <w:rPr>
-          <w:rFonts w:eastAsia="Times New Roman"/>
-        </w:rPr>
-        <w:t>DevSecOps</w:t>
-      </w:r>
-      <w:proofErr w:type="spellEnd"/>
-      <w:r>
-        <w:rPr>
-          <w:rFonts w:eastAsia="Times New Roman"/>
-        </w:rPr>
-        <w:t xml:space="preserve"> in real situations </w:t>
+        <w:t xml:space="preserve"> when applying DevSecOps in real situations </w:t>
       </w:r>
       <w:r>
         <w:rPr>
@@ -1703,21 +1408,7 @@
         <w:rPr>
           <w:rFonts w:eastAsia="Times New Roman"/>
         </w:rPr>
-        <w:t xml:space="preserve">use </w:t>
-      </w:r>
-      <w:proofErr w:type="spellStart"/>
-      <w:r>
-        <w:rPr>
-          <w:rFonts w:eastAsia="Times New Roman"/>
-        </w:rPr>
-        <w:t>DevSecOps</w:t>
-      </w:r>
-      <w:proofErr w:type="spellEnd"/>
-      <w:r>
-        <w:rPr>
-          <w:rFonts w:eastAsia="Times New Roman"/>
-        </w:rPr>
-        <w:t xml:space="preserve"> in</w:t>
+        <w:t>use DevSecOps in</w:t>
       </w:r>
       <w:r>
         <w:rPr>
@@ -1741,21 +1432,7 @@
         <w:rPr>
           <w:rFonts w:eastAsia="Times New Roman"/>
         </w:rPr>
-        <w:t xml:space="preserve">applying </w:t>
-      </w:r>
-      <w:proofErr w:type="spellStart"/>
-      <w:r>
-        <w:rPr>
-          <w:rFonts w:eastAsia="Times New Roman"/>
-        </w:rPr>
-        <w:t>DevSecOps</w:t>
-      </w:r>
-      <w:proofErr w:type="spellEnd"/>
-      <w:r>
-        <w:rPr>
-          <w:rFonts w:eastAsia="Times New Roman"/>
-        </w:rPr>
-        <w:t xml:space="preserve"> in real environments. It </w:t>
+        <w:t xml:space="preserve">applying DevSecOps in real environments. It </w:t>
       </w:r>
       <w:r>
         <w:rPr>
@@ -1767,14 +1444,7 @@
         <w:rPr>
           <w:rFonts w:eastAsia="Times New Roman"/>
         </w:rPr>
-        <w:t xml:space="preserve">an effect </w:t>
-      </w:r>
-      <w:proofErr w:type="gramStart"/>
-      <w:r>
-        <w:rPr>
-          <w:rFonts w:eastAsia="Times New Roman"/>
-        </w:rPr>
-        <w:t>on</w:t>
+        <w:t>an effect on</w:t>
       </w:r>
       <w:r>
         <w:rPr>
@@ -1786,34 +1456,13 @@
         <w:rPr>
           <w:rFonts w:eastAsia="Times New Roman"/>
         </w:rPr>
-        <w:t xml:space="preserve"> a</w:t>
-      </w:r>
-      <w:proofErr w:type="gramEnd"/>
-      <w:r>
-        <w:rPr>
-          <w:rFonts w:eastAsia="Times New Roman"/>
-        </w:rPr>
-        <w:t xml:space="preserve"> strong effect on</w:t>
-      </w:r>
-      <w:r>
-        <w:rPr>
-          <w:rFonts w:eastAsia="Times New Roman"/>
-        </w:rPr>
-        <w:t xml:space="preserve"> successfully applying </w:t>
-      </w:r>
-      <w:proofErr w:type="spellStart"/>
-      <w:r>
-        <w:rPr>
-          <w:rFonts w:eastAsia="Times New Roman"/>
-        </w:rPr>
-        <w:t>DevSecOps</w:t>
-      </w:r>
-      <w:proofErr w:type="spellEnd"/>
-      <w:r>
-        <w:rPr>
-          <w:rFonts w:eastAsia="Times New Roman"/>
-        </w:rPr>
-        <w:t xml:space="preserve"> in real environments.</w:t>
+        <w:t xml:space="preserve"> a strong effect on</w:t>
+      </w:r>
+      <w:r>
+        <w:rPr>
+          <w:rFonts w:eastAsia="Times New Roman"/>
+        </w:rPr>
+        <w:t xml:space="preserve"> successfully applying DevSecOps in real environments.</w:t>
       </w:r>
     </w:p>
     <w:p>
@@ -1891,21 +1540,7 @@
         <w:rPr>
           <w:rFonts w:eastAsia="Times New Roman"/>
         </w:rPr>
-        <w:t xml:space="preserve">From these studies, it is observed that </w:t>
-      </w:r>
-      <w:proofErr w:type="spellStart"/>
-      <w:r>
-        <w:rPr>
-          <w:rFonts w:eastAsia="Times New Roman"/>
-        </w:rPr>
-        <w:t>DevSecOps</w:t>
-      </w:r>
-      <w:proofErr w:type="spellEnd"/>
-      <w:r>
-        <w:rPr>
-          <w:rFonts w:eastAsia="Times New Roman"/>
-        </w:rPr>
-        <w:t xml:space="preserve"> is improving, but some gaps still remain. From these studies, it appears that many works focus only on specific parts such as scanning or monitoring, but do not cover the complete pipeline.</w:t>
+        <w:t>From these studies, it is observed that DevSecOps is improving, but some gaps still remain. From these studies, it appears that many works focus only on specific parts such as scanning or monitoring, but do not cover the complete pipeline.</w:t>
       </w:r>
     </w:p>
     <w:p>
@@ -1927,21 +1562,7 @@
         <w:rPr>
           <w:rFonts w:eastAsia="Times New Roman"/>
         </w:rPr>
-        <w:t xml:space="preserve">Looking across these studies, a pattern becomes clear — most of them tackle one or two pieces of the pipeline rather than treating it as a whole. This work takes a different angle by connecting those pieces into something more complete. Static testing, dynamic testing, container scanning through </w:t>
-      </w:r>
-      <w:proofErr w:type="spellStart"/>
-      <w:r>
-        <w:rPr>
-          <w:rFonts w:eastAsia="Times New Roman"/>
-        </w:rPr>
-        <w:t>Trivy</w:t>
-      </w:r>
-      <w:proofErr w:type="spellEnd"/>
-      <w:r>
-        <w:rPr>
-          <w:rFonts w:eastAsia="Times New Roman"/>
-        </w:rPr>
-        <w:t>, and continuous monitoring via Prometheus and Grafana are all brought into a single pipeline rather than handled separately</w:t>
+        <w:t>Looking across these studies, a pattern becomes clear — most of them tackle one or two pieces of the pipeline rather than treating it as a whole. This work takes a different angle by connecting those pieces into something more complete. Static testing, dynamic testing, container scanning through Trivy, and continuous monitoring via Prometheus and Grafana are all brought into a single pipeline rather than handled separately</w:t>
       </w:r>
       <w:r>
         <w:rPr>
@@ -2037,21 +1658,7 @@
         <w:rPr>
           <w:rFonts w:eastAsia="Times New Roman"/>
         </w:rPr>
-        <w:t xml:space="preserve">, organizations face problems when trying to use </w:t>
-      </w:r>
-      <w:proofErr w:type="spellStart"/>
-      <w:r>
-        <w:rPr>
-          <w:rFonts w:eastAsia="Times New Roman"/>
-        </w:rPr>
-        <w:t>DevSecOps</w:t>
-      </w:r>
-      <w:proofErr w:type="spellEnd"/>
-      <w:r>
-        <w:rPr>
-          <w:rFonts w:eastAsia="Times New Roman"/>
-        </w:rPr>
-        <w:t xml:space="preserve"> in actual projects.</w:t>
+        <w:t>, organizations face problems when trying to use DevSecOps in actual projects.</w:t>
       </w:r>
       <w:r>
         <w:rPr>
@@ -2137,27 +1744,13 @@
         <w:rPr>
           <w:rFonts w:eastAsia="Times New Roman"/>
         </w:rPr>
-        <w:t xml:space="preserve">In our work, we tried to avoid these problems by adding security checks directly into the pipeline </w:t>
-      </w:r>
-      <w:proofErr w:type="gramStart"/>
-      <w:r>
-        <w:rPr>
-          <w:rFonts w:eastAsia="Times New Roman"/>
-        </w:rPr>
-        <w:t xml:space="preserve">so </w:t>
-      </w:r>
-      <w:r>
-        <w:rPr>
-          <w:rFonts w:eastAsia="Times New Roman"/>
-        </w:rPr>
-        <w:t xml:space="preserve"> they</w:t>
-      </w:r>
-      <w:proofErr w:type="gramEnd"/>
-      <w:r>
-        <w:rPr>
-          <w:rFonts w:eastAsia="Times New Roman"/>
-        </w:rPr>
-        <w:t xml:space="preserve"> run together with</w:t>
+        <w:t xml:space="preserve">In our work, we tried to avoid these problems by adding security checks directly into the pipeline so </w:t>
+      </w:r>
+      <w:r>
+        <w:rPr>
+          <w:rFonts w:eastAsia="Times New Roman"/>
+        </w:rPr>
+        <w:t xml:space="preserve"> they run together with</w:t>
       </w:r>
       <w:r>
         <w:rPr>
@@ -2213,14 +1806,7 @@
         <w:rPr>
           <w:rFonts w:eastAsia="Times New Roman"/>
         </w:rPr>
-        <w:t xml:space="preserve">is observable </w:t>
-      </w:r>
-      <w:proofErr w:type="gramStart"/>
-      <w:r>
-        <w:rPr>
-          <w:rFonts w:eastAsia="Times New Roman"/>
-        </w:rPr>
-        <w:t xml:space="preserve">in </w:t>
+        <w:t xml:space="preserve">is observable in </w:t>
       </w:r>
       <w:r>
         <w:rPr>
@@ -2232,14 +1818,7 @@
         <w:rPr>
           <w:rFonts w:eastAsia="Times New Roman"/>
         </w:rPr>
-        <w:t>early</w:t>
-      </w:r>
-      <w:proofErr w:type="gramEnd"/>
-      <w:r>
-        <w:rPr>
-          <w:rFonts w:eastAsia="Times New Roman"/>
-        </w:rPr>
-        <w:t>.</w:t>
+        <w:t>early.</w:t>
       </w:r>
     </w:p>
     <w:p>
@@ -2608,21 +2187,7 @@
         <w:rPr>
           <w:rFonts w:eastAsia="Times New Roman"/>
         </w:rPr>
-        <w:t xml:space="preserve">Using this approach, the system becomes more secure and simpler to manage. Issues can be noticed earlier, and </w:t>
-      </w:r>
-      <w:proofErr w:type="gramStart"/>
-      <w:r>
-        <w:rPr>
-          <w:rFonts w:eastAsia="Times New Roman"/>
-        </w:rPr>
-        <w:t>overall</w:t>
-      </w:r>
-      <w:proofErr w:type="gramEnd"/>
-      <w:r>
-        <w:rPr>
-          <w:rFonts w:eastAsia="Times New Roman"/>
-        </w:rPr>
-        <w:t xml:space="preserve"> the process becomes easier to deal with.</w:t>
+        <w:t>Using this approach, the system becomes more secure and simpler to manage. Issues can be noticed earlier, and overall the process becomes easier to deal with.</w:t>
       </w:r>
     </w:p>
     <w:p>
@@ -4523,13 +4088,8 @@
       <w:r>
         <w:t xml:space="preserve">portion of the broader </w:t>
       </w:r>
-      <w:proofErr w:type="spellStart"/>
-      <w:r>
-        <w:t>DevSecOps</w:t>
-      </w:r>
-      <w:proofErr w:type="spellEnd"/>
-      <w:r>
-        <w:t xml:space="preserve"> pipeline individually, starting from the point where code first enters the system and following it all the way into production. The pipeline ran without interruption across all these stages, which itself confirmed that the integration held together under real conditions</w:t>
+      <w:r>
+        <w:t>DevSecOps pipeline individually, starting from the point where code first enters the system and following it all the way into production. The pipeline ran without interruption across all these stages, which itself confirmed that the integration held together under real conditions</w:t>
       </w:r>
       <w:r>
         <w:rPr>
@@ -4558,17 +4118,7 @@
         <w:t xml:space="preserve"> </w:t>
       </w:r>
       <w:r>
-        <w:t xml:space="preserve">traveled further down the line got caught early, leaving fewer things to deal with in later </w:t>
-      </w:r>
-      <w:proofErr w:type="spellStart"/>
-      <w:proofErr w:type="gramStart"/>
-      <w:r>
-        <w:t>stages.Container</w:t>
-      </w:r>
-      <w:proofErr w:type="spellEnd"/>
-      <w:proofErr w:type="gramEnd"/>
-      <w:r>
-        <w:t xml:space="preserve"> images got scanned before anything was allowed to proceed, so whatever reached the deployment stage had already been checked and cleared — reducing the chances of something problematic slipping through that layer</w:t>
+        <w:t>traveled further down the line got caught early, leaving fewer things to deal with in later stages.Container images got scanned before anything was allowed to proceed, so whatever reached the deployment stage had already been checked and cleared — reducing the chances of something problematic slipping through that layer</w:t>
       </w:r>
       <w:r>
         <w:t>.</w:t>
@@ -7556,6 +7106,7 @@
   <w:style w:type="character" w:default="1" w:styleId="DefaultParagraphFont">
     <w:name w:val="Default Paragraph Font"/>
     <w:uiPriority w:val="1"/>
+    <w:semiHidden/>
     <w:unhideWhenUsed/>
   </w:style>
   <w:style w:type="table" w:default="1" w:styleId="TableNormal">

</xml_diff>